<commit_message>
Rebuild thesis DOCX: correct IEEE two-col layout, real PDF figures embedded
</commit_message>
<xml_diff>
--- a/AN_EFFECTIVE_METHOD_DEPRESSION_Murad_Hossain.docx
+++ b/AN_EFFECTIVE_METHOD_DEPRESSION_Murad_Hossain.docx
@@ -4,23 +4,7 @@
   <w:body>
     <w:p>
       <w:pPr>
-        <w:spacing w:before="0" w:after="80"/>
-        <w:jc w:val="center"/>
-      </w:pPr>
-      <w:r>
-        <w:rPr>
-          <w:rFonts w:ascii="Times New Roman" w:hAnsi="Times New Roman"/>
-          <w:b w:val="0"/>
-          <w:i/>
-          <w:sz w:val="18"/>
-          <w:u w:val="none"/>
-        </w:rPr>
-        <w:t>MSc Thesis — Department of Computer Science &amp; Engineering</w:t>
-      </w:r>
-    </w:p>
-    <w:p>
-      <w:pPr>
-        <w:spacing w:before="80" w:after="120"/>
+        <w:spacing w:before="0" w:after="120"/>
         <w:jc w:val="center"/>
       </w:pPr>
       <w:r>
@@ -29,7 +13,6 @@
           <w:b/>
           <w:i w:val="0"/>
           <w:sz w:val="28"/>
-          <w:u w:val="none"/>
         </w:rPr>
         <w:t>AN EFFECTIVE METHOD BASED ON HUMAN DAILY ACTIVITIES</w:t>
         <w:br/>
@@ -47,7 +30,6 @@
           <w:b/>
           <w:i w:val="0"/>
           <w:sz w:val="20"/>
-          <w:u w:val="none"/>
         </w:rPr>
         <w:t>Md. Murad Hossain</w:t>
       </w:r>
@@ -57,7 +39,6 @@
           <w:b w:val="0"/>
           <w:i w:val="0"/>
           <w:sz w:val="20"/>
-          <w:u w:val="none"/>
         </w:rPr>
         <w:t xml:space="preserve">,  </w:t>
       </w:r>
@@ -67,7 +48,6 @@
           <w:b/>
           <w:i w:val="0"/>
           <w:sz w:val="20"/>
-          <w:u w:val="none"/>
         </w:rPr>
         <w:t>Dr. Mrinal Kanti Baowaly</w:t>
       </w:r>
@@ -83,19 +63,18 @@
           <w:b w:val="0"/>
           <w:i/>
           <w:sz w:val="18"/>
-          <w:u w:val="none"/>
         </w:rPr>
         <w:t>Department of Computer Science &amp; Engineering</w:t>
         <w:br/>
         <w:t>Gopalganj Science and Technology University, Gopalganj, Bangladesh</w:t>
         <w:br/>
-        <w:t>Email: muradmd312@gmail.com, mkbaowaly@gmail.com</w:t>
+        <w:t>Email: muradmd312@gmail.com,  mkbaowaly@gmail.com</w:t>
       </w:r>
     </w:p>
     <w:p>
       <w:pPr>
         <w:spacing w:before="80" w:after="80"/>
-        <w:jc w:val="left"/>
+        <w:jc w:val="both"/>
         <w:pBdr>
           <w:bottom w:val="single" w:sz="6" w:space="1" w:color="000000"/>
         </w:pBdr>
@@ -103,8 +82,19 @@
     </w:p>
     <w:p>
       <w:pPr>
-        <w:spacing w:before="120" w:after="40"/>
-        <w:jc w:val="left"/>
+        <w:spacing w:before="0" w:after="0" w:lineRule="exact" w:line="20"/>
+        <w:sectPr>
+          <w:type w:val="continuous"/>
+          <w:cols w:num="1"/>
+          <w:pgSz w:w="11906" w:h="16838"/>
+          <w:pgMar w:top="1134" w:right="1021" w:bottom="1134" w:left="1021" w:header="720" w:footer="720"/>
+        </w:sectPr>
+      </w:pPr>
+    </w:p>
+    <w:p>
+      <w:pPr>
+        <w:spacing w:before="120" w:after="80" w:lineRule="exact" w:line="240"/>
+        <w:jc w:val="both"/>
       </w:pPr>
       <w:r>
         <w:rPr>
@@ -112,7 +102,6 @@
           <w:b/>
           <w:i/>
           <w:sz w:val="20"/>
-          <w:u w:val="none"/>
         </w:rPr>
         <w:t>Abstract</w:t>
       </w:r>
@@ -122,15 +111,14 @@
           <w:b w:val="0"/>
           <w:i w:val="0"/>
           <w:sz w:val="20"/>
-          <w:u w:val="none"/>
         </w:rPr>
         <w:t xml:space="preserve"> — Stress is one of the biggest problems in today's fast-paced society, and because people's lifestyles change so quickly, it frequently results in depression. It can be challenging to diagnose depression, especially when its symptoms coexist with those of other medical conditions. Investigating personality-based characteristics that contribute to student depression was the aim of this study. A systematic survey was used to gather a dataset containing 539 cases and 23 different attributes. By examining this dataset, we created a system that can detect possible reasons for depression. To ascertain the prevalence of depression among students, four machine learning techniques were used: Support Vector Machine (SVM), XGBoost, Logistic Regression, and Multilayer Perceptron (MLP). Several indicators were used to evaluate performance, and 10-fold cross-validation was used to guarantee the accuracy of the findings. Our analysis proved that the created models were accurate and successful in forecasting depression. Support Vector Machine (SVM) achieved the highest accuracy of 97.96%, followed by Logistic Regression (97.77%), XGBoost (97.59%), and Multilayer Perceptron (96.84%). Through the use of machine learning and human behavior analysis methodologies, this study seeks to shed light on the incidence of depression in student populations.</w:t>
       </w:r>
     </w:p>
     <w:p>
       <w:pPr>
-        <w:spacing w:before="80" w:after="120"/>
-        <w:jc w:val="left"/>
+        <w:spacing w:before="80" w:after="160" w:lineRule="exact" w:line="240"/>
+        <w:jc w:val="both"/>
       </w:pPr>
       <w:r>
         <w:rPr>
@@ -138,7 +126,6 @@
           <w:b/>
           <w:i w:val="0"/>
           <w:sz w:val="20"/>
-          <w:u w:val="none"/>
         </w:rPr>
         <w:t xml:space="preserve">Keywords: </w:t>
       </w:r>
@@ -148,19 +135,9 @@
           <w:b w:val="0"/>
           <w:i/>
           <w:sz w:val="20"/>
-          <w:u w:val="none"/>
         </w:rPr>
         <w:t>Support Vector Machine Algorithm, XGBoost Algorithm, Multilayer Perceptron (MLP), Data Mining, Depression, Logistic Regression Algorithm.</w:t>
       </w:r>
-    </w:p>
-    <w:p>
-      <w:pPr>
-        <w:spacing w:before="0" w:after="0"/>
-        <w:sectPr>
-          <w:cols w:num="2" w:space="360" w:equalWidth="1"/>
-          <w:type w:val="continuous"/>
-        </w:sectPr>
-      </w:pPr>
     </w:p>
     <w:p>
       <w:pPr>
@@ -173,7 +150,6 @@
           <w:b/>
           <w:i w:val="0"/>
           <w:sz w:val="20"/>
-          <w:u w:val="none"/>
         </w:rPr>
         <w:t>I. INTRODUCTION</w:t>
       </w:r>
@@ -190,7 +166,6 @@
           <w:b w:val="0"/>
           <w:i w:val="0"/>
           <w:sz w:val="20"/>
-          <w:u w:val="none"/>
         </w:rPr>
         <w:t>Depression is a condition that can appear in a variety of ways. Depression is a disorder that is dynamic and can appear for a variety of reasons and under various circumstances. Brain injuries and extreme mental stress can be caused by depression. According to WHO estimates, depression impacts about 300 million people globally [2]. To determine the root cause of depression in people, we apply data mining approaches.</w:t>
       </w:r>
@@ -207,9 +182,8 @@
           <w:b w:val="0"/>
           <w:i w:val="0"/>
           <w:sz w:val="20"/>
-          <w:u w:val="none"/>
         </w:rPr>
-        <w:t>Over the past 20 years, data mining techniques have been used more and more in a variety of fields [3]. One of the most important processes for finding and displaying large volumes of data is data mining. It offers a path to information discovery as well. Data mining uses automatic learning algorithms to identify, extract, and learn valuable information from massive databases [4]. Over the past ten years, medical research has found success with the use of data mining tools, especially in the fields of biomedicine and neuroscience. Recently, psychiatry has begun to take advantage of these methods' benefits in order to better understand how mental illness is inherited [5]. Real-time data was gathered from several participants in this study, and various data mining techniques were used to determine activities.</w:t>
+        <w:t>Over the past 20 years, data mining techniques have been used more and more in a variety of fields [3]. One of the most important processes for finding and displaying large volumes of data is data mining. It offers a path to information discovery as well. Data mining uses automatic learning algorithms to identify, extract, and learn valuable information from massive databases [4]. Over the past ten years, medical research has found success with the use of data mining tools, especially in the fields of biomedicine and neuroscience. Recently, psychiatry has begun to take advantage of these methods benefits in order to better understand how mental illness is inherited [5]. Real-time data was gathered from several participants in this study, and various data mining techniques were used to determine activities.</w:t>
       </w:r>
     </w:p>
     <w:p>
@@ -223,7 +197,6 @@
           <w:b/>
           <w:i w:val="0"/>
           <w:sz w:val="20"/>
-          <w:u w:val="none"/>
         </w:rPr>
         <w:t>II. RELATED WORKS</w:t>
       </w:r>
@@ -240,9 +213,8 @@
           <w:b w:val="0"/>
           <w:i w:val="0"/>
           <w:sz w:val="20"/>
-          <w:u w:val="none"/>
         </w:rPr>
-        <w:t>This study presents a fuzzy logic method for flood detection to promptly notify customers of the possibility of flooding [6]. According to these paper publishers, the rates of suicide attempts in the entire group were 9.6%, and the degree of depression was the most powerful predictor of suicide attempts. Compared to the non-depressive group, the suicide attempt rates were 2.8 and 5.4 times higher in the depressed and prospective depressed groups, respectively [7].</w:t>
+        <w:t>This study presents a fuzzy logic method for flood detection to promptly notify customers of the possibility of flooding. Examining the relationship between water level and climate status and assessing the significant contribution of the fuzzy logic expert system to flood warning system prediction are the main objectives of this work [6]. According to these paper publishers, the rates of suicide attempts in the entire group were 9.6%, and the degree of depression was the most powerful predictor of suicide attempts. Compared to the non-depressive group, the suicide attempt rates were 2.8 and 5.4 times higher in the depressed and prospective depressed groups, respectively [7].</w:t>
       </w:r>
     </w:p>
     <w:p>
@@ -257,9 +229,8 @@
           <w:b w:val="0"/>
           <w:i w:val="0"/>
           <w:sz w:val="20"/>
-          <w:u w:val="none"/>
         </w:rPr>
-        <w:t>The analysis of emotions related to depression is done using Natural Language Processing (NLP). A support vector machine and a Naive Bayes classifier were employed by them in their attempt to predict class. They used Twitter to gather information. Additionally, the findings were presented using key categorization criteria, such as confusion matrix, F1-score, and precision [8]. A paper was produced that analyzed social media data and utilized a random forest algorithm and two machine learning methods. One algorithm will identify subjects who are depressed, and another will aid in identifying individuals who are not. Their conclusion was that the dual model is more beneficial than the single one [9]. Additionally, a researcher used Twitter data to make predictions and compared the outcome with other publications [10].</w:t>
+        <w:t>The analysis of emotions related to depression is done using Natural Language Processing (NLP). A support vector machine and a Naive Bayes classifier were employed in an attempt to predict class using Twitter data. The findings were presented using key categorization criteria, such as confusion matrix, F1-score, and precision [8]. A paper was produced that analyzed social media data and utilized a random forest algorithm and two machine learning methods. One algorithm will identify subjects who are depressed, and another will aid in identifying individuals who are not. Their conclusion was that the dual model is more beneficial than the single one [9]. Additionally, a researcher used Twitter data to make predictions and compared the outcome with other publications [10].</w:t>
       </w:r>
     </w:p>
     <w:p>
@@ -273,7 +244,6 @@
           <w:b/>
           <w:i w:val="0"/>
           <w:sz w:val="20"/>
-          <w:u w:val="none"/>
         </w:rPr>
         <w:t>III. METHODOLOGY</w:t>
       </w:r>
@@ -290,16 +260,15 @@
           <w:b w:val="0"/>
           <w:i w:val="0"/>
           <w:sz w:val="20"/>
-          <w:u w:val="none"/>
         </w:rPr>
-        <w:t>Although depression analysis has not seen many comparative investigations, it is currently being categorized. Our efforts are guided by these works. This section provides a brief overview of techniques and the effective tools and algorithms used. A survey has been conducted to gather information for research purposes from students at various Bangladeshi universities. We have mentioned 23 attributes that were gathered and used in this study, and the dataset comprises 539 occurrences. Several approaches have been used in this investigation, including:</w:t>
+        <w:t>Although depression analysis has not seen many comparative investigations, it is currently being categorized. Our efforts are guided by these works. This section provides a brief overview of techniques and effective tools and algorithms. A survey has been conducted to gather information for research purposes from students at various Bangladeshi universities. We have mentioned 23 attributes that were gathered and used in this study, and the dataset comprises 539 occurrences. Several approaches have been used in this investigation. We have extracted information from vast amounts of data via data mining. The strategies are as follows:</w:t>
       </w:r>
     </w:p>
     <w:p>
       <w:pPr>
         <w:spacing w:before="0" w:after="40" w:lineRule="exact" w:line="240"/>
-        <w:ind w:left="397"/>
-        <w:jc w:val="left"/>
+        <w:ind w:left="283"/>
+        <w:jc w:val="both"/>
       </w:pPr>
       <w:r>
         <w:rPr>
@@ -307,16 +276,15 @@
           <w:b w:val="0"/>
           <w:i w:val="0"/>
           <w:sz w:val="20"/>
-          <w:u w:val="none"/>
         </w:rPr>
-        <w:t>• Information Gathering</w:t>
+        <w:t>- Information Gathering</w:t>
       </w:r>
     </w:p>
     <w:p>
       <w:pPr>
         <w:spacing w:before="0" w:after="40" w:lineRule="exact" w:line="240"/>
-        <w:ind w:left="397"/>
-        <w:jc w:val="left"/>
+        <w:ind w:left="283"/>
+        <w:jc w:val="both"/>
       </w:pPr>
       <w:r>
         <w:rPr>
@@ -324,16 +292,15 @@
           <w:b w:val="0"/>
           <w:i w:val="0"/>
           <w:sz w:val="20"/>
-          <w:u w:val="none"/>
         </w:rPr>
-        <w:t>• Preprocessing of Data</w:t>
+        <w:t>- Preprocessing of Data</w:t>
       </w:r>
     </w:p>
     <w:p>
       <w:pPr>
         <w:spacing w:before="0" w:after="40" w:lineRule="exact" w:line="240"/>
-        <w:ind w:left="397"/>
-        <w:jc w:val="left"/>
+        <w:ind w:left="283"/>
+        <w:jc w:val="both"/>
       </w:pPr>
       <w:r>
         <w:rPr>
@@ -341,16 +308,15 @@
           <w:b w:val="0"/>
           <w:i w:val="0"/>
           <w:sz w:val="20"/>
-          <w:u w:val="none"/>
         </w:rPr>
-        <w:t>• Algorithmic Implementation</w:t>
+        <w:t>- Algorithmic Implementation</w:t>
       </w:r>
     </w:p>
     <w:p>
       <w:pPr>
         <w:spacing w:before="0" w:after="40" w:lineRule="exact" w:line="240"/>
-        <w:ind w:left="397"/>
-        <w:jc w:val="left"/>
+        <w:ind w:left="283"/>
+        <w:jc w:val="both"/>
       </w:pPr>
       <w:r>
         <w:rPr>
@@ -358,9 +324,8 @@
           <w:b w:val="0"/>
           <w:i w:val="0"/>
           <w:sz w:val="20"/>
-          <w:u w:val="none"/>
         </w:rPr>
-        <w:t>• Simulation Environment</w:t>
+        <w:t>- Simulation Environment</w:t>
       </w:r>
     </w:p>
     <w:p>
@@ -368,43 +333,44 @@
         <w:spacing w:before="80" w:after="40"/>
         <w:jc w:val="center"/>
       </w:pPr>
+      <w:r>
+        <w:drawing>
+          <wp:inline xmlns:a="http://schemas.openxmlformats.org/drawingml/2006/main" xmlns:pic="http://schemas.openxmlformats.org/drawingml/2006/picture">
+            <wp:extent cx="2651760" cy="759665"/>
+            <wp:docPr id="1" name="Picture 1"/>
+            <wp:cNvGraphicFramePr>
+              <a:graphicFrameLocks noChangeAspect="1"/>
+            </wp:cNvGraphicFramePr>
+            <a:graphic>
+              <a:graphicData uri="http://schemas.openxmlformats.org/drawingml/2006/picture">
+                <pic:pic>
+                  <pic:nvPicPr>
+                    <pic:cNvPr id="0" name="fig_page1_img.png"/>
+                    <pic:cNvPicPr/>
+                  </pic:nvPicPr>
+                  <pic:blipFill>
+                    <a:blip r:embed="rId9"/>
+                    <a:stretch>
+                      <a:fillRect/>
+                    </a:stretch>
+                  </pic:blipFill>
+                  <pic:spPr>
+                    <a:xfrm>
+                      <a:off x="0" y="0"/>
+                      <a:ext cx="2651760" cy="759665"/>
+                    </a:xfrm>
+                    <a:prstGeom prst="rect"/>
+                  </pic:spPr>
+                </pic:pic>
+              </a:graphicData>
+            </a:graphic>
+          </wp:inline>
+        </w:drawing>
+      </w:r>
     </w:p>
-    <w:tbl>
-      <w:tblPr>
-        <w:tblStyle w:val="TableGrid"/>
-        <w:tblW w:type="auto" w:w="0"/>
-        <w:jc w:val="center"/>
-        <w:tblLook w:firstColumn="1" w:firstRow="1" w:lastColumn="0" w:lastRow="0" w:noHBand="0" w:noVBand="1" w:val="04A0"/>
-      </w:tblPr>
-      <w:tblGrid>
-        <w:gridCol w:w="9866"/>
-      </w:tblGrid>
-      <w:tr>
-        <w:tc>
-          <w:tcPr>
-            <w:tcW w:type="dxa" w:w="4032"/>
-            <w:shd w:val="clear" w:color="auto" w:fill="D9D9D9"/>
-          </w:tcPr>
-          <w:p>
-            <w:pPr>
-              <w:spacing w:before="280" w:after="280"/>
-              <w:jc w:val="center"/>
-            </w:pPr>
-            <w:r>
-              <w:rPr>
-                <w:i/>
-                <w:color w:val="505050"/>
-                <w:sz w:val="18"/>
-              </w:rPr>
-              <w:t>[Figure Placeholder]</w:t>
-            </w:r>
-          </w:p>
-        </w:tc>
-      </w:tr>
-    </w:tbl>
     <w:p>
       <w:pPr>
-        <w:spacing w:before="40" w:after="120"/>
+        <w:spacing w:before="0" w:after="120"/>
         <w:jc w:val="center"/>
       </w:pPr>
       <w:r>
@@ -413,7 +379,6 @@
           <w:b w:val="0"/>
           <w:i/>
           <w:sz w:val="18"/>
-          <w:u w:val="none"/>
         </w:rPr>
         <w:t>Fig. 1: Procedure for System Operation</w:t>
       </w:r>
@@ -429,7 +394,6 @@
           <w:b/>
           <w:i/>
           <w:sz w:val="20"/>
-          <w:u w:val="none"/>
         </w:rPr>
         <w:t>A. Information Gathering</w:t>
       </w:r>
@@ -446,9 +410,8 @@
           <w:b w:val="0"/>
           <w:i w:val="0"/>
           <w:sz w:val="20"/>
-          <w:u w:val="none"/>
         </w:rPr>
-        <w:t>Our questionnaire was created after consulting with many psychiatrists. We gather data from B.Sc., M.Sc., and Undergraduate students. Upon receiving the responses, we generate our dataset. In the dataset, there are 539 cases. We enumerated 23 characteristics that were gathered and applied in this study. In Table I, the features list is displayed.</w:t>
+        <w:t>Our questionnaire was created after consulting with many psychiatrists. We gather data from B.Sc., M.Sc., and Undergraduate students. Upon receiving the response, we generate our dataset. In the dataset, there are 539 cases. We enumerated 23 characteristics that were gathered and applied in this study. In Table I, the features list is displayed.</w:t>
       </w:r>
     </w:p>
     <w:p>
@@ -462,7 +425,6 @@
           <w:b/>
           <w:i w:val="0"/>
           <w:sz w:val="18"/>
-          <w:u w:val="none"/>
         </w:rPr>
         <w:t>TABLE I: Features List</w:t>
       </w:r>
@@ -482,7 +444,7 @@
       <w:tr>
         <w:tc>
           <w:tcPr>
-            <w:tcW w:type="dxa" w:w="2551"/>
+            <w:tcW w:type="dxa" w:w="2438"/>
             <w:shd w:val="clear" w:color="auto" w:fill="1F3864"/>
           </w:tcPr>
           <w:p>
@@ -522,7 +484,7 @@
         </w:tc>
         <w:tc>
           <w:tcPr>
-            <w:tcW w:type="dxa" w:w="1020"/>
+            <w:tcW w:type="dxa" w:w="1077"/>
             <w:shd w:val="clear" w:color="auto" w:fill="1F3864"/>
           </w:tcPr>
           <w:p>
@@ -544,8 +506,8 @@
       <w:tr>
         <w:tc>
           <w:tcPr>
-            <w:tcW w:type="dxa" w:w="2551"/>
-            <w:shd w:val="clear" w:color="auto" w:fill="EAECF0"/>
+            <w:tcW w:type="dxa" w:w="2438"/>
+            <w:shd w:val="clear" w:color="auto" w:fill="D6E4F7"/>
           </w:tcPr>
           <w:p>
             <w:pPr>
@@ -554,6 +516,7 @@
             <w:r>
               <w:rPr>
                 <w:rFonts w:ascii="Times New Roman" w:hAnsi="Times New Roman"/>
+                <w:b w:val="0"/>
                 <w:sz w:val="16"/>
               </w:rPr>
               <w:t>Age</w:t>
@@ -563,7 +526,7 @@
         <w:tc>
           <w:tcPr>
             <w:tcW w:type="dxa" w:w="1247"/>
-            <w:shd w:val="clear" w:color="auto" w:fill="EAECF0"/>
+            <w:shd w:val="clear" w:color="auto" w:fill="D6E4F7"/>
           </w:tcPr>
           <w:p>
             <w:pPr>
@@ -572,6 +535,7 @@
             <w:r>
               <w:rPr>
                 <w:rFonts w:ascii="Times New Roman" w:hAnsi="Times New Roman"/>
+                <w:b w:val="0"/>
                 <w:sz w:val="16"/>
               </w:rPr>
               <w:t>–</w:t>
@@ -580,8 +544,8 @@
         </w:tc>
         <w:tc>
           <w:tcPr>
-            <w:tcW w:type="dxa" w:w="1020"/>
-            <w:shd w:val="clear" w:color="auto" w:fill="EAECF0"/>
+            <w:tcW w:type="dxa" w:w="1077"/>
+            <w:shd w:val="clear" w:color="auto" w:fill="D6E4F7"/>
           </w:tcPr>
           <w:p>
             <w:pPr>
@@ -590,6 +554,7 @@
             <w:r>
               <w:rPr>
                 <w:rFonts w:ascii="Times New Roman" w:hAnsi="Times New Roman"/>
+                <w:b w:val="0"/>
                 <w:sz w:val="16"/>
               </w:rPr>
               <w:t>Min: 17, Max: 33</w:t>
@@ -600,7 +565,7 @@
       <w:tr>
         <w:tc>
           <w:tcPr>
-            <w:tcW w:type="dxa" w:w="2551"/>
+            <w:tcW w:type="dxa" w:w="2438"/>
             <w:shd w:val="clear" w:color="auto" w:fill="FFFFFF"/>
           </w:tcPr>
           <w:p>
@@ -610,6 +575,7 @@
             <w:r>
               <w:rPr>
                 <w:rFonts w:ascii="Times New Roman" w:hAnsi="Times New Roman"/>
+                <w:b w:val="0"/>
                 <w:sz w:val="16"/>
               </w:rPr>
               <w:t>Gender</w:t>
@@ -628,6 +594,7 @@
             <w:r>
               <w:rPr>
                 <w:rFonts w:ascii="Times New Roman" w:hAnsi="Times New Roman"/>
+                <w:b w:val="0"/>
                 <w:sz w:val="16"/>
               </w:rPr>
               <w:t>Male</w:t>
@@ -636,7 +603,7 @@
         </w:tc>
         <w:tc>
           <w:tcPr>
-            <w:tcW w:type="dxa" w:w="1020"/>
+            <w:tcW w:type="dxa" w:w="1077"/>
             <w:shd w:val="clear" w:color="auto" w:fill="FFFFFF"/>
           </w:tcPr>
           <w:p>
@@ -646,6 +613,7 @@
             <w:r>
               <w:rPr>
                 <w:rFonts w:ascii="Times New Roman" w:hAnsi="Times New Roman"/>
+                <w:b w:val="0"/>
                 <w:sz w:val="16"/>
               </w:rPr>
               <w:t>66.50%</w:t>
@@ -656,8 +624,8 @@
       <w:tr>
         <w:tc>
           <w:tcPr>
-            <w:tcW w:type="dxa" w:w="2551"/>
-            <w:shd w:val="clear" w:color="auto" w:fill="EAECF0"/>
+            <w:tcW w:type="dxa" w:w="2438"/>
+            <w:shd w:val="clear" w:color="auto" w:fill="D6E4F7"/>
           </w:tcPr>
           <w:p>
             <w:pPr>
@@ -666,6 +634,7 @@
             <w:r>
               <w:rPr>
                 <w:rFonts w:ascii="Times New Roman" w:hAnsi="Times New Roman"/>
+                <w:b w:val="0"/>
                 <w:sz w:val="16"/>
               </w:rPr>
             </w:r>
@@ -674,7 +643,7 @@
         <w:tc>
           <w:tcPr>
             <w:tcW w:type="dxa" w:w="1247"/>
-            <w:shd w:val="clear" w:color="auto" w:fill="EAECF0"/>
+            <w:shd w:val="clear" w:color="auto" w:fill="D6E4F7"/>
           </w:tcPr>
           <w:p>
             <w:pPr>
@@ -683,6 +652,7 @@
             <w:r>
               <w:rPr>
                 <w:rFonts w:ascii="Times New Roman" w:hAnsi="Times New Roman"/>
+                <w:b w:val="0"/>
                 <w:sz w:val="16"/>
               </w:rPr>
               <w:t>Female</w:t>
@@ -691,8 +661,8 @@
         </w:tc>
         <w:tc>
           <w:tcPr>
-            <w:tcW w:type="dxa" w:w="1020"/>
-            <w:shd w:val="clear" w:color="auto" w:fill="EAECF0"/>
+            <w:tcW w:type="dxa" w:w="1077"/>
+            <w:shd w:val="clear" w:color="auto" w:fill="D6E4F7"/>
           </w:tcPr>
           <w:p>
             <w:pPr>
@@ -701,6 +671,7 @@
             <w:r>
               <w:rPr>
                 <w:rFonts w:ascii="Times New Roman" w:hAnsi="Times New Roman"/>
+                <w:b w:val="0"/>
                 <w:sz w:val="16"/>
               </w:rPr>
               <w:t>33.50%</w:t>
@@ -711,7 +682,7 @@
       <w:tr>
         <w:tc>
           <w:tcPr>
-            <w:tcW w:type="dxa" w:w="2551"/>
+            <w:tcW w:type="dxa" w:w="2438"/>
             <w:shd w:val="clear" w:color="auto" w:fill="FFFFFF"/>
           </w:tcPr>
           <w:p>
@@ -721,6 +692,7 @@
             <w:r>
               <w:rPr>
                 <w:rFonts w:ascii="Times New Roman" w:hAnsi="Times New Roman"/>
+                <w:b w:val="0"/>
                 <w:sz w:val="16"/>
               </w:rPr>
               <w:t>Do you accept all social norms?</w:t>
@@ -739,6 +711,7 @@
             <w:r>
               <w:rPr>
                 <w:rFonts w:ascii="Times New Roman" w:hAnsi="Times New Roman"/>
+                <w:b w:val="0"/>
                 <w:sz w:val="16"/>
               </w:rPr>
               <w:t>Yes</w:t>
@@ -747,7 +720,7 @@
         </w:tc>
         <w:tc>
           <w:tcPr>
-            <w:tcW w:type="dxa" w:w="1020"/>
+            <w:tcW w:type="dxa" w:w="1077"/>
             <w:shd w:val="clear" w:color="auto" w:fill="FFFFFF"/>
           </w:tcPr>
           <w:p>
@@ -757,6 +730,7 @@
             <w:r>
               <w:rPr>
                 <w:rFonts w:ascii="Times New Roman" w:hAnsi="Times New Roman"/>
+                <w:b w:val="0"/>
                 <w:sz w:val="16"/>
               </w:rPr>
               <w:t>66.03%</w:t>
@@ -767,8 +741,8 @@
       <w:tr>
         <w:tc>
           <w:tcPr>
-            <w:tcW w:type="dxa" w:w="2551"/>
-            <w:shd w:val="clear" w:color="auto" w:fill="EAECF0"/>
+            <w:tcW w:type="dxa" w:w="2438"/>
+            <w:shd w:val="clear" w:color="auto" w:fill="D6E4F7"/>
           </w:tcPr>
           <w:p>
             <w:pPr>
@@ -777,6 +751,7 @@
             <w:r>
               <w:rPr>
                 <w:rFonts w:ascii="Times New Roman" w:hAnsi="Times New Roman"/>
+                <w:b w:val="0"/>
                 <w:sz w:val="16"/>
               </w:rPr>
             </w:r>
@@ -785,7 +760,7 @@
         <w:tc>
           <w:tcPr>
             <w:tcW w:type="dxa" w:w="1247"/>
-            <w:shd w:val="clear" w:color="auto" w:fill="EAECF0"/>
+            <w:shd w:val="clear" w:color="auto" w:fill="D6E4F7"/>
           </w:tcPr>
           <w:p>
             <w:pPr>
@@ -794,6 +769,7 @@
             <w:r>
               <w:rPr>
                 <w:rFonts w:ascii="Times New Roman" w:hAnsi="Times New Roman"/>
+                <w:b w:val="0"/>
                 <w:sz w:val="16"/>
               </w:rPr>
               <w:t>No</w:t>
@@ -802,8 +778,8 @@
         </w:tc>
         <w:tc>
           <w:tcPr>
-            <w:tcW w:type="dxa" w:w="1020"/>
-            <w:shd w:val="clear" w:color="auto" w:fill="EAECF0"/>
+            <w:tcW w:type="dxa" w:w="1077"/>
+            <w:shd w:val="clear" w:color="auto" w:fill="D6E4F7"/>
           </w:tcPr>
           <w:p>
             <w:pPr>
@@ -812,6 +788,7 @@
             <w:r>
               <w:rPr>
                 <w:rFonts w:ascii="Times New Roman" w:hAnsi="Times New Roman"/>
+                <w:b w:val="0"/>
                 <w:sz w:val="16"/>
               </w:rPr>
               <w:t>33.97%</w:t>
@@ -822,7 +799,7 @@
       <w:tr>
         <w:tc>
           <w:tcPr>
-            <w:tcW w:type="dxa" w:w="2551"/>
+            <w:tcW w:type="dxa" w:w="2438"/>
             <w:shd w:val="clear" w:color="auto" w:fill="FFFFFF"/>
           </w:tcPr>
           <w:p>
@@ -832,6 +809,7 @@
             <w:r>
               <w:rPr>
                 <w:rFonts w:ascii="Times New Roman" w:hAnsi="Times New Roman"/>
+                <w:b w:val="0"/>
                 <w:sz w:val="16"/>
               </w:rPr>
               <w:t>What are your thoughts on yourself?</w:t>
@@ -850,6 +828,7 @@
             <w:r>
               <w:rPr>
                 <w:rFonts w:ascii="Times New Roman" w:hAnsi="Times New Roman"/>
+                <w:b w:val="0"/>
                 <w:sz w:val="16"/>
               </w:rPr>
               <w:t>Extrovert</w:t>
@@ -858,7 +837,7 @@
         </w:tc>
         <w:tc>
           <w:tcPr>
-            <w:tcW w:type="dxa" w:w="1020"/>
+            <w:tcW w:type="dxa" w:w="1077"/>
             <w:shd w:val="clear" w:color="auto" w:fill="FFFFFF"/>
           </w:tcPr>
           <w:p>
@@ -868,6 +847,7 @@
             <w:r>
               <w:rPr>
                 <w:rFonts w:ascii="Times New Roman" w:hAnsi="Times New Roman"/>
+                <w:b w:val="0"/>
                 <w:sz w:val="16"/>
               </w:rPr>
               <w:t>57.15%</w:t>
@@ -878,8 +858,8 @@
       <w:tr>
         <w:tc>
           <w:tcPr>
-            <w:tcW w:type="dxa" w:w="2551"/>
-            <w:shd w:val="clear" w:color="auto" w:fill="EAECF0"/>
+            <w:tcW w:type="dxa" w:w="2438"/>
+            <w:shd w:val="clear" w:color="auto" w:fill="D6E4F7"/>
           </w:tcPr>
           <w:p>
             <w:pPr>
@@ -888,6 +868,7 @@
             <w:r>
               <w:rPr>
                 <w:rFonts w:ascii="Times New Roman" w:hAnsi="Times New Roman"/>
+                <w:b w:val="0"/>
                 <w:sz w:val="16"/>
               </w:rPr>
             </w:r>
@@ -896,7 +877,7 @@
         <w:tc>
           <w:tcPr>
             <w:tcW w:type="dxa" w:w="1247"/>
-            <w:shd w:val="clear" w:color="auto" w:fill="EAECF0"/>
+            <w:shd w:val="clear" w:color="auto" w:fill="D6E4F7"/>
           </w:tcPr>
           <w:p>
             <w:pPr>
@@ -905,6 +886,7 @@
             <w:r>
               <w:rPr>
                 <w:rFonts w:ascii="Times New Roman" w:hAnsi="Times New Roman"/>
+                <w:b w:val="0"/>
                 <w:sz w:val="16"/>
               </w:rPr>
               <w:t>Introvert</w:t>
@@ -913,8 +895,8 @@
         </w:tc>
         <w:tc>
           <w:tcPr>
-            <w:tcW w:type="dxa" w:w="1020"/>
-            <w:shd w:val="clear" w:color="auto" w:fill="EAECF0"/>
+            <w:tcW w:type="dxa" w:w="1077"/>
+            <w:shd w:val="clear" w:color="auto" w:fill="D6E4F7"/>
           </w:tcPr>
           <w:p>
             <w:pPr>
@@ -923,6 +905,7 @@
             <w:r>
               <w:rPr>
                 <w:rFonts w:ascii="Times New Roman" w:hAnsi="Times New Roman"/>
+                <w:b w:val="0"/>
                 <w:sz w:val="16"/>
               </w:rPr>
               <w:t>42.85%</w:t>
@@ -933,7 +916,7 @@
       <w:tr>
         <w:tc>
           <w:tcPr>
-            <w:tcW w:type="dxa" w:w="2551"/>
+            <w:tcW w:type="dxa" w:w="2438"/>
             <w:shd w:val="clear" w:color="auto" w:fill="FFFFFF"/>
           </w:tcPr>
           <w:p>
@@ -943,6 +926,7 @@
             <w:r>
               <w:rPr>
                 <w:rFonts w:ascii="Times New Roman" w:hAnsi="Times New Roman"/>
+                <w:b w:val="0"/>
                 <w:sz w:val="16"/>
               </w:rPr>
               <w:t>Do you own a smartphone?</w:t>
@@ -961,6 +945,7 @@
             <w:r>
               <w:rPr>
                 <w:rFonts w:ascii="Times New Roman" w:hAnsi="Times New Roman"/>
+                <w:b w:val="0"/>
                 <w:sz w:val="16"/>
               </w:rPr>
               <w:t>Yes</w:t>
@@ -969,7 +954,7 @@
         </w:tc>
         <w:tc>
           <w:tcPr>
-            <w:tcW w:type="dxa" w:w="1020"/>
+            <w:tcW w:type="dxa" w:w="1077"/>
             <w:shd w:val="clear" w:color="auto" w:fill="FFFFFF"/>
           </w:tcPr>
           <w:p>
@@ -979,6 +964,7 @@
             <w:r>
               <w:rPr>
                 <w:rFonts w:ascii="Times New Roman" w:hAnsi="Times New Roman"/>
+                <w:b w:val="0"/>
                 <w:sz w:val="16"/>
               </w:rPr>
               <w:t>93.10%</w:t>
@@ -989,8 +975,8 @@
       <w:tr>
         <w:tc>
           <w:tcPr>
-            <w:tcW w:type="dxa" w:w="2551"/>
-            <w:shd w:val="clear" w:color="auto" w:fill="EAECF0"/>
+            <w:tcW w:type="dxa" w:w="2438"/>
+            <w:shd w:val="clear" w:color="auto" w:fill="D6E4F7"/>
           </w:tcPr>
           <w:p>
             <w:pPr>
@@ -999,6 +985,7 @@
             <w:r>
               <w:rPr>
                 <w:rFonts w:ascii="Times New Roman" w:hAnsi="Times New Roman"/>
+                <w:b w:val="0"/>
                 <w:sz w:val="16"/>
               </w:rPr>
             </w:r>
@@ -1007,7 +994,7 @@
         <w:tc>
           <w:tcPr>
             <w:tcW w:type="dxa" w:w="1247"/>
-            <w:shd w:val="clear" w:color="auto" w:fill="EAECF0"/>
+            <w:shd w:val="clear" w:color="auto" w:fill="D6E4F7"/>
           </w:tcPr>
           <w:p>
             <w:pPr>
@@ -1016,6 +1003,7 @@
             <w:r>
               <w:rPr>
                 <w:rFonts w:ascii="Times New Roman" w:hAnsi="Times New Roman"/>
+                <w:b w:val="0"/>
                 <w:sz w:val="16"/>
               </w:rPr>
               <w:t>No</w:t>
@@ -1024,8 +1012,8 @@
         </w:tc>
         <w:tc>
           <w:tcPr>
-            <w:tcW w:type="dxa" w:w="1020"/>
-            <w:shd w:val="clear" w:color="auto" w:fill="EAECF0"/>
+            <w:tcW w:type="dxa" w:w="1077"/>
+            <w:shd w:val="clear" w:color="auto" w:fill="D6E4F7"/>
           </w:tcPr>
           <w:p>
             <w:pPr>
@@ -1034,6 +1022,7 @@
             <w:r>
               <w:rPr>
                 <w:rFonts w:ascii="Times New Roman" w:hAnsi="Times New Roman"/>
+                <w:b w:val="0"/>
                 <w:sz w:val="16"/>
               </w:rPr>
               <w:t>6.90%</w:t>
@@ -1044,7 +1033,7 @@
       <w:tr>
         <w:tc>
           <w:tcPr>
-            <w:tcW w:type="dxa" w:w="2551"/>
+            <w:tcW w:type="dxa" w:w="2438"/>
             <w:shd w:val="clear" w:color="auto" w:fill="FFFFFF"/>
           </w:tcPr>
           <w:p>
@@ -1054,6 +1043,7 @@
             <w:r>
               <w:rPr>
                 <w:rFonts w:ascii="Times New Roman" w:hAnsi="Times New Roman"/>
+                <w:b w:val="0"/>
                 <w:sz w:val="16"/>
               </w:rPr>
               <w:t>Do you enjoy hanging out with friends?</w:t>
@@ -1072,6 +1062,7 @@
             <w:r>
               <w:rPr>
                 <w:rFonts w:ascii="Times New Roman" w:hAnsi="Times New Roman"/>
+                <w:b w:val="0"/>
                 <w:sz w:val="16"/>
               </w:rPr>
               <w:t>Yes</w:t>
@@ -1080,7 +1071,7 @@
         </w:tc>
         <w:tc>
           <w:tcPr>
-            <w:tcW w:type="dxa" w:w="1020"/>
+            <w:tcW w:type="dxa" w:w="1077"/>
             <w:shd w:val="clear" w:color="auto" w:fill="FFFFFF"/>
           </w:tcPr>
           <w:p>
@@ -1090,6 +1081,7 @@
             <w:r>
               <w:rPr>
                 <w:rFonts w:ascii="Times New Roman" w:hAnsi="Times New Roman"/>
+                <w:b w:val="0"/>
                 <w:sz w:val="16"/>
               </w:rPr>
               <w:t>89.25%</w:t>
@@ -1100,8 +1092,8 @@
       <w:tr>
         <w:tc>
           <w:tcPr>
-            <w:tcW w:type="dxa" w:w="2551"/>
-            <w:shd w:val="clear" w:color="auto" w:fill="EAECF0"/>
+            <w:tcW w:type="dxa" w:w="2438"/>
+            <w:shd w:val="clear" w:color="auto" w:fill="D6E4F7"/>
           </w:tcPr>
           <w:p>
             <w:pPr>
@@ -1110,6 +1102,7 @@
             <w:r>
               <w:rPr>
                 <w:rFonts w:ascii="Times New Roman" w:hAnsi="Times New Roman"/>
+                <w:b w:val="0"/>
                 <w:sz w:val="16"/>
               </w:rPr>
             </w:r>
@@ -1118,7 +1111,7 @@
         <w:tc>
           <w:tcPr>
             <w:tcW w:type="dxa" w:w="1247"/>
-            <w:shd w:val="clear" w:color="auto" w:fill="EAECF0"/>
+            <w:shd w:val="clear" w:color="auto" w:fill="D6E4F7"/>
           </w:tcPr>
           <w:p>
             <w:pPr>
@@ -1127,6 +1120,7 @@
             <w:r>
               <w:rPr>
                 <w:rFonts w:ascii="Times New Roman" w:hAnsi="Times New Roman"/>
+                <w:b w:val="0"/>
                 <w:sz w:val="16"/>
               </w:rPr>
               <w:t>No</w:t>
@@ -1135,8 +1129,8 @@
         </w:tc>
         <w:tc>
           <w:tcPr>
-            <w:tcW w:type="dxa" w:w="1020"/>
-            <w:shd w:val="clear" w:color="auto" w:fill="EAECF0"/>
+            <w:tcW w:type="dxa" w:w="1077"/>
+            <w:shd w:val="clear" w:color="auto" w:fill="D6E4F7"/>
           </w:tcPr>
           <w:p>
             <w:pPr>
@@ -1145,6 +1139,7 @@
             <w:r>
               <w:rPr>
                 <w:rFonts w:ascii="Times New Roman" w:hAnsi="Times New Roman"/>
+                <w:b w:val="0"/>
                 <w:sz w:val="16"/>
               </w:rPr>
               <w:t>10.75%</w:t>
@@ -1155,7 +1150,7 @@
       <w:tr>
         <w:tc>
           <w:tcPr>
-            <w:tcW w:type="dxa" w:w="2551"/>
+            <w:tcW w:type="dxa" w:w="2438"/>
             <w:shd w:val="clear" w:color="auto" w:fill="FFFFFF"/>
           </w:tcPr>
           <w:p>
@@ -1165,6 +1160,7 @@
             <w:r>
               <w:rPr>
                 <w:rFonts w:ascii="Times New Roman" w:hAnsi="Times New Roman"/>
+                <w:b w:val="0"/>
                 <w:sz w:val="16"/>
               </w:rPr>
               <w:t>Are you content in your current role?</w:t>
@@ -1183,6 +1179,7 @@
             <w:r>
               <w:rPr>
                 <w:rFonts w:ascii="Times New Roman" w:hAnsi="Times New Roman"/>
+                <w:b w:val="0"/>
                 <w:sz w:val="16"/>
               </w:rPr>
               <w:t>Yes</w:t>
@@ -1191,7 +1188,7 @@
         </w:tc>
         <w:tc>
           <w:tcPr>
-            <w:tcW w:type="dxa" w:w="1020"/>
+            <w:tcW w:type="dxa" w:w="1077"/>
             <w:shd w:val="clear" w:color="auto" w:fill="FFFFFF"/>
           </w:tcPr>
           <w:p>
@@ -1201,6 +1198,7 @@
             <w:r>
               <w:rPr>
                 <w:rFonts w:ascii="Times New Roman" w:hAnsi="Times New Roman"/>
+                <w:b w:val="0"/>
                 <w:sz w:val="16"/>
               </w:rPr>
               <w:t>66.02%</w:t>
@@ -1211,8 +1209,8 @@
       <w:tr>
         <w:tc>
           <w:tcPr>
-            <w:tcW w:type="dxa" w:w="2551"/>
-            <w:shd w:val="clear" w:color="auto" w:fill="EAECF0"/>
+            <w:tcW w:type="dxa" w:w="2438"/>
+            <w:shd w:val="clear" w:color="auto" w:fill="D6E4F7"/>
           </w:tcPr>
           <w:p>
             <w:pPr>
@@ -1221,6 +1219,7 @@
             <w:r>
               <w:rPr>
                 <w:rFonts w:ascii="Times New Roman" w:hAnsi="Times New Roman"/>
+                <w:b w:val="0"/>
                 <w:sz w:val="16"/>
               </w:rPr>
             </w:r>
@@ -1229,7 +1228,7 @@
         <w:tc>
           <w:tcPr>
             <w:tcW w:type="dxa" w:w="1247"/>
-            <w:shd w:val="clear" w:color="auto" w:fill="EAECF0"/>
+            <w:shd w:val="clear" w:color="auto" w:fill="D6E4F7"/>
           </w:tcPr>
           <w:p>
             <w:pPr>
@@ -1238,6 +1237,7 @@
             <w:r>
               <w:rPr>
                 <w:rFonts w:ascii="Times New Roman" w:hAnsi="Times New Roman"/>
+                <w:b w:val="0"/>
                 <w:sz w:val="16"/>
               </w:rPr>
               <w:t>No</w:t>
@@ -1246,8 +1246,8 @@
         </w:tc>
         <w:tc>
           <w:tcPr>
-            <w:tcW w:type="dxa" w:w="1020"/>
-            <w:shd w:val="clear" w:color="auto" w:fill="EAECF0"/>
+            <w:tcW w:type="dxa" w:w="1077"/>
+            <w:shd w:val="clear" w:color="auto" w:fill="D6E4F7"/>
           </w:tcPr>
           <w:p>
             <w:pPr>
@@ -1256,6 +1256,7 @@
             <w:r>
               <w:rPr>
                 <w:rFonts w:ascii="Times New Roman" w:hAnsi="Times New Roman"/>
+                <w:b w:val="0"/>
                 <w:sz w:val="16"/>
               </w:rPr>
               <w:t>33.98%</w:t>
@@ -1266,7 +1267,7 @@
       <w:tr>
         <w:tc>
           <w:tcPr>
-            <w:tcW w:type="dxa" w:w="2551"/>
+            <w:tcW w:type="dxa" w:w="2438"/>
             <w:shd w:val="clear" w:color="auto" w:fill="FFFFFF"/>
           </w:tcPr>
           <w:p>
@@ -1276,6 +1277,7 @@
             <w:r>
               <w:rPr>
                 <w:rFonts w:ascii="Times New Roman" w:hAnsi="Times New Roman"/>
+                <w:b w:val="0"/>
                 <w:sz w:val="16"/>
               </w:rPr>
               <w:t>Are you anxious about your work?</w:t>
@@ -1294,6 +1296,7 @@
             <w:r>
               <w:rPr>
                 <w:rFonts w:ascii="Times New Roman" w:hAnsi="Times New Roman"/>
+                <w:b w:val="0"/>
                 <w:sz w:val="16"/>
               </w:rPr>
               <w:t>Yes</w:t>
@@ -1302,7 +1305,7 @@
         </w:tc>
         <w:tc>
           <w:tcPr>
-            <w:tcW w:type="dxa" w:w="1020"/>
+            <w:tcW w:type="dxa" w:w="1077"/>
             <w:shd w:val="clear" w:color="auto" w:fill="FFFFFF"/>
           </w:tcPr>
           <w:p>
@@ -1312,6 +1315,7 @@
             <w:r>
               <w:rPr>
                 <w:rFonts w:ascii="Times New Roman" w:hAnsi="Times New Roman"/>
+                <w:b w:val="0"/>
                 <w:sz w:val="16"/>
               </w:rPr>
               <w:t>71.23%</w:t>
@@ -1322,8 +1326,8 @@
       <w:tr>
         <w:tc>
           <w:tcPr>
-            <w:tcW w:type="dxa" w:w="2551"/>
-            <w:shd w:val="clear" w:color="auto" w:fill="EAECF0"/>
+            <w:tcW w:type="dxa" w:w="2438"/>
+            <w:shd w:val="clear" w:color="auto" w:fill="D6E4F7"/>
           </w:tcPr>
           <w:p>
             <w:pPr>
@@ -1332,6 +1336,7 @@
             <w:r>
               <w:rPr>
                 <w:rFonts w:ascii="Times New Roman" w:hAnsi="Times New Roman"/>
+                <w:b w:val="0"/>
                 <w:sz w:val="16"/>
               </w:rPr>
             </w:r>
@@ -1340,7 +1345,7 @@
         <w:tc>
           <w:tcPr>
             <w:tcW w:type="dxa" w:w="1247"/>
-            <w:shd w:val="clear" w:color="auto" w:fill="EAECF0"/>
+            <w:shd w:val="clear" w:color="auto" w:fill="D6E4F7"/>
           </w:tcPr>
           <w:p>
             <w:pPr>
@@ -1349,6 +1354,7 @@
             <w:r>
               <w:rPr>
                 <w:rFonts w:ascii="Times New Roman" w:hAnsi="Times New Roman"/>
+                <w:b w:val="0"/>
                 <w:sz w:val="16"/>
               </w:rPr>
               <w:t>No</w:t>
@@ -1357,8 +1363,8 @@
         </w:tc>
         <w:tc>
           <w:tcPr>
-            <w:tcW w:type="dxa" w:w="1020"/>
-            <w:shd w:val="clear" w:color="auto" w:fill="EAECF0"/>
+            <w:tcW w:type="dxa" w:w="1077"/>
+            <w:shd w:val="clear" w:color="auto" w:fill="D6E4F7"/>
           </w:tcPr>
           <w:p>
             <w:pPr>
@@ -1367,6 +1373,7 @@
             <w:r>
               <w:rPr>
                 <w:rFonts w:ascii="Times New Roman" w:hAnsi="Times New Roman"/>
+                <w:b w:val="0"/>
                 <w:sz w:val="16"/>
               </w:rPr>
               <w:t>28.77%</w:t>
@@ -1377,7 +1384,7 @@
       <w:tr>
         <w:tc>
           <w:tcPr>
-            <w:tcW w:type="dxa" w:w="2551"/>
+            <w:tcW w:type="dxa" w:w="2438"/>
             <w:shd w:val="clear" w:color="auto" w:fill="FFFFFF"/>
           </w:tcPr>
           <w:p>
@@ -1387,9 +1394,10 @@
             <w:r>
               <w:rPr>
                 <w:rFonts w:ascii="Times New Roman" w:hAnsi="Times New Roman"/>
+                <w:b w:val="0"/>
                 <w:sz w:val="16"/>
               </w:rPr>
-              <w:t>Do you talk to someone about your problems?</w:t>
+              <w:t>Do you talk to someone about problems?</w:t>
             </w:r>
           </w:p>
         </w:tc>
@@ -1405,6 +1413,7 @@
             <w:r>
               <w:rPr>
                 <w:rFonts w:ascii="Times New Roman" w:hAnsi="Times New Roman"/>
+                <w:b w:val="0"/>
                 <w:sz w:val="16"/>
               </w:rPr>
               <w:t>Yes</w:t>
@@ -1413,7 +1422,7 @@
         </w:tc>
         <w:tc>
           <w:tcPr>
-            <w:tcW w:type="dxa" w:w="1020"/>
+            <w:tcW w:type="dxa" w:w="1077"/>
             <w:shd w:val="clear" w:color="auto" w:fill="FFFFFF"/>
           </w:tcPr>
           <w:p>
@@ -1423,6 +1432,7 @@
             <w:r>
               <w:rPr>
                 <w:rFonts w:ascii="Times New Roman" w:hAnsi="Times New Roman"/>
+                <w:b w:val="0"/>
                 <w:sz w:val="16"/>
               </w:rPr>
               <w:t>61.05%</w:t>
@@ -1433,8 +1443,8 @@
       <w:tr>
         <w:tc>
           <w:tcPr>
-            <w:tcW w:type="dxa" w:w="2551"/>
-            <w:shd w:val="clear" w:color="auto" w:fill="EAECF0"/>
+            <w:tcW w:type="dxa" w:w="2438"/>
+            <w:shd w:val="clear" w:color="auto" w:fill="D6E4F7"/>
           </w:tcPr>
           <w:p>
             <w:pPr>
@@ -1443,6 +1453,7 @@
             <w:r>
               <w:rPr>
                 <w:rFonts w:ascii="Times New Roman" w:hAnsi="Times New Roman"/>
+                <w:b w:val="0"/>
                 <w:sz w:val="16"/>
               </w:rPr>
             </w:r>
@@ -1451,7 +1462,7 @@
         <w:tc>
           <w:tcPr>
             <w:tcW w:type="dxa" w:w="1247"/>
-            <w:shd w:val="clear" w:color="auto" w:fill="EAECF0"/>
+            <w:shd w:val="clear" w:color="auto" w:fill="D6E4F7"/>
           </w:tcPr>
           <w:p>
             <w:pPr>
@@ -1460,6 +1471,7 @@
             <w:r>
               <w:rPr>
                 <w:rFonts w:ascii="Times New Roman" w:hAnsi="Times New Roman"/>
+                <w:b w:val="0"/>
                 <w:sz w:val="16"/>
               </w:rPr>
               <w:t>No</w:t>
@@ -1468,8 +1480,8 @@
         </w:tc>
         <w:tc>
           <w:tcPr>
-            <w:tcW w:type="dxa" w:w="1020"/>
-            <w:shd w:val="clear" w:color="auto" w:fill="EAECF0"/>
+            <w:tcW w:type="dxa" w:w="1077"/>
+            <w:shd w:val="clear" w:color="auto" w:fill="D6E4F7"/>
           </w:tcPr>
           <w:p>
             <w:pPr>
@@ -1478,6 +1490,7 @@
             <w:r>
               <w:rPr>
                 <w:rFonts w:ascii="Times New Roman" w:hAnsi="Times New Roman"/>
+                <w:b w:val="0"/>
                 <w:sz w:val="16"/>
               </w:rPr>
               <w:t>38.95%</w:t>
@@ -1488,7 +1501,7 @@
       <w:tr>
         <w:tc>
           <w:tcPr>
-            <w:tcW w:type="dxa" w:w="2551"/>
+            <w:tcW w:type="dxa" w:w="2438"/>
             <w:shd w:val="clear" w:color="auto" w:fill="FFFFFF"/>
           </w:tcPr>
           <w:p>
@@ -1498,6 +1511,7 @@
             <w:r>
               <w:rPr>
                 <w:rFonts w:ascii="Times New Roman" w:hAnsi="Times New Roman"/>
+                <w:b w:val="0"/>
                 <w:sz w:val="16"/>
               </w:rPr>
               <w:t>Do you find solitude comfortable?</w:t>
@@ -1516,6 +1530,7 @@
             <w:r>
               <w:rPr>
                 <w:rFonts w:ascii="Times New Roman" w:hAnsi="Times New Roman"/>
+                <w:b w:val="0"/>
                 <w:sz w:val="16"/>
               </w:rPr>
               <w:t>Yes</w:t>
@@ -1524,7 +1539,7 @@
         </w:tc>
         <w:tc>
           <w:tcPr>
-            <w:tcW w:type="dxa" w:w="1020"/>
+            <w:tcW w:type="dxa" w:w="1077"/>
             <w:shd w:val="clear" w:color="auto" w:fill="FFFFFF"/>
           </w:tcPr>
           <w:p>
@@ -1534,6 +1549,7 @@
             <w:r>
               <w:rPr>
                 <w:rFonts w:ascii="Times New Roman" w:hAnsi="Times New Roman"/>
+                <w:b w:val="0"/>
                 <w:sz w:val="16"/>
               </w:rPr>
               <w:t>61.22%</w:t>
@@ -1544,8 +1560,8 @@
       <w:tr>
         <w:tc>
           <w:tcPr>
-            <w:tcW w:type="dxa" w:w="2551"/>
-            <w:shd w:val="clear" w:color="auto" w:fill="EAECF0"/>
+            <w:tcW w:type="dxa" w:w="2438"/>
+            <w:shd w:val="clear" w:color="auto" w:fill="D6E4F7"/>
           </w:tcPr>
           <w:p>
             <w:pPr>
@@ -1554,6 +1570,7 @@
             <w:r>
               <w:rPr>
                 <w:rFonts w:ascii="Times New Roman" w:hAnsi="Times New Roman"/>
+                <w:b w:val="0"/>
                 <w:sz w:val="16"/>
               </w:rPr>
             </w:r>
@@ -1562,7 +1579,7 @@
         <w:tc>
           <w:tcPr>
             <w:tcW w:type="dxa" w:w="1247"/>
-            <w:shd w:val="clear" w:color="auto" w:fill="EAECF0"/>
+            <w:shd w:val="clear" w:color="auto" w:fill="D6E4F7"/>
           </w:tcPr>
           <w:p>
             <w:pPr>
@@ -1571,6 +1588,7 @@
             <w:r>
               <w:rPr>
                 <w:rFonts w:ascii="Times New Roman" w:hAnsi="Times New Roman"/>
+                <w:b w:val="0"/>
                 <w:sz w:val="16"/>
               </w:rPr>
               <w:t>No</w:t>
@@ -1579,8 +1597,8 @@
         </w:tc>
         <w:tc>
           <w:tcPr>
-            <w:tcW w:type="dxa" w:w="1020"/>
-            <w:shd w:val="clear" w:color="auto" w:fill="EAECF0"/>
+            <w:tcW w:type="dxa" w:w="1077"/>
+            <w:shd w:val="clear" w:color="auto" w:fill="D6E4F7"/>
           </w:tcPr>
           <w:p>
             <w:pPr>
@@ -1589,6 +1607,7 @@
             <w:r>
               <w:rPr>
                 <w:rFonts w:ascii="Times New Roman" w:hAnsi="Times New Roman"/>
+                <w:b w:val="0"/>
                 <w:sz w:val="16"/>
               </w:rPr>
               <w:t>38.78%</w:t>
@@ -1599,7 +1618,7 @@
       <w:tr>
         <w:tc>
           <w:tcPr>
-            <w:tcW w:type="dxa" w:w="2551"/>
+            <w:tcW w:type="dxa" w:w="2438"/>
             <w:shd w:val="clear" w:color="auto" w:fill="FFFFFF"/>
           </w:tcPr>
           <w:p>
@@ -1609,6 +1628,7 @@
             <w:r>
               <w:rPr>
                 <w:rFonts w:ascii="Times New Roman" w:hAnsi="Times New Roman"/>
+                <w:b w:val="0"/>
                 <w:sz w:val="16"/>
               </w:rPr>
               <w:t>Did you attempt suicide?</w:t>
@@ -1627,6 +1647,7 @@
             <w:r>
               <w:rPr>
                 <w:rFonts w:ascii="Times New Roman" w:hAnsi="Times New Roman"/>
+                <w:b w:val="0"/>
                 <w:sz w:val="16"/>
               </w:rPr>
               <w:t>Yes</w:t>
@@ -1635,7 +1656,7 @@
         </w:tc>
         <w:tc>
           <w:tcPr>
-            <w:tcW w:type="dxa" w:w="1020"/>
+            <w:tcW w:type="dxa" w:w="1077"/>
             <w:shd w:val="clear" w:color="auto" w:fill="FFFFFF"/>
           </w:tcPr>
           <w:p>
@@ -1645,6 +1666,7 @@
             <w:r>
               <w:rPr>
                 <w:rFonts w:ascii="Times New Roman" w:hAnsi="Times New Roman"/>
+                <w:b w:val="0"/>
                 <w:sz w:val="16"/>
               </w:rPr>
               <w:t>14.83%</w:t>
@@ -1655,8 +1677,8 @@
       <w:tr>
         <w:tc>
           <w:tcPr>
-            <w:tcW w:type="dxa" w:w="2551"/>
-            <w:shd w:val="clear" w:color="auto" w:fill="EAECF0"/>
+            <w:tcW w:type="dxa" w:w="2438"/>
+            <w:shd w:val="clear" w:color="auto" w:fill="D6E4F7"/>
           </w:tcPr>
           <w:p>
             <w:pPr>
@@ -1665,6 +1687,7 @@
             <w:r>
               <w:rPr>
                 <w:rFonts w:ascii="Times New Roman" w:hAnsi="Times New Roman"/>
+                <w:b w:val="0"/>
                 <w:sz w:val="16"/>
               </w:rPr>
             </w:r>
@@ -1673,7 +1696,7 @@
         <w:tc>
           <w:tcPr>
             <w:tcW w:type="dxa" w:w="1247"/>
-            <w:shd w:val="clear" w:color="auto" w:fill="EAECF0"/>
+            <w:shd w:val="clear" w:color="auto" w:fill="D6E4F7"/>
           </w:tcPr>
           <w:p>
             <w:pPr>
@@ -1682,6 +1705,7 @@
             <w:r>
               <w:rPr>
                 <w:rFonts w:ascii="Times New Roman" w:hAnsi="Times New Roman"/>
+                <w:b w:val="0"/>
                 <w:sz w:val="16"/>
               </w:rPr>
               <w:t>No</w:t>
@@ -1690,8 +1714,8 @@
         </w:tc>
         <w:tc>
           <w:tcPr>
-            <w:tcW w:type="dxa" w:w="1020"/>
-            <w:shd w:val="clear" w:color="auto" w:fill="EAECF0"/>
+            <w:tcW w:type="dxa" w:w="1077"/>
+            <w:shd w:val="clear" w:color="auto" w:fill="D6E4F7"/>
           </w:tcPr>
           <w:p>
             <w:pPr>
@@ -1700,6 +1724,7 @@
             <w:r>
               <w:rPr>
                 <w:rFonts w:ascii="Times New Roman" w:hAnsi="Times New Roman"/>
+                <w:b w:val="0"/>
                 <w:sz w:val="16"/>
               </w:rPr>
               <w:t>85.17%</w:t>
@@ -1710,7 +1735,7 @@
       <w:tr>
         <w:tc>
           <w:tcPr>
-            <w:tcW w:type="dxa" w:w="2551"/>
+            <w:tcW w:type="dxa" w:w="2438"/>
             <w:shd w:val="clear" w:color="auto" w:fill="FFFFFF"/>
           </w:tcPr>
           <w:p>
@@ -1720,6 +1745,7 @@
             <w:r>
               <w:rPr>
                 <w:rFonts w:ascii="Times New Roman" w:hAnsi="Times New Roman"/>
+                <w:b w:val="0"/>
                 <w:sz w:val="16"/>
               </w:rPr>
               <w:t>Do you think suicide is the answer?</w:t>
@@ -1738,6 +1764,7 @@
             <w:r>
               <w:rPr>
                 <w:rFonts w:ascii="Times New Roman" w:hAnsi="Times New Roman"/>
+                <w:b w:val="0"/>
                 <w:sz w:val="16"/>
               </w:rPr>
               <w:t>Yes</w:t>
@@ -1746,7 +1773,7 @@
         </w:tc>
         <w:tc>
           <w:tcPr>
-            <w:tcW w:type="dxa" w:w="1020"/>
+            <w:tcW w:type="dxa" w:w="1077"/>
             <w:shd w:val="clear" w:color="auto" w:fill="FFFFFF"/>
           </w:tcPr>
           <w:p>
@@ -1756,6 +1783,7 @@
             <w:r>
               <w:rPr>
                 <w:rFonts w:ascii="Times New Roman" w:hAnsi="Times New Roman"/>
+                <w:b w:val="0"/>
                 <w:sz w:val="16"/>
               </w:rPr>
               <w:t>12.40%</w:t>
@@ -1766,8 +1794,8 @@
       <w:tr>
         <w:tc>
           <w:tcPr>
-            <w:tcW w:type="dxa" w:w="2551"/>
-            <w:shd w:val="clear" w:color="auto" w:fill="EAECF0"/>
+            <w:tcW w:type="dxa" w:w="2438"/>
+            <w:shd w:val="clear" w:color="auto" w:fill="D6E4F7"/>
           </w:tcPr>
           <w:p>
             <w:pPr>
@@ -1776,6 +1804,7 @@
             <w:r>
               <w:rPr>
                 <w:rFonts w:ascii="Times New Roman" w:hAnsi="Times New Roman"/>
+                <w:b w:val="0"/>
                 <w:sz w:val="16"/>
               </w:rPr>
             </w:r>
@@ -1784,7 +1813,7 @@
         <w:tc>
           <w:tcPr>
             <w:tcW w:type="dxa" w:w="1247"/>
-            <w:shd w:val="clear" w:color="auto" w:fill="EAECF0"/>
+            <w:shd w:val="clear" w:color="auto" w:fill="D6E4F7"/>
           </w:tcPr>
           <w:p>
             <w:pPr>
@@ -1793,6 +1822,7 @@
             <w:r>
               <w:rPr>
                 <w:rFonts w:ascii="Times New Roman" w:hAnsi="Times New Roman"/>
+                <w:b w:val="0"/>
                 <w:sz w:val="16"/>
               </w:rPr>
               <w:t>No</w:t>
@@ -1801,8 +1831,8 @@
         </w:tc>
         <w:tc>
           <w:tcPr>
-            <w:tcW w:type="dxa" w:w="1020"/>
-            <w:shd w:val="clear" w:color="auto" w:fill="EAECF0"/>
+            <w:tcW w:type="dxa" w:w="1077"/>
+            <w:shd w:val="clear" w:color="auto" w:fill="D6E4F7"/>
           </w:tcPr>
           <w:p>
             <w:pPr>
@@ -1811,6 +1841,7 @@
             <w:r>
               <w:rPr>
                 <w:rFonts w:ascii="Times New Roman" w:hAnsi="Times New Roman"/>
+                <w:b w:val="0"/>
                 <w:sz w:val="16"/>
               </w:rPr>
               <w:t>87.60%</w:t>
@@ -1821,7 +1852,7 @@
       <w:tr>
         <w:tc>
           <w:tcPr>
-            <w:tcW w:type="dxa" w:w="2551"/>
+            <w:tcW w:type="dxa" w:w="2438"/>
             <w:shd w:val="clear" w:color="auto" w:fill="FFFFFF"/>
           </w:tcPr>
           <w:p>
@@ -1831,6 +1862,7 @@
             <w:r>
               <w:rPr>
                 <w:rFonts w:ascii="Times New Roman" w:hAnsi="Times New Roman"/>
+                <w:b w:val="0"/>
                 <w:sz w:val="16"/>
               </w:rPr>
               <w:t>Are you content with your family?</w:t>
@@ -1849,6 +1881,7 @@
             <w:r>
               <w:rPr>
                 <w:rFonts w:ascii="Times New Roman" w:hAnsi="Times New Roman"/>
+                <w:b w:val="0"/>
                 <w:sz w:val="16"/>
               </w:rPr>
               <w:t>Yes</w:t>
@@ -1857,7 +1890,7 @@
         </w:tc>
         <w:tc>
           <w:tcPr>
-            <w:tcW w:type="dxa" w:w="1020"/>
+            <w:tcW w:type="dxa" w:w="1077"/>
             <w:shd w:val="clear" w:color="auto" w:fill="FFFFFF"/>
           </w:tcPr>
           <w:p>
@@ -1867,6 +1900,7 @@
             <w:r>
               <w:rPr>
                 <w:rFonts w:ascii="Times New Roman" w:hAnsi="Times New Roman"/>
+                <w:b w:val="0"/>
                 <w:sz w:val="16"/>
               </w:rPr>
               <w:t>87.00%</w:t>
@@ -1877,8 +1911,8 @@
       <w:tr>
         <w:tc>
           <w:tcPr>
-            <w:tcW w:type="dxa" w:w="2551"/>
-            <w:shd w:val="clear" w:color="auto" w:fill="EAECF0"/>
+            <w:tcW w:type="dxa" w:w="2438"/>
+            <w:shd w:val="clear" w:color="auto" w:fill="D6E4F7"/>
           </w:tcPr>
           <w:p>
             <w:pPr>
@@ -1887,6 +1921,7 @@
             <w:r>
               <w:rPr>
                 <w:rFonts w:ascii="Times New Roman" w:hAnsi="Times New Roman"/>
+                <w:b w:val="0"/>
                 <w:sz w:val="16"/>
               </w:rPr>
             </w:r>
@@ -1895,7 +1930,7 @@
         <w:tc>
           <w:tcPr>
             <w:tcW w:type="dxa" w:w="1247"/>
-            <w:shd w:val="clear" w:color="auto" w:fill="EAECF0"/>
+            <w:shd w:val="clear" w:color="auto" w:fill="D6E4F7"/>
           </w:tcPr>
           <w:p>
             <w:pPr>
@@ -1904,6 +1939,7 @@
             <w:r>
               <w:rPr>
                 <w:rFonts w:ascii="Times New Roman" w:hAnsi="Times New Roman"/>
+                <w:b w:val="0"/>
                 <w:sz w:val="16"/>
               </w:rPr>
               <w:t>No</w:t>
@@ -1912,8 +1948,8 @@
         </w:tc>
         <w:tc>
           <w:tcPr>
-            <w:tcW w:type="dxa" w:w="1020"/>
-            <w:shd w:val="clear" w:color="auto" w:fill="EAECF0"/>
+            <w:tcW w:type="dxa" w:w="1077"/>
+            <w:shd w:val="clear" w:color="auto" w:fill="D6E4F7"/>
           </w:tcPr>
           <w:p>
             <w:pPr>
@@ -1922,6 +1958,7 @@
             <w:r>
               <w:rPr>
                 <w:rFonts w:ascii="Times New Roman" w:hAnsi="Times New Roman"/>
+                <w:b w:val="0"/>
                 <w:sz w:val="16"/>
               </w:rPr>
               <w:t>13.00%</w:t>
@@ -1932,7 +1969,7 @@
       <w:tr>
         <w:tc>
           <w:tcPr>
-            <w:tcW w:type="dxa" w:w="2551"/>
+            <w:tcW w:type="dxa" w:w="2438"/>
             <w:shd w:val="clear" w:color="auto" w:fill="FFFFFF"/>
           </w:tcPr>
           <w:p>
@@ -1942,9 +1979,10 @@
             <w:r>
               <w:rPr>
                 <w:rFonts w:ascii="Times New Roman" w:hAnsi="Times New Roman"/>
+                <w:b w:val="0"/>
                 <w:sz w:val="16"/>
               </w:rPr>
-              <w:t>Do you feel like a burden to your family?</w:t>
+              <w:t>Do you feel like a burden to family?</w:t>
             </w:r>
           </w:p>
         </w:tc>
@@ -1960,6 +1998,7 @@
             <w:r>
               <w:rPr>
                 <w:rFonts w:ascii="Times New Roman" w:hAnsi="Times New Roman"/>
+                <w:b w:val="0"/>
                 <w:sz w:val="16"/>
               </w:rPr>
               <w:t>Yes</w:t>
@@ -1968,7 +2007,7 @@
         </w:tc>
         <w:tc>
           <w:tcPr>
-            <w:tcW w:type="dxa" w:w="1020"/>
+            <w:tcW w:type="dxa" w:w="1077"/>
             <w:shd w:val="clear" w:color="auto" w:fill="FFFFFF"/>
           </w:tcPr>
           <w:p>
@@ -1978,6 +2017,7 @@
             <w:r>
               <w:rPr>
                 <w:rFonts w:ascii="Times New Roman" w:hAnsi="Times New Roman"/>
+                <w:b w:val="0"/>
                 <w:sz w:val="16"/>
               </w:rPr>
               <w:t>38.75%</w:t>
@@ -1988,8 +2028,8 @@
       <w:tr>
         <w:tc>
           <w:tcPr>
-            <w:tcW w:type="dxa" w:w="2551"/>
-            <w:shd w:val="clear" w:color="auto" w:fill="EAECF0"/>
+            <w:tcW w:type="dxa" w:w="2438"/>
+            <w:shd w:val="clear" w:color="auto" w:fill="D6E4F7"/>
           </w:tcPr>
           <w:p>
             <w:pPr>
@@ -1998,6 +2038,7 @@
             <w:r>
               <w:rPr>
                 <w:rFonts w:ascii="Times New Roman" w:hAnsi="Times New Roman"/>
+                <w:b w:val="0"/>
                 <w:sz w:val="16"/>
               </w:rPr>
             </w:r>
@@ -2006,7 +2047,7 @@
         <w:tc>
           <w:tcPr>
             <w:tcW w:type="dxa" w:w="1247"/>
-            <w:shd w:val="clear" w:color="auto" w:fill="EAECF0"/>
+            <w:shd w:val="clear" w:color="auto" w:fill="D6E4F7"/>
           </w:tcPr>
           <w:p>
             <w:pPr>
@@ -2015,6 +2056,7 @@
             <w:r>
               <w:rPr>
                 <w:rFonts w:ascii="Times New Roman" w:hAnsi="Times New Roman"/>
+                <w:b w:val="0"/>
                 <w:sz w:val="16"/>
               </w:rPr>
               <w:t>No</w:t>
@@ -2023,8 +2065,8 @@
         </w:tc>
         <w:tc>
           <w:tcPr>
-            <w:tcW w:type="dxa" w:w="1020"/>
-            <w:shd w:val="clear" w:color="auto" w:fill="EAECF0"/>
+            <w:tcW w:type="dxa" w:w="1077"/>
+            <w:shd w:val="clear" w:color="auto" w:fill="D6E4F7"/>
           </w:tcPr>
           <w:p>
             <w:pPr>
@@ -2033,6 +2075,7 @@
             <w:r>
               <w:rPr>
                 <w:rFonts w:ascii="Times New Roman" w:hAnsi="Times New Roman"/>
+                <w:b w:val="0"/>
                 <w:sz w:val="16"/>
               </w:rPr>
               <w:t>61.25%</w:t>
@@ -2043,7 +2086,7 @@
       <w:tr>
         <w:tc>
           <w:tcPr>
-            <w:tcW w:type="dxa" w:w="2551"/>
+            <w:tcW w:type="dxa" w:w="2438"/>
             <w:shd w:val="clear" w:color="auto" w:fill="FFFFFF"/>
           </w:tcPr>
           <w:p>
@@ -2053,6 +2096,7 @@
             <w:r>
               <w:rPr>
                 <w:rFonts w:ascii="Times New Roman" w:hAnsi="Times New Roman"/>
+                <w:b w:val="0"/>
                 <w:sz w:val="16"/>
               </w:rPr>
               <w:t>Where are you more at ease?</w:t>
@@ -2071,6 +2115,7 @@
             <w:r>
               <w:rPr>
                 <w:rFonts w:ascii="Times New Roman" w:hAnsi="Times New Roman"/>
+                <w:b w:val="0"/>
                 <w:sz w:val="16"/>
               </w:rPr>
               <w:t>Family</w:t>
@@ -2079,7 +2124,7 @@
         </w:tc>
         <w:tc>
           <w:tcPr>
-            <w:tcW w:type="dxa" w:w="1020"/>
+            <w:tcW w:type="dxa" w:w="1077"/>
             <w:shd w:val="clear" w:color="auto" w:fill="FFFFFF"/>
           </w:tcPr>
           <w:p>
@@ -2089,6 +2134,7 @@
             <w:r>
               <w:rPr>
                 <w:rFonts w:ascii="Times New Roman" w:hAnsi="Times New Roman"/>
+                <w:b w:val="0"/>
                 <w:sz w:val="16"/>
               </w:rPr>
               <w:t>62.30%</w:t>
@@ -2099,8 +2145,8 @@
       <w:tr>
         <w:tc>
           <w:tcPr>
-            <w:tcW w:type="dxa" w:w="2551"/>
-            <w:shd w:val="clear" w:color="auto" w:fill="EAECF0"/>
+            <w:tcW w:type="dxa" w:w="2438"/>
+            <w:shd w:val="clear" w:color="auto" w:fill="D6E4F7"/>
           </w:tcPr>
           <w:p>
             <w:pPr>
@@ -2109,6 +2155,7 @@
             <w:r>
               <w:rPr>
                 <w:rFonts w:ascii="Times New Roman" w:hAnsi="Times New Roman"/>
+                <w:b w:val="0"/>
                 <w:sz w:val="16"/>
               </w:rPr>
             </w:r>
@@ -2117,7 +2164,7 @@
         <w:tc>
           <w:tcPr>
             <w:tcW w:type="dxa" w:w="1247"/>
-            <w:shd w:val="clear" w:color="auto" w:fill="EAECF0"/>
+            <w:shd w:val="clear" w:color="auto" w:fill="D6E4F7"/>
           </w:tcPr>
           <w:p>
             <w:pPr>
@@ -2126,6 +2173,7 @@
             <w:r>
               <w:rPr>
                 <w:rFonts w:ascii="Times New Roman" w:hAnsi="Times New Roman"/>
+                <w:b w:val="0"/>
                 <w:sz w:val="16"/>
               </w:rPr>
               <w:t>Friends</w:t>
@@ -2134,8 +2182,8 @@
         </w:tc>
         <w:tc>
           <w:tcPr>
-            <w:tcW w:type="dxa" w:w="1020"/>
-            <w:shd w:val="clear" w:color="auto" w:fill="EAECF0"/>
+            <w:tcW w:type="dxa" w:w="1077"/>
+            <w:shd w:val="clear" w:color="auto" w:fill="D6E4F7"/>
           </w:tcPr>
           <w:p>
             <w:pPr>
@@ -2144,6 +2192,7 @@
             <w:r>
               <w:rPr>
                 <w:rFonts w:ascii="Times New Roman" w:hAnsi="Times New Roman"/>
+                <w:b w:val="0"/>
                 <w:sz w:val="16"/>
               </w:rPr>
               <w:t>29.85%</w:t>
@@ -2154,7 +2203,7 @@
       <w:tr>
         <w:tc>
           <w:tcPr>
-            <w:tcW w:type="dxa" w:w="2551"/>
+            <w:tcW w:type="dxa" w:w="2438"/>
             <w:shd w:val="clear" w:color="auto" w:fill="FFFFFF"/>
           </w:tcPr>
           <w:p>
@@ -2164,6 +2213,7 @@
             <w:r>
               <w:rPr>
                 <w:rFonts w:ascii="Times New Roman" w:hAnsi="Times New Roman"/>
+                <w:b w:val="0"/>
                 <w:sz w:val="16"/>
               </w:rPr>
             </w:r>
@@ -2181,6 +2231,7 @@
             <w:r>
               <w:rPr>
                 <w:rFonts w:ascii="Times New Roman" w:hAnsi="Times New Roman"/>
+                <w:b w:val="0"/>
                 <w:sz w:val="16"/>
               </w:rPr>
               <w:t>Others</w:t>
@@ -2189,7 +2240,7 @@
         </w:tc>
         <w:tc>
           <w:tcPr>
-            <w:tcW w:type="dxa" w:w="1020"/>
+            <w:tcW w:type="dxa" w:w="1077"/>
             <w:shd w:val="clear" w:color="auto" w:fill="FFFFFF"/>
           </w:tcPr>
           <w:p>
@@ -2199,6 +2250,7 @@
             <w:r>
               <w:rPr>
                 <w:rFonts w:ascii="Times New Roman" w:hAnsi="Times New Roman"/>
+                <w:b w:val="0"/>
                 <w:sz w:val="16"/>
               </w:rPr>
               <w:t>7.85%</w:t>
@@ -2209,8 +2261,8 @@
       <w:tr>
         <w:tc>
           <w:tcPr>
-            <w:tcW w:type="dxa" w:w="2551"/>
-            <w:shd w:val="clear" w:color="auto" w:fill="EAECF0"/>
+            <w:tcW w:type="dxa" w:w="2438"/>
+            <w:shd w:val="clear" w:color="auto" w:fill="D6E4F7"/>
           </w:tcPr>
           <w:p>
             <w:pPr>
@@ -2219,6 +2271,7 @@
             <w:r>
               <w:rPr>
                 <w:rFonts w:ascii="Times New Roman" w:hAnsi="Times New Roman"/>
+                <w:b w:val="0"/>
                 <w:sz w:val="16"/>
               </w:rPr>
               <w:t>Family Size</w:t>
@@ -2228,7 +2281,7 @@
         <w:tc>
           <w:tcPr>
             <w:tcW w:type="dxa" w:w="1247"/>
-            <w:shd w:val="clear" w:color="auto" w:fill="EAECF0"/>
+            <w:shd w:val="clear" w:color="auto" w:fill="D6E4F7"/>
           </w:tcPr>
           <w:p>
             <w:pPr>
@@ -2237,6 +2290,7 @@
             <w:r>
               <w:rPr>
                 <w:rFonts w:ascii="Times New Roman" w:hAnsi="Times New Roman"/>
+                <w:b w:val="0"/>
                 <w:sz w:val="16"/>
               </w:rPr>
               <w:t>4 Members</w:t>
@@ -2245,8 +2299,8 @@
         </w:tc>
         <w:tc>
           <w:tcPr>
-            <w:tcW w:type="dxa" w:w="1020"/>
-            <w:shd w:val="clear" w:color="auto" w:fill="EAECF0"/>
+            <w:tcW w:type="dxa" w:w="1077"/>
+            <w:shd w:val="clear" w:color="auto" w:fill="D6E4F7"/>
           </w:tcPr>
           <w:p>
             <w:pPr>
@@ -2255,6 +2309,7 @@
             <w:r>
               <w:rPr>
                 <w:rFonts w:ascii="Times New Roman" w:hAnsi="Times New Roman"/>
+                <w:b w:val="0"/>
                 <w:sz w:val="16"/>
               </w:rPr>
               <w:t>36.72%</w:t>
@@ -2265,7 +2320,7 @@
       <w:tr>
         <w:tc>
           <w:tcPr>
-            <w:tcW w:type="dxa" w:w="2551"/>
+            <w:tcW w:type="dxa" w:w="2438"/>
             <w:shd w:val="clear" w:color="auto" w:fill="FFFFFF"/>
           </w:tcPr>
           <w:p>
@@ -2275,6 +2330,7 @@
             <w:r>
               <w:rPr>
                 <w:rFonts w:ascii="Times New Roman" w:hAnsi="Times New Roman"/>
+                <w:b w:val="0"/>
                 <w:sz w:val="16"/>
               </w:rPr>
             </w:r>
@@ -2292,6 +2348,7 @@
             <w:r>
               <w:rPr>
                 <w:rFonts w:ascii="Times New Roman" w:hAnsi="Times New Roman"/>
+                <w:b w:val="0"/>
                 <w:sz w:val="16"/>
               </w:rPr>
               <w:t>5 Members</w:t>
@@ -2300,7 +2357,7 @@
         </w:tc>
         <w:tc>
           <w:tcPr>
-            <w:tcW w:type="dxa" w:w="1020"/>
+            <w:tcW w:type="dxa" w:w="1077"/>
             <w:shd w:val="clear" w:color="auto" w:fill="FFFFFF"/>
           </w:tcPr>
           <w:p>
@@ -2310,6 +2367,7 @@
             <w:r>
               <w:rPr>
                 <w:rFonts w:ascii="Times New Roman" w:hAnsi="Times New Roman"/>
+                <w:b w:val="0"/>
                 <w:sz w:val="16"/>
               </w:rPr>
               <w:t>20.60%</w:t>
@@ -2320,8 +2378,8 @@
       <w:tr>
         <w:tc>
           <w:tcPr>
-            <w:tcW w:type="dxa" w:w="2551"/>
-            <w:shd w:val="clear" w:color="auto" w:fill="EAECF0"/>
+            <w:tcW w:type="dxa" w:w="2438"/>
+            <w:shd w:val="clear" w:color="auto" w:fill="D6E4F7"/>
           </w:tcPr>
           <w:p>
             <w:pPr>
@@ -2330,6 +2388,7 @@
             <w:r>
               <w:rPr>
                 <w:rFonts w:ascii="Times New Roman" w:hAnsi="Times New Roman"/>
+                <w:b w:val="0"/>
                 <w:sz w:val="16"/>
               </w:rPr>
             </w:r>
@@ -2338,7 +2397,7 @@
         <w:tc>
           <w:tcPr>
             <w:tcW w:type="dxa" w:w="1247"/>
-            <w:shd w:val="clear" w:color="auto" w:fill="EAECF0"/>
+            <w:shd w:val="clear" w:color="auto" w:fill="D6E4F7"/>
           </w:tcPr>
           <w:p>
             <w:pPr>
@@ -2347,6 +2406,7 @@
             <w:r>
               <w:rPr>
                 <w:rFonts w:ascii="Times New Roman" w:hAnsi="Times New Roman"/>
+                <w:b w:val="0"/>
                 <w:sz w:val="16"/>
               </w:rPr>
               <w:t>6 Members</w:t>
@@ -2355,8 +2415,8 @@
         </w:tc>
         <w:tc>
           <w:tcPr>
-            <w:tcW w:type="dxa" w:w="1020"/>
-            <w:shd w:val="clear" w:color="auto" w:fill="EAECF0"/>
+            <w:tcW w:type="dxa" w:w="1077"/>
+            <w:shd w:val="clear" w:color="auto" w:fill="D6E4F7"/>
           </w:tcPr>
           <w:p>
             <w:pPr>
@@ -2365,6 +2425,7 @@
             <w:r>
               <w:rPr>
                 <w:rFonts w:ascii="Times New Roman" w:hAnsi="Times New Roman"/>
+                <w:b w:val="0"/>
                 <w:sz w:val="16"/>
               </w:rPr>
               <w:t>21.76%</w:t>
@@ -2375,7 +2436,7 @@
       <w:tr>
         <w:tc>
           <w:tcPr>
-            <w:tcW w:type="dxa" w:w="2551"/>
+            <w:tcW w:type="dxa" w:w="2438"/>
             <w:shd w:val="clear" w:color="auto" w:fill="FFFFFF"/>
           </w:tcPr>
           <w:p>
@@ -2385,6 +2446,7 @@
             <w:r>
               <w:rPr>
                 <w:rFonts w:ascii="Times New Roman" w:hAnsi="Times New Roman"/>
+                <w:b w:val="0"/>
                 <w:sz w:val="16"/>
               </w:rPr>
             </w:r>
@@ -2402,6 +2464,7 @@
             <w:r>
               <w:rPr>
                 <w:rFonts w:ascii="Times New Roman" w:hAnsi="Times New Roman"/>
+                <w:b w:val="0"/>
                 <w:sz w:val="16"/>
               </w:rPr>
               <w:t>Other</w:t>
@@ -2410,7 +2473,7 @@
         </w:tc>
         <w:tc>
           <w:tcPr>
-            <w:tcW w:type="dxa" w:w="1020"/>
+            <w:tcW w:type="dxa" w:w="1077"/>
             <w:shd w:val="clear" w:color="auto" w:fill="FFFFFF"/>
           </w:tcPr>
           <w:p>
@@ -2420,6 +2483,7 @@
             <w:r>
               <w:rPr>
                 <w:rFonts w:ascii="Times New Roman" w:hAnsi="Times New Roman"/>
+                <w:b w:val="0"/>
                 <w:sz w:val="16"/>
               </w:rPr>
               <w:t>20.92%</w:t>
@@ -2430,8 +2494,8 @@
       <w:tr>
         <w:tc>
           <w:tcPr>
-            <w:tcW w:type="dxa" w:w="2551"/>
-            <w:shd w:val="clear" w:color="auto" w:fill="EAECF0"/>
+            <w:tcW w:type="dxa" w:w="2438"/>
+            <w:shd w:val="clear" w:color="auto" w:fill="D6E4F7"/>
           </w:tcPr>
           <w:p>
             <w:pPr>
@@ -2440,6 +2504,7 @@
             <w:r>
               <w:rPr>
                 <w:rFonts w:ascii="Times New Roman" w:hAnsi="Times New Roman"/>
+                <w:b w:val="0"/>
                 <w:sz w:val="16"/>
               </w:rPr>
               <w:t>Do you engage in extracurricular activities?</w:t>
@@ -2449,7 +2514,7 @@
         <w:tc>
           <w:tcPr>
             <w:tcW w:type="dxa" w:w="1247"/>
-            <w:shd w:val="clear" w:color="auto" w:fill="EAECF0"/>
+            <w:shd w:val="clear" w:color="auto" w:fill="D6E4F7"/>
           </w:tcPr>
           <w:p>
             <w:pPr>
@@ -2458,6 +2523,7 @@
             <w:r>
               <w:rPr>
                 <w:rFonts w:ascii="Times New Roman" w:hAnsi="Times New Roman"/>
+                <w:b w:val="0"/>
                 <w:sz w:val="16"/>
               </w:rPr>
               <w:t>Yes</w:t>
@@ -2466,8 +2532,8 @@
         </w:tc>
         <w:tc>
           <w:tcPr>
-            <w:tcW w:type="dxa" w:w="1020"/>
-            <w:shd w:val="clear" w:color="auto" w:fill="EAECF0"/>
+            <w:tcW w:type="dxa" w:w="1077"/>
+            <w:shd w:val="clear" w:color="auto" w:fill="D6E4F7"/>
           </w:tcPr>
           <w:p>
             <w:pPr>
@@ -2476,6 +2542,7 @@
             <w:r>
               <w:rPr>
                 <w:rFonts w:ascii="Times New Roman" w:hAnsi="Times New Roman"/>
+                <w:b w:val="0"/>
                 <w:sz w:val="16"/>
               </w:rPr>
               <w:t>67.52%</w:t>
@@ -2486,7 +2553,7 @@
       <w:tr>
         <w:tc>
           <w:tcPr>
-            <w:tcW w:type="dxa" w:w="2551"/>
+            <w:tcW w:type="dxa" w:w="2438"/>
             <w:shd w:val="clear" w:color="auto" w:fill="FFFFFF"/>
           </w:tcPr>
           <w:p>
@@ -2496,6 +2563,7 @@
             <w:r>
               <w:rPr>
                 <w:rFonts w:ascii="Times New Roman" w:hAnsi="Times New Roman"/>
+                <w:b w:val="0"/>
                 <w:sz w:val="16"/>
               </w:rPr>
             </w:r>
@@ -2513,6 +2581,7 @@
             <w:r>
               <w:rPr>
                 <w:rFonts w:ascii="Times New Roman" w:hAnsi="Times New Roman"/>
+                <w:b w:val="0"/>
                 <w:sz w:val="16"/>
               </w:rPr>
               <w:t>No</w:t>
@@ -2521,7 +2590,7 @@
         </w:tc>
         <w:tc>
           <w:tcPr>
-            <w:tcW w:type="dxa" w:w="1020"/>
+            <w:tcW w:type="dxa" w:w="1077"/>
             <w:shd w:val="clear" w:color="auto" w:fill="FFFFFF"/>
           </w:tcPr>
           <w:p>
@@ -2531,6 +2600,7 @@
             <w:r>
               <w:rPr>
                 <w:rFonts w:ascii="Times New Roman" w:hAnsi="Times New Roman"/>
+                <w:b w:val="0"/>
                 <w:sz w:val="16"/>
               </w:rPr>
               <w:t>32.48%</w:t>
@@ -2541,8 +2611,8 @@
       <w:tr>
         <w:tc>
           <w:tcPr>
-            <w:tcW w:type="dxa" w:w="2551"/>
-            <w:shd w:val="clear" w:color="auto" w:fill="EAECF0"/>
+            <w:tcW w:type="dxa" w:w="2438"/>
+            <w:shd w:val="clear" w:color="auto" w:fill="D6E4F7"/>
           </w:tcPr>
           <w:p>
             <w:pPr>
@@ -2551,16 +2621,17 @@
             <w:r>
               <w:rPr>
                 <w:rFonts w:ascii="Times New Roman" w:hAnsi="Times New Roman"/>
+                <w:b w:val="0"/>
                 <w:sz w:val="16"/>
               </w:rPr>
-              <w:t>Do you find your education system challenging?</w:t>
+              <w:t>Do you find education system challenging?</w:t>
             </w:r>
           </w:p>
         </w:tc>
         <w:tc>
           <w:tcPr>
             <w:tcW w:type="dxa" w:w="1247"/>
-            <w:shd w:val="clear" w:color="auto" w:fill="EAECF0"/>
+            <w:shd w:val="clear" w:color="auto" w:fill="D6E4F7"/>
           </w:tcPr>
           <w:p>
             <w:pPr>
@@ -2569,6 +2640,7 @@
             <w:r>
               <w:rPr>
                 <w:rFonts w:ascii="Times New Roman" w:hAnsi="Times New Roman"/>
+                <w:b w:val="0"/>
                 <w:sz w:val="16"/>
               </w:rPr>
               <w:t>Yes</w:t>
@@ -2577,8 +2649,8 @@
         </w:tc>
         <w:tc>
           <w:tcPr>
-            <w:tcW w:type="dxa" w:w="1020"/>
-            <w:shd w:val="clear" w:color="auto" w:fill="EAECF0"/>
+            <w:tcW w:type="dxa" w:w="1077"/>
+            <w:shd w:val="clear" w:color="auto" w:fill="D6E4F7"/>
           </w:tcPr>
           <w:p>
             <w:pPr>
@@ -2587,6 +2659,7 @@
             <w:r>
               <w:rPr>
                 <w:rFonts w:ascii="Times New Roman" w:hAnsi="Times New Roman"/>
+                <w:b w:val="0"/>
                 <w:sz w:val="16"/>
               </w:rPr>
               <w:t>67.30%</w:t>
@@ -2597,7 +2670,7 @@
       <w:tr>
         <w:tc>
           <w:tcPr>
-            <w:tcW w:type="dxa" w:w="2551"/>
+            <w:tcW w:type="dxa" w:w="2438"/>
             <w:shd w:val="clear" w:color="auto" w:fill="FFFFFF"/>
           </w:tcPr>
           <w:p>
@@ -2607,6 +2680,7 @@
             <w:r>
               <w:rPr>
                 <w:rFonts w:ascii="Times New Roman" w:hAnsi="Times New Roman"/>
+                <w:b w:val="0"/>
                 <w:sz w:val="16"/>
               </w:rPr>
             </w:r>
@@ -2624,6 +2698,7 @@
             <w:r>
               <w:rPr>
                 <w:rFonts w:ascii="Times New Roman" w:hAnsi="Times New Roman"/>
+                <w:b w:val="0"/>
                 <w:sz w:val="16"/>
               </w:rPr>
               <w:t>No</w:t>
@@ -2632,7 +2707,7 @@
         </w:tc>
         <w:tc>
           <w:tcPr>
-            <w:tcW w:type="dxa" w:w="1020"/>
+            <w:tcW w:type="dxa" w:w="1077"/>
             <w:shd w:val="clear" w:color="auto" w:fill="FFFFFF"/>
           </w:tcPr>
           <w:p>
@@ -2642,6 +2717,7 @@
             <w:r>
               <w:rPr>
                 <w:rFonts w:ascii="Times New Roman" w:hAnsi="Times New Roman"/>
+                <w:b w:val="0"/>
                 <w:sz w:val="16"/>
               </w:rPr>
               <w:t>32.70%</w:t>
@@ -2652,8 +2728,8 @@
       <w:tr>
         <w:tc>
           <w:tcPr>
-            <w:tcW w:type="dxa" w:w="2551"/>
-            <w:shd w:val="clear" w:color="auto" w:fill="EAECF0"/>
+            <w:tcW w:type="dxa" w:w="2438"/>
+            <w:shd w:val="clear" w:color="auto" w:fill="D6E4F7"/>
           </w:tcPr>
           <w:p>
             <w:pPr>
@@ -2662,6 +2738,7 @@
             <w:r>
               <w:rPr>
                 <w:rFonts w:ascii="Times New Roman" w:hAnsi="Times New Roman"/>
+                <w:b w:val="0"/>
                 <w:sz w:val="16"/>
               </w:rPr>
               <w:t>Daily Sleep Duration</w:t>
@@ -2671,7 +2748,7 @@
         <w:tc>
           <w:tcPr>
             <w:tcW w:type="dxa" w:w="1247"/>
-            <w:shd w:val="clear" w:color="auto" w:fill="EAECF0"/>
+            <w:shd w:val="clear" w:color="auto" w:fill="D6E4F7"/>
           </w:tcPr>
           <w:p>
             <w:pPr>
@@ -2680,6 +2757,7 @@
             <w:r>
               <w:rPr>
                 <w:rFonts w:ascii="Times New Roman" w:hAnsi="Times New Roman"/>
+                <w:b w:val="0"/>
                 <w:sz w:val="16"/>
               </w:rPr>
               <w:t>6 Hours</w:t>
@@ -2688,8 +2766,8 @@
         </w:tc>
         <w:tc>
           <w:tcPr>
-            <w:tcW w:type="dxa" w:w="1020"/>
-            <w:shd w:val="clear" w:color="auto" w:fill="EAECF0"/>
+            <w:tcW w:type="dxa" w:w="1077"/>
+            <w:shd w:val="clear" w:color="auto" w:fill="D6E4F7"/>
           </w:tcPr>
           <w:p>
             <w:pPr>
@@ -2698,6 +2776,7 @@
             <w:r>
               <w:rPr>
                 <w:rFonts w:ascii="Times New Roman" w:hAnsi="Times New Roman"/>
+                <w:b w:val="0"/>
                 <w:sz w:val="16"/>
               </w:rPr>
               <w:t>18.92%</w:t>
@@ -2708,7 +2787,7 @@
       <w:tr>
         <w:tc>
           <w:tcPr>
-            <w:tcW w:type="dxa" w:w="2551"/>
+            <w:tcW w:type="dxa" w:w="2438"/>
             <w:shd w:val="clear" w:color="auto" w:fill="FFFFFF"/>
           </w:tcPr>
           <w:p>
@@ -2718,6 +2797,7 @@
             <w:r>
               <w:rPr>
                 <w:rFonts w:ascii="Times New Roman" w:hAnsi="Times New Roman"/>
+                <w:b w:val="0"/>
                 <w:sz w:val="16"/>
               </w:rPr>
             </w:r>
@@ -2735,6 +2815,7 @@
             <w:r>
               <w:rPr>
                 <w:rFonts w:ascii="Times New Roman" w:hAnsi="Times New Roman"/>
+                <w:b w:val="0"/>
                 <w:sz w:val="16"/>
               </w:rPr>
               <w:t>7 Hours</w:t>
@@ -2743,7 +2824,7 @@
         </w:tc>
         <w:tc>
           <w:tcPr>
-            <w:tcW w:type="dxa" w:w="1020"/>
+            <w:tcW w:type="dxa" w:w="1077"/>
             <w:shd w:val="clear" w:color="auto" w:fill="FFFFFF"/>
           </w:tcPr>
           <w:p>
@@ -2753,6 +2834,7 @@
             <w:r>
               <w:rPr>
                 <w:rFonts w:ascii="Times New Roman" w:hAnsi="Times New Roman"/>
+                <w:b w:val="0"/>
                 <w:sz w:val="16"/>
               </w:rPr>
               <w:t>27.80%</w:t>
@@ -2763,8 +2845,8 @@
       <w:tr>
         <w:tc>
           <w:tcPr>
-            <w:tcW w:type="dxa" w:w="2551"/>
-            <w:shd w:val="clear" w:color="auto" w:fill="EAECF0"/>
+            <w:tcW w:type="dxa" w:w="2438"/>
+            <w:shd w:val="clear" w:color="auto" w:fill="D6E4F7"/>
           </w:tcPr>
           <w:p>
             <w:pPr>
@@ -2773,6 +2855,7 @@
             <w:r>
               <w:rPr>
                 <w:rFonts w:ascii="Times New Roman" w:hAnsi="Times New Roman"/>
+                <w:b w:val="0"/>
                 <w:sz w:val="16"/>
               </w:rPr>
             </w:r>
@@ -2781,7 +2864,7 @@
         <w:tc>
           <w:tcPr>
             <w:tcW w:type="dxa" w:w="1247"/>
-            <w:shd w:val="clear" w:color="auto" w:fill="EAECF0"/>
+            <w:shd w:val="clear" w:color="auto" w:fill="D6E4F7"/>
           </w:tcPr>
           <w:p>
             <w:pPr>
@@ -2790,6 +2873,7 @@
             <w:r>
               <w:rPr>
                 <w:rFonts w:ascii="Times New Roman" w:hAnsi="Times New Roman"/>
+                <w:b w:val="0"/>
                 <w:sz w:val="16"/>
               </w:rPr>
               <w:t>8 Hours</w:t>
@@ -2798,8 +2882,8 @@
         </w:tc>
         <w:tc>
           <w:tcPr>
-            <w:tcW w:type="dxa" w:w="1020"/>
-            <w:shd w:val="clear" w:color="auto" w:fill="EAECF0"/>
+            <w:tcW w:type="dxa" w:w="1077"/>
+            <w:shd w:val="clear" w:color="auto" w:fill="D6E4F7"/>
           </w:tcPr>
           <w:p>
             <w:pPr>
@@ -2808,6 +2892,7 @@
             <w:r>
               <w:rPr>
                 <w:rFonts w:ascii="Times New Roman" w:hAnsi="Times New Roman"/>
+                <w:b w:val="0"/>
                 <w:sz w:val="16"/>
               </w:rPr>
               <w:t>25.90%</w:t>
@@ -2818,7 +2903,7 @@
       <w:tr>
         <w:tc>
           <w:tcPr>
-            <w:tcW w:type="dxa" w:w="2551"/>
+            <w:tcW w:type="dxa" w:w="2438"/>
             <w:shd w:val="clear" w:color="auto" w:fill="FFFFFF"/>
           </w:tcPr>
           <w:p>
@@ -2828,6 +2913,7 @@
             <w:r>
               <w:rPr>
                 <w:rFonts w:ascii="Times New Roman" w:hAnsi="Times New Roman"/>
+                <w:b w:val="0"/>
                 <w:sz w:val="16"/>
               </w:rPr>
             </w:r>
@@ -2845,6 +2931,7 @@
             <w:r>
               <w:rPr>
                 <w:rFonts w:ascii="Times New Roman" w:hAnsi="Times New Roman"/>
+                <w:b w:val="0"/>
                 <w:sz w:val="16"/>
               </w:rPr>
               <w:t>Other</w:t>
@@ -2853,7 +2940,7 @@
         </w:tc>
         <w:tc>
           <w:tcPr>
-            <w:tcW w:type="dxa" w:w="1020"/>
+            <w:tcW w:type="dxa" w:w="1077"/>
             <w:shd w:val="clear" w:color="auto" w:fill="FFFFFF"/>
           </w:tcPr>
           <w:p>
@@ -2863,6 +2950,7 @@
             <w:r>
               <w:rPr>
                 <w:rFonts w:ascii="Times New Roman" w:hAnsi="Times New Roman"/>
+                <w:b w:val="0"/>
                 <w:sz w:val="16"/>
               </w:rPr>
               <w:t>27.38%</w:t>
@@ -2873,8 +2961,8 @@
       <w:tr>
         <w:tc>
           <w:tcPr>
-            <w:tcW w:type="dxa" w:w="2551"/>
-            <w:shd w:val="clear" w:color="auto" w:fill="EAECF0"/>
+            <w:tcW w:type="dxa" w:w="2438"/>
+            <w:shd w:val="clear" w:color="auto" w:fill="D6E4F7"/>
           </w:tcPr>
           <w:p>
             <w:pPr>
@@ -2883,6 +2971,7 @@
             <w:r>
               <w:rPr>
                 <w:rFonts w:ascii="Times New Roman" w:hAnsi="Times New Roman"/>
+                <w:b w:val="0"/>
                 <w:sz w:val="16"/>
               </w:rPr>
               <w:t>SSC Result</w:t>
@@ -2892,7 +2981,7 @@
         <w:tc>
           <w:tcPr>
             <w:tcW w:type="dxa" w:w="1247"/>
-            <w:shd w:val="clear" w:color="auto" w:fill="EAECF0"/>
+            <w:shd w:val="clear" w:color="auto" w:fill="D6E4F7"/>
           </w:tcPr>
           <w:p>
             <w:pPr>
@@ -2901,6 +2990,7 @@
             <w:r>
               <w:rPr>
                 <w:rFonts w:ascii="Times New Roman" w:hAnsi="Times New Roman"/>
+                <w:b w:val="0"/>
                 <w:sz w:val="16"/>
               </w:rPr>
               <w:t>5.00</w:t>
@@ -2909,8 +2999,8 @@
         </w:tc>
         <w:tc>
           <w:tcPr>
-            <w:tcW w:type="dxa" w:w="1020"/>
-            <w:shd w:val="clear" w:color="auto" w:fill="EAECF0"/>
+            <w:tcW w:type="dxa" w:w="1077"/>
+            <w:shd w:val="clear" w:color="auto" w:fill="D6E4F7"/>
           </w:tcPr>
           <w:p>
             <w:pPr>
@@ -2919,6 +3009,7 @@
             <w:r>
               <w:rPr>
                 <w:rFonts w:ascii="Times New Roman" w:hAnsi="Times New Roman"/>
+                <w:b w:val="0"/>
                 <w:sz w:val="16"/>
               </w:rPr>
               <w:t>46.55%</w:t>
@@ -2929,7 +3020,7 @@
       <w:tr>
         <w:tc>
           <w:tcPr>
-            <w:tcW w:type="dxa" w:w="2551"/>
+            <w:tcW w:type="dxa" w:w="2438"/>
             <w:shd w:val="clear" w:color="auto" w:fill="FFFFFF"/>
           </w:tcPr>
           <w:p>
@@ -2939,6 +3030,7 @@
             <w:r>
               <w:rPr>
                 <w:rFonts w:ascii="Times New Roman" w:hAnsi="Times New Roman"/>
+                <w:b w:val="0"/>
                 <w:sz w:val="16"/>
               </w:rPr>
             </w:r>
@@ -2956,6 +3048,7 @@
             <w:r>
               <w:rPr>
                 <w:rFonts w:ascii="Times New Roman" w:hAnsi="Times New Roman"/>
+                <w:b w:val="0"/>
                 <w:sz w:val="16"/>
               </w:rPr>
               <w:t>4.50</w:t>
@@ -2964,7 +3057,7 @@
         </w:tc>
         <w:tc>
           <w:tcPr>
-            <w:tcW w:type="dxa" w:w="1020"/>
+            <w:tcW w:type="dxa" w:w="1077"/>
             <w:shd w:val="clear" w:color="auto" w:fill="FFFFFF"/>
           </w:tcPr>
           <w:p>
@@ -2974,6 +3067,7 @@
             <w:r>
               <w:rPr>
                 <w:rFonts w:ascii="Times New Roman" w:hAnsi="Times New Roman"/>
+                <w:b w:val="0"/>
                 <w:sz w:val="16"/>
               </w:rPr>
               <w:t>7.40%</w:t>
@@ -2984,8 +3078,8 @@
       <w:tr>
         <w:tc>
           <w:tcPr>
-            <w:tcW w:type="dxa" w:w="2551"/>
-            <w:shd w:val="clear" w:color="auto" w:fill="EAECF0"/>
+            <w:tcW w:type="dxa" w:w="2438"/>
+            <w:shd w:val="clear" w:color="auto" w:fill="D6E4F7"/>
           </w:tcPr>
           <w:p>
             <w:pPr>
@@ -2994,6 +3088,7 @@
             <w:r>
               <w:rPr>
                 <w:rFonts w:ascii="Times New Roman" w:hAnsi="Times New Roman"/>
+                <w:b w:val="0"/>
                 <w:sz w:val="16"/>
               </w:rPr>
             </w:r>
@@ -3002,7 +3097,7 @@
         <w:tc>
           <w:tcPr>
             <w:tcW w:type="dxa" w:w="1247"/>
-            <w:shd w:val="clear" w:color="auto" w:fill="EAECF0"/>
+            <w:shd w:val="clear" w:color="auto" w:fill="D6E4F7"/>
           </w:tcPr>
           <w:p>
             <w:pPr>
@@ -3011,6 +3106,7 @@
             <w:r>
               <w:rPr>
                 <w:rFonts w:ascii="Times New Roman" w:hAnsi="Times New Roman"/>
+                <w:b w:val="0"/>
                 <w:sz w:val="16"/>
               </w:rPr>
               <w:t>4.00</w:t>
@@ -3019,8 +3115,8 @@
         </w:tc>
         <w:tc>
           <w:tcPr>
-            <w:tcW w:type="dxa" w:w="1020"/>
-            <w:shd w:val="clear" w:color="auto" w:fill="EAECF0"/>
+            <w:tcW w:type="dxa" w:w="1077"/>
+            <w:shd w:val="clear" w:color="auto" w:fill="D6E4F7"/>
           </w:tcPr>
           <w:p>
             <w:pPr>
@@ -3029,6 +3125,7 @@
             <w:r>
               <w:rPr>
                 <w:rFonts w:ascii="Times New Roman" w:hAnsi="Times New Roman"/>
+                <w:b w:val="0"/>
                 <w:sz w:val="16"/>
               </w:rPr>
               <w:t>5.00%</w:t>
@@ -3039,7 +3136,7 @@
       <w:tr>
         <w:tc>
           <w:tcPr>
-            <w:tcW w:type="dxa" w:w="2551"/>
+            <w:tcW w:type="dxa" w:w="2438"/>
             <w:shd w:val="clear" w:color="auto" w:fill="FFFFFF"/>
           </w:tcPr>
           <w:p>
@@ -3049,6 +3146,7 @@
             <w:r>
               <w:rPr>
                 <w:rFonts w:ascii="Times New Roman" w:hAnsi="Times New Roman"/>
+                <w:b w:val="0"/>
                 <w:sz w:val="16"/>
               </w:rPr>
             </w:r>
@@ -3066,6 +3164,7 @@
             <w:r>
               <w:rPr>
                 <w:rFonts w:ascii="Times New Roman" w:hAnsi="Times New Roman"/>
+                <w:b w:val="0"/>
                 <w:sz w:val="16"/>
               </w:rPr>
               <w:t>Other</w:t>
@@ -3074,7 +3173,7 @@
         </w:tc>
         <w:tc>
           <w:tcPr>
-            <w:tcW w:type="dxa" w:w="1020"/>
+            <w:tcW w:type="dxa" w:w="1077"/>
             <w:shd w:val="clear" w:color="auto" w:fill="FFFFFF"/>
           </w:tcPr>
           <w:p>
@@ -3084,6 +3183,7 @@
             <w:r>
               <w:rPr>
                 <w:rFonts w:ascii="Times New Roman" w:hAnsi="Times New Roman"/>
+                <w:b w:val="0"/>
                 <w:sz w:val="16"/>
               </w:rPr>
               <w:t>41.05%</w:t>
@@ -3094,8 +3194,8 @@
       <w:tr>
         <w:tc>
           <w:tcPr>
-            <w:tcW w:type="dxa" w:w="2551"/>
-            <w:shd w:val="clear" w:color="auto" w:fill="EAECF0"/>
+            <w:tcW w:type="dxa" w:w="2438"/>
+            <w:shd w:val="clear" w:color="auto" w:fill="D6E4F7"/>
           </w:tcPr>
           <w:p>
             <w:pPr>
@@ -3104,6 +3204,7 @@
             <w:r>
               <w:rPr>
                 <w:rFonts w:ascii="Times New Roman" w:hAnsi="Times New Roman"/>
+                <w:b w:val="0"/>
                 <w:sz w:val="16"/>
               </w:rPr>
               <w:t>HSC Result</w:t>
@@ -3113,7 +3214,7 @@
         <w:tc>
           <w:tcPr>
             <w:tcW w:type="dxa" w:w="1247"/>
-            <w:shd w:val="clear" w:color="auto" w:fill="EAECF0"/>
+            <w:shd w:val="clear" w:color="auto" w:fill="D6E4F7"/>
           </w:tcPr>
           <w:p>
             <w:pPr>
@@ -3122,6 +3223,7 @@
             <w:r>
               <w:rPr>
                 <w:rFonts w:ascii="Times New Roman" w:hAnsi="Times New Roman"/>
+                <w:b w:val="0"/>
                 <w:sz w:val="16"/>
               </w:rPr>
               <w:t>5.00</w:t>
@@ -3130,8 +3232,8 @@
         </w:tc>
         <w:tc>
           <w:tcPr>
-            <w:tcW w:type="dxa" w:w="1020"/>
-            <w:shd w:val="clear" w:color="auto" w:fill="EAECF0"/>
+            <w:tcW w:type="dxa" w:w="1077"/>
+            <w:shd w:val="clear" w:color="auto" w:fill="D6E4F7"/>
           </w:tcPr>
           <w:p>
             <w:pPr>
@@ -3140,6 +3242,7 @@
             <w:r>
               <w:rPr>
                 <w:rFonts w:ascii="Times New Roman" w:hAnsi="Times New Roman"/>
+                <w:b w:val="0"/>
                 <w:sz w:val="16"/>
               </w:rPr>
               <w:t>21.51%</w:t>
@@ -3150,7 +3253,7 @@
       <w:tr>
         <w:tc>
           <w:tcPr>
-            <w:tcW w:type="dxa" w:w="2551"/>
+            <w:tcW w:type="dxa" w:w="2438"/>
             <w:shd w:val="clear" w:color="auto" w:fill="FFFFFF"/>
           </w:tcPr>
           <w:p>
@@ -3160,6 +3263,7 @@
             <w:r>
               <w:rPr>
                 <w:rFonts w:ascii="Times New Roman" w:hAnsi="Times New Roman"/>
+                <w:b w:val="0"/>
                 <w:sz w:val="16"/>
               </w:rPr>
             </w:r>
@@ -3177,6 +3281,7 @@
             <w:r>
               <w:rPr>
                 <w:rFonts w:ascii="Times New Roman" w:hAnsi="Times New Roman"/>
+                <w:b w:val="0"/>
                 <w:sz w:val="16"/>
               </w:rPr>
               <w:t>4.50</w:t>
@@ -3185,7 +3290,7 @@
         </w:tc>
         <w:tc>
           <w:tcPr>
-            <w:tcW w:type="dxa" w:w="1020"/>
+            <w:tcW w:type="dxa" w:w="1077"/>
             <w:shd w:val="clear" w:color="auto" w:fill="FFFFFF"/>
           </w:tcPr>
           <w:p>
@@ -3195,6 +3300,7 @@
             <w:r>
               <w:rPr>
                 <w:rFonts w:ascii="Times New Roman" w:hAnsi="Times New Roman"/>
+                <w:b w:val="0"/>
                 <w:sz w:val="16"/>
               </w:rPr>
               <w:t>8.52%</w:t>
@@ -3205,8 +3311,8 @@
       <w:tr>
         <w:tc>
           <w:tcPr>
-            <w:tcW w:type="dxa" w:w="2551"/>
-            <w:shd w:val="clear" w:color="auto" w:fill="EAECF0"/>
+            <w:tcW w:type="dxa" w:w="2438"/>
+            <w:shd w:val="clear" w:color="auto" w:fill="D6E4F7"/>
           </w:tcPr>
           <w:p>
             <w:pPr>
@@ -3215,6 +3321,7 @@
             <w:r>
               <w:rPr>
                 <w:rFonts w:ascii="Times New Roman" w:hAnsi="Times New Roman"/>
+                <w:b w:val="0"/>
                 <w:sz w:val="16"/>
               </w:rPr>
             </w:r>
@@ -3223,7 +3330,7 @@
         <w:tc>
           <w:tcPr>
             <w:tcW w:type="dxa" w:w="1247"/>
-            <w:shd w:val="clear" w:color="auto" w:fill="EAECF0"/>
+            <w:shd w:val="clear" w:color="auto" w:fill="D6E4F7"/>
           </w:tcPr>
           <w:p>
             <w:pPr>
@@ -3232,6 +3339,7 @@
             <w:r>
               <w:rPr>
                 <w:rFonts w:ascii="Times New Roman" w:hAnsi="Times New Roman"/>
+                <w:b w:val="0"/>
                 <w:sz w:val="16"/>
               </w:rPr>
               <w:t>4.00</w:t>
@@ -3240,8 +3348,8 @@
         </w:tc>
         <w:tc>
           <w:tcPr>
-            <w:tcW w:type="dxa" w:w="1020"/>
-            <w:shd w:val="clear" w:color="auto" w:fill="EAECF0"/>
+            <w:tcW w:type="dxa" w:w="1077"/>
+            <w:shd w:val="clear" w:color="auto" w:fill="D6E4F7"/>
           </w:tcPr>
           <w:p>
             <w:pPr>
@@ -3250,6 +3358,7 @@
             <w:r>
               <w:rPr>
                 <w:rFonts w:ascii="Times New Roman" w:hAnsi="Times New Roman"/>
+                <w:b w:val="0"/>
                 <w:sz w:val="16"/>
               </w:rPr>
               <w:t>12.42%</w:t>
@@ -3260,7 +3369,7 @@
       <w:tr>
         <w:tc>
           <w:tcPr>
-            <w:tcW w:type="dxa" w:w="2551"/>
+            <w:tcW w:type="dxa" w:w="2438"/>
             <w:shd w:val="clear" w:color="auto" w:fill="FFFFFF"/>
           </w:tcPr>
           <w:p>
@@ -3270,6 +3379,7 @@
             <w:r>
               <w:rPr>
                 <w:rFonts w:ascii="Times New Roman" w:hAnsi="Times New Roman"/>
+                <w:b w:val="0"/>
                 <w:sz w:val="16"/>
               </w:rPr>
             </w:r>
@@ -3287,6 +3397,7 @@
             <w:r>
               <w:rPr>
                 <w:rFonts w:ascii="Times New Roman" w:hAnsi="Times New Roman"/>
+                <w:b w:val="0"/>
                 <w:sz w:val="16"/>
               </w:rPr>
               <w:t>Other</w:t>
@@ -3295,7 +3406,7 @@
         </w:tc>
         <w:tc>
           <w:tcPr>
-            <w:tcW w:type="dxa" w:w="1020"/>
+            <w:tcW w:type="dxa" w:w="1077"/>
             <w:shd w:val="clear" w:color="auto" w:fill="FFFFFF"/>
           </w:tcPr>
           <w:p>
@@ -3305,6 +3416,7 @@
             <w:r>
               <w:rPr>
                 <w:rFonts w:ascii="Times New Roman" w:hAnsi="Times New Roman"/>
+                <w:b w:val="0"/>
                 <w:sz w:val="16"/>
               </w:rPr>
               <w:t>57.55%</w:t>
@@ -3315,8 +3427,8 @@
       <w:tr>
         <w:tc>
           <w:tcPr>
-            <w:tcW w:type="dxa" w:w="2551"/>
-            <w:shd w:val="clear" w:color="auto" w:fill="EAECF0"/>
+            <w:tcW w:type="dxa" w:w="2438"/>
+            <w:shd w:val="clear" w:color="auto" w:fill="D6E4F7"/>
           </w:tcPr>
           <w:p>
             <w:pPr>
@@ -3325,6 +3437,7 @@
             <w:r>
               <w:rPr>
                 <w:rFonts w:ascii="Times New Roman" w:hAnsi="Times New Roman"/>
+                <w:b w:val="0"/>
                 <w:sz w:val="16"/>
               </w:rPr>
               <w:t>University CGPA</w:t>
@@ -3334,7 +3447,7 @@
         <w:tc>
           <w:tcPr>
             <w:tcW w:type="dxa" w:w="1247"/>
-            <w:shd w:val="clear" w:color="auto" w:fill="EAECF0"/>
+            <w:shd w:val="clear" w:color="auto" w:fill="D6E4F7"/>
           </w:tcPr>
           <w:p>
             <w:pPr>
@@ -3343,6 +3456,7 @@
             <w:r>
               <w:rPr>
                 <w:rFonts w:ascii="Times New Roman" w:hAnsi="Times New Roman"/>
+                <w:b w:val="0"/>
                 <w:sz w:val="16"/>
               </w:rPr>
               <w:t>4.00</w:t>
@@ -3351,8 +3465,8 @@
         </w:tc>
         <w:tc>
           <w:tcPr>
-            <w:tcW w:type="dxa" w:w="1020"/>
-            <w:shd w:val="clear" w:color="auto" w:fill="EAECF0"/>
+            <w:tcW w:type="dxa" w:w="1077"/>
+            <w:shd w:val="clear" w:color="auto" w:fill="D6E4F7"/>
           </w:tcPr>
           <w:p>
             <w:pPr>
@@ -3361,6 +3475,7 @@
             <w:r>
               <w:rPr>
                 <w:rFonts w:ascii="Times New Roman" w:hAnsi="Times New Roman"/>
+                <w:b w:val="0"/>
                 <w:sz w:val="16"/>
               </w:rPr>
               <w:t>2.21%</w:t>
@@ -3371,7 +3486,7 @@
       <w:tr>
         <w:tc>
           <w:tcPr>
-            <w:tcW w:type="dxa" w:w="2551"/>
+            <w:tcW w:type="dxa" w:w="2438"/>
             <w:shd w:val="clear" w:color="auto" w:fill="FFFFFF"/>
           </w:tcPr>
           <w:p>
@@ -3381,6 +3496,7 @@
             <w:r>
               <w:rPr>
                 <w:rFonts w:ascii="Times New Roman" w:hAnsi="Times New Roman"/>
+                <w:b w:val="0"/>
                 <w:sz w:val="16"/>
               </w:rPr>
             </w:r>
@@ -3398,6 +3514,7 @@
             <w:r>
               <w:rPr>
                 <w:rFonts w:ascii="Times New Roman" w:hAnsi="Times New Roman"/>
+                <w:b w:val="0"/>
                 <w:sz w:val="16"/>
               </w:rPr>
               <w:t>3.25</w:t>
@@ -3406,7 +3523,7 @@
         </w:tc>
         <w:tc>
           <w:tcPr>
-            <w:tcW w:type="dxa" w:w="1020"/>
+            <w:tcW w:type="dxa" w:w="1077"/>
             <w:shd w:val="clear" w:color="auto" w:fill="FFFFFF"/>
           </w:tcPr>
           <w:p>
@@ -3416,6 +3533,7 @@
             <w:r>
               <w:rPr>
                 <w:rFonts w:ascii="Times New Roman" w:hAnsi="Times New Roman"/>
+                <w:b w:val="0"/>
                 <w:sz w:val="16"/>
               </w:rPr>
               <w:t>2.23%</w:t>
@@ -3426,8 +3544,8 @@
       <w:tr>
         <w:tc>
           <w:tcPr>
-            <w:tcW w:type="dxa" w:w="2551"/>
-            <w:shd w:val="clear" w:color="auto" w:fill="EAECF0"/>
+            <w:tcW w:type="dxa" w:w="2438"/>
+            <w:shd w:val="clear" w:color="auto" w:fill="D6E4F7"/>
           </w:tcPr>
           <w:p>
             <w:pPr>
@@ -3436,6 +3554,7 @@
             <w:r>
               <w:rPr>
                 <w:rFonts w:ascii="Times New Roman" w:hAnsi="Times New Roman"/>
+                <w:b w:val="0"/>
                 <w:sz w:val="16"/>
               </w:rPr>
             </w:r>
@@ -3444,7 +3563,7 @@
         <w:tc>
           <w:tcPr>
             <w:tcW w:type="dxa" w:w="1247"/>
-            <w:shd w:val="clear" w:color="auto" w:fill="EAECF0"/>
+            <w:shd w:val="clear" w:color="auto" w:fill="D6E4F7"/>
           </w:tcPr>
           <w:p>
             <w:pPr>
@@ -3453,6 +3572,7 @@
             <w:r>
               <w:rPr>
                 <w:rFonts w:ascii="Times New Roman" w:hAnsi="Times New Roman"/>
+                <w:b w:val="0"/>
                 <w:sz w:val="16"/>
               </w:rPr>
               <w:t>3.00</w:t>
@@ -3461,8 +3581,8 @@
         </w:tc>
         <w:tc>
           <w:tcPr>
-            <w:tcW w:type="dxa" w:w="1020"/>
-            <w:shd w:val="clear" w:color="auto" w:fill="EAECF0"/>
+            <w:tcW w:type="dxa" w:w="1077"/>
+            <w:shd w:val="clear" w:color="auto" w:fill="D6E4F7"/>
           </w:tcPr>
           <w:p>
             <w:pPr>
@@ -3471,6 +3591,7 @@
             <w:r>
               <w:rPr>
                 <w:rFonts w:ascii="Times New Roman" w:hAnsi="Times New Roman"/>
+                <w:b w:val="0"/>
                 <w:sz w:val="16"/>
               </w:rPr>
               <w:t>12.83%</w:t>
@@ -3481,7 +3602,7 @@
       <w:tr>
         <w:tc>
           <w:tcPr>
-            <w:tcW w:type="dxa" w:w="2551"/>
+            <w:tcW w:type="dxa" w:w="2438"/>
             <w:shd w:val="clear" w:color="auto" w:fill="FFFFFF"/>
           </w:tcPr>
           <w:p>
@@ -3491,6 +3612,7 @@
             <w:r>
               <w:rPr>
                 <w:rFonts w:ascii="Times New Roman" w:hAnsi="Times New Roman"/>
+                <w:b w:val="0"/>
                 <w:sz w:val="16"/>
               </w:rPr>
             </w:r>
@@ -3508,6 +3630,7 @@
             <w:r>
               <w:rPr>
                 <w:rFonts w:ascii="Times New Roman" w:hAnsi="Times New Roman"/>
+                <w:b w:val="0"/>
                 <w:sz w:val="16"/>
               </w:rPr>
               <w:t>Other</w:t>
@@ -3516,7 +3639,7 @@
         </w:tc>
         <w:tc>
           <w:tcPr>
-            <w:tcW w:type="dxa" w:w="1020"/>
+            <w:tcW w:type="dxa" w:w="1077"/>
             <w:shd w:val="clear" w:color="auto" w:fill="FFFFFF"/>
           </w:tcPr>
           <w:p>
@@ -3526,6 +3649,7 @@
             <w:r>
               <w:rPr>
                 <w:rFonts w:ascii="Times New Roman" w:hAnsi="Times New Roman"/>
+                <w:b w:val="0"/>
                 <w:sz w:val="16"/>
               </w:rPr>
               <w:t>82.73%</w:t>
@@ -3536,8 +3660,8 @@
       <w:tr>
         <w:tc>
           <w:tcPr>
-            <w:tcW w:type="dxa" w:w="2551"/>
-            <w:shd w:val="clear" w:color="auto" w:fill="EAECF0"/>
+            <w:tcW w:type="dxa" w:w="2438"/>
+            <w:shd w:val="clear" w:color="auto" w:fill="D6E4F7"/>
           </w:tcPr>
           <w:p>
             <w:pPr>
@@ -3546,6 +3670,7 @@
             <w:r>
               <w:rPr>
                 <w:rFonts w:ascii="Times New Roman" w:hAnsi="Times New Roman"/>
+                <w:b w:val="0"/>
                 <w:sz w:val="16"/>
               </w:rPr>
               <w:t>Do you suffer from depression? (Class Label)</w:t>
@@ -3555,7 +3680,7 @@
         <w:tc>
           <w:tcPr>
             <w:tcW w:type="dxa" w:w="1247"/>
-            <w:shd w:val="clear" w:color="auto" w:fill="EAECF0"/>
+            <w:shd w:val="clear" w:color="auto" w:fill="D6E4F7"/>
           </w:tcPr>
           <w:p>
             <w:pPr>
@@ -3564,6 +3689,7 @@
             <w:r>
               <w:rPr>
                 <w:rFonts w:ascii="Times New Roman" w:hAnsi="Times New Roman"/>
+                <w:b w:val="0"/>
                 <w:sz w:val="16"/>
               </w:rPr>
               <w:t>Yes</w:t>
@@ -3572,8 +3698,8 @@
         </w:tc>
         <w:tc>
           <w:tcPr>
-            <w:tcW w:type="dxa" w:w="1020"/>
-            <w:shd w:val="clear" w:color="auto" w:fill="EAECF0"/>
+            <w:tcW w:type="dxa" w:w="1077"/>
+            <w:shd w:val="clear" w:color="auto" w:fill="D6E4F7"/>
           </w:tcPr>
           <w:p>
             <w:pPr>
@@ -3582,6 +3708,7 @@
             <w:r>
               <w:rPr>
                 <w:rFonts w:ascii="Times New Roman" w:hAnsi="Times New Roman"/>
+                <w:b w:val="0"/>
                 <w:sz w:val="16"/>
               </w:rPr>
               <w:t>40.62%</w:t>
@@ -3592,7 +3719,7 @@
       <w:tr>
         <w:tc>
           <w:tcPr>
-            <w:tcW w:type="dxa" w:w="2551"/>
+            <w:tcW w:type="dxa" w:w="2438"/>
             <w:shd w:val="clear" w:color="auto" w:fill="FFFFFF"/>
           </w:tcPr>
           <w:p>
@@ -3602,6 +3729,7 @@
             <w:r>
               <w:rPr>
                 <w:rFonts w:ascii="Times New Roman" w:hAnsi="Times New Roman"/>
+                <w:b w:val="0"/>
                 <w:sz w:val="16"/>
               </w:rPr>
             </w:r>
@@ -3619,6 +3747,7 @@
             <w:r>
               <w:rPr>
                 <w:rFonts w:ascii="Times New Roman" w:hAnsi="Times New Roman"/>
+                <w:b w:val="0"/>
                 <w:sz w:val="16"/>
               </w:rPr>
               <w:t>No</w:t>
@@ -3627,7 +3756,7 @@
         </w:tc>
         <w:tc>
           <w:tcPr>
-            <w:tcW w:type="dxa" w:w="1020"/>
+            <w:tcW w:type="dxa" w:w="1077"/>
             <w:shd w:val="clear" w:color="auto" w:fill="FFFFFF"/>
           </w:tcPr>
           <w:p>
@@ -3637,6 +3766,7 @@
             <w:r>
               <w:rPr>
                 <w:rFonts w:ascii="Times New Roman" w:hAnsi="Times New Roman"/>
+                <w:b w:val="0"/>
                 <w:sz w:val="16"/>
               </w:rPr>
               <w:t>59.38%</w:t>
@@ -3656,7 +3786,6 @@
           <w:b/>
           <w:i/>
           <w:sz w:val="20"/>
-          <w:u w:val="none"/>
         </w:rPr>
         <w:t>B. Preprocessing of Data</w:t>
       </w:r>
@@ -3673,15 +3802,14 @@
           <w:b w:val="0"/>
           <w:i w:val="0"/>
           <w:sz w:val="20"/>
-          <w:u w:val="none"/>
         </w:rPr>
-        <w:t>We have addressed and cleaned the missing data using a variety of methods, including addressing data discrepancies, smoothing noisy data, and replacing missing values or rows. The following preprocessing steps were applied:</w:t>
+        <w:t>We have addressed and cleaned the missing data using a variety of methods, including addressing data discrepancies, smoothing noisy data, and replacing missing values or rows. Figure 2 depicts the process of data preparation.</w:t>
       </w:r>
     </w:p>
     <w:p>
       <w:pPr>
         <w:spacing w:before="0" w:after="40" w:lineRule="exact" w:line="240"/>
-        <w:ind w:left="283"/>
+        <w:ind w:left="227"/>
         <w:jc w:val="both"/>
       </w:pPr>
       <w:r>
@@ -3690,7 +3818,6 @@
           <w:b/>
           <w:i w:val="0"/>
           <w:sz w:val="18"/>
-          <w:u w:val="none"/>
         </w:rPr>
         <w:t xml:space="preserve">1. Binary Encoding: </w:t>
       </w:r>
@@ -3700,15 +3827,14 @@
           <w:b w:val="0"/>
           <w:i w:val="0"/>
           <w:sz w:val="18"/>
-          <w:u w:val="none"/>
         </w:rPr>
-        <w:t>All Yes/No categorical columns (13 features) were converted to binary values (Yes=1, No=0).</w:t>
+        <w:t>All Yes/No columns (13 features) converted to 1/0.</w:t>
       </w:r>
     </w:p>
     <w:p>
       <w:pPr>
         <w:spacing w:before="0" w:after="40" w:lineRule="exact" w:line="240"/>
-        <w:ind w:left="283"/>
+        <w:ind w:left="227"/>
         <w:jc w:val="both"/>
       </w:pPr>
       <w:r>
@@ -3717,7 +3843,6 @@
           <w:b/>
           <w:i w:val="0"/>
           <w:sz w:val="18"/>
-          <w:u w:val="none"/>
         </w:rPr>
         <w:t xml:space="preserve">2. One-Hot Encoding: </w:t>
       </w:r>
@@ -3727,15 +3852,14 @@
           <w:b w:val="0"/>
           <w:i w:val="0"/>
           <w:sz w:val="18"/>
-          <w:u w:val="none"/>
         </w:rPr>
-        <w:t>Multi-category columns (Gender, Personality Type, Comfortable Environment) were expanded into separate binary columns.</w:t>
+        <w:t>Gender, Personality Type, Comfortable Environment expanded to binary columns.</w:t>
       </w:r>
     </w:p>
     <w:p>
       <w:pPr>
         <w:spacing w:before="0" w:after="40" w:lineRule="exact" w:line="240"/>
-        <w:ind w:left="283"/>
+        <w:ind w:left="227"/>
         <w:jc w:val="both"/>
       </w:pPr>
       <w:r>
@@ -3744,9 +3868,8 @@
           <w:b/>
           <w:i w:val="0"/>
           <w:sz w:val="18"/>
-          <w:u w:val="none"/>
         </w:rPr>
-        <w:t xml:space="preserve">3. Missing Value Imputation: </w:t>
+        <w:t xml:space="preserve">3. Median Imputation: </w:t>
       </w:r>
       <w:r>
         <w:rPr>
@@ -3754,15 +3877,14 @@
           <w:b w:val="0"/>
           <w:i w:val="0"/>
           <w:sz w:val="18"/>
-          <w:u w:val="none"/>
         </w:rPr>
-        <w:t>Missing numeric values were replaced using median imputation, which is robust to outliers.</w:t>
+        <w:t>Missing numeric values replaced using median imputation.</w:t>
       </w:r>
     </w:p>
     <w:p>
       <w:pPr>
         <w:spacing w:before="0" w:after="40" w:lineRule="exact" w:line="240"/>
-        <w:ind w:left="283"/>
+        <w:ind w:left="227"/>
         <w:jc w:val="both"/>
       </w:pPr>
       <w:r>
@@ -3771,7 +3893,6 @@
           <w:b/>
           <w:i w:val="0"/>
           <w:sz w:val="18"/>
-          <w:u w:val="none"/>
         </w:rPr>
         <w:t xml:space="preserve">4. Feature Scaling: </w:t>
       </w:r>
@@ -3781,15 +3902,14 @@
           <w:b w:val="0"/>
           <w:i w:val="0"/>
           <w:sz w:val="18"/>
-          <w:u w:val="none"/>
         </w:rPr>
-        <w:t>All features were standardized using StandardScaler (zero mean, unit variance).</w:t>
+        <w:t>All features standardized using StandardScaler (zero mean, unit variance).</w:t>
       </w:r>
     </w:p>
     <w:p>
       <w:pPr>
         <w:spacing w:before="0" w:after="40" w:lineRule="exact" w:line="240"/>
-        <w:ind w:left="283"/>
+        <w:ind w:left="227"/>
         <w:jc w:val="both"/>
       </w:pPr>
       <w:r>
@@ -3798,7 +3918,6 @@
           <w:b/>
           <w:i w:val="0"/>
           <w:sz w:val="18"/>
-          <w:u w:val="none"/>
         </w:rPr>
         <w:t xml:space="preserve">5. Final Feature Space: </w:t>
       </w:r>
@@ -3808,9 +3927,8 @@
           <w:b w:val="0"/>
           <w:i w:val="0"/>
           <w:sz w:val="18"/>
-          <w:u w:val="none"/>
         </w:rPr>
-        <w:t>After encoding, the 23 original attributes were transformed into 26 features for model input.</w:t>
+        <w:t>23 original attributes transformed into 26 features for model input.</w:t>
       </w:r>
     </w:p>
     <w:p>
@@ -3818,43 +3936,44 @@
         <w:spacing w:before="80" w:after="40"/>
         <w:jc w:val="center"/>
       </w:pPr>
+      <w:r>
+        <w:drawing>
+          <wp:inline xmlns:a="http://schemas.openxmlformats.org/drawingml/2006/main" xmlns:pic="http://schemas.openxmlformats.org/drawingml/2006/picture">
+            <wp:extent cx="2286000" cy="3625645"/>
+            <wp:docPr id="2" name="Picture 2"/>
+            <wp:cNvGraphicFramePr>
+              <a:graphicFrameLocks noChangeAspect="1"/>
+            </wp:cNvGraphicFramePr>
+            <a:graphic>
+              <a:graphicData uri="http://schemas.openxmlformats.org/drawingml/2006/picture">
+                <pic:pic>
+                  <pic:nvPicPr>
+                    <pic:cNvPr id="0" name="fig_page2_img.png"/>
+                    <pic:cNvPicPr/>
+                  </pic:nvPicPr>
+                  <pic:blipFill>
+                    <a:blip r:embed="rId10"/>
+                    <a:stretch>
+                      <a:fillRect/>
+                    </a:stretch>
+                  </pic:blipFill>
+                  <pic:spPr>
+                    <a:xfrm>
+                      <a:off x="0" y="0"/>
+                      <a:ext cx="2286000" cy="3625645"/>
+                    </a:xfrm>
+                    <a:prstGeom prst="rect"/>
+                  </pic:spPr>
+                </pic:pic>
+              </a:graphicData>
+            </a:graphic>
+          </wp:inline>
+        </w:drawing>
+      </w:r>
     </w:p>
-    <w:tbl>
-      <w:tblPr>
-        <w:tblStyle w:val="TableGrid"/>
-        <w:tblW w:type="auto" w:w="0"/>
-        <w:jc w:val="center"/>
-        <w:tblLook w:firstColumn="1" w:firstRow="1" w:lastColumn="0" w:lastRow="0" w:noHBand="0" w:noVBand="1" w:val="04A0"/>
-      </w:tblPr>
-      <w:tblGrid>
-        <w:gridCol w:w="9866"/>
-      </w:tblGrid>
-      <w:tr>
-        <w:tc>
-          <w:tcPr>
-            <w:tcW w:type="dxa" w:w="4032"/>
-            <w:shd w:val="clear" w:color="auto" w:fill="D9D9D9"/>
-          </w:tcPr>
-          <w:p>
-            <w:pPr>
-              <w:spacing w:before="280" w:after="280"/>
-              <w:jc w:val="center"/>
-            </w:pPr>
-            <w:r>
-              <w:rPr>
-                <w:i/>
-                <w:color w:val="505050"/>
-                <w:sz w:val="18"/>
-              </w:rPr>
-              <w:t>[Figure Placeholder]</w:t>
-            </w:r>
-          </w:p>
-        </w:tc>
-      </w:tr>
-    </w:tbl>
     <w:p>
       <w:pPr>
-        <w:spacing w:before="40" w:after="120"/>
+        <w:spacing w:before="0" w:after="120"/>
         <w:jc w:val="center"/>
       </w:pPr>
       <w:r>
@@ -3863,7 +3982,6 @@
           <w:b w:val="0"/>
           <w:i/>
           <w:sz w:val="18"/>
-          <w:u w:val="none"/>
         </w:rPr>
         <w:t>Fig. 2: Data Preparation Procedure</w:t>
       </w:r>
@@ -3879,7 +3997,6 @@
           <w:b/>
           <w:i/>
           <w:sz w:val="20"/>
-          <w:u w:val="none"/>
         </w:rPr>
         <w:t>C. Algorithmic Implementation</w:t>
       </w:r>
@@ -3896,14 +4013,13 @@
           <w:b w:val="0"/>
           <w:i w:val="0"/>
           <w:sz w:val="20"/>
-          <w:u w:val="none"/>
         </w:rPr>
-        <w:t>For classification, we employed four different methods: Multilayer Perceptron (MLP), Logistic Regression, XGBoost, and Support Vector Machine (SVM).</w:t>
+        <w:t>For classification, we employed four different methods: Multilayer Perceptron (MLP), Logistic Regression Algorithm, XGBoost Algorithm, and Support Vector Machine Algorithm.</w:t>
       </w:r>
     </w:p>
     <w:p>
       <w:pPr>
-        <w:spacing w:before="40" w:after="40" w:lineRule="exact" w:line="240"/>
+        <w:spacing w:before="60" w:after="60" w:lineRule="exact" w:line="240"/>
         <w:jc w:val="both"/>
       </w:pPr>
       <w:r>
@@ -3912,7 +4028,6 @@
           <w:b/>
           <w:i w:val="0"/>
           <w:sz w:val="20"/>
-          <w:u w:val="none"/>
         </w:rPr>
         <w:t xml:space="preserve">1) Multilayer Perceptron (MLP): </w:t>
       </w:r>
@@ -3922,14 +4037,13 @@
           <w:b w:val="0"/>
           <w:i w:val="0"/>
           <w:sz w:val="20"/>
-          <w:u w:val="none"/>
         </w:rPr>
-        <w:t>An example of a multilayer perceptron (MLP) is the Feed-forward Artificial Neural Network (ANN) class [11]. An input layer, an output layer, and hidden layers make up an MLP. In this implementation, the architecture is: Input (26 features) → Hidden Layer 1 (128 neurons) → Hidden Layer 2 (64 neurons) → Hidden Layer 3 (32 neurons) → Output (2 classes). ReLU activation with Adam optimizer (max_iter=500).</w:t>
+        <w:t>An example of a multilayer perceptron (MLP) is the Feed-forward Artificial Neural Network (ANN) class [11]. An input layer, output layer, and hidden layers make up an MLP. Architecture: Input (26) → Hidden Layer 1 (128, ReLU) → Hidden Layer 2 (64, ReLU) → Hidden Layer 3 (32, ReLU) → Output (2 classes). Optimizer: Adam, max_iter=500.</w:t>
       </w:r>
     </w:p>
     <w:p>
       <w:pPr>
-        <w:spacing w:before="40" w:after="40" w:lineRule="exact" w:line="240"/>
+        <w:spacing w:before="60" w:after="60" w:lineRule="exact" w:line="240"/>
         <w:jc w:val="both"/>
       </w:pPr>
       <w:r>
@@ -3938,7 +4052,6 @@
           <w:b/>
           <w:i w:val="0"/>
           <w:sz w:val="20"/>
-          <w:u w:val="none"/>
         </w:rPr>
         <w:t xml:space="preserve">2) XGBoost Algorithm: </w:t>
       </w:r>
@@ -3948,14 +4061,13 @@
           <w:b w:val="0"/>
           <w:i w:val="0"/>
           <w:sz w:val="20"/>
-          <w:u w:val="none"/>
         </w:rPr>
-        <w:t>An approach for supervised learning called XGBoost predicts a target variable by combining the estimates of simpler models. XGBoost makes use of distributed and parallel computing, together with a novel tree learning technique [14]. Parameters: 200 estimators, max_depth=6, learning_rate=0.1.</w:t>
+        <w:t>An approach for supervised learning called XGBoost predicts a target variable by combining the estimates of simpler models. XGBoost makes use of distributed and parallel computing with a novel tree learning technique. Uses the weighted quartile sketch algorithm to handle sparse data sets [14]. Parameters: 200 estimators, max_depth=6, learning_rate=0.1.</w:t>
       </w:r>
     </w:p>
     <w:p>
       <w:pPr>
-        <w:spacing w:before="40" w:after="40" w:lineRule="exact" w:line="240"/>
+        <w:spacing w:before="60" w:after="60" w:lineRule="exact" w:line="240"/>
         <w:jc w:val="both"/>
       </w:pPr>
       <w:r>
@@ -3964,7 +4076,6 @@
           <w:b/>
           <w:i w:val="0"/>
           <w:sz w:val="20"/>
-          <w:u w:val="none"/>
         </w:rPr>
         <w:t xml:space="preserve">3) Logistic Regression Algorithm: </w:t>
       </w:r>
@@ -3974,14 +4085,13 @@
           <w:b w:val="0"/>
           <w:i w:val="0"/>
           <w:sz w:val="20"/>
-          <w:u w:val="none"/>
         </w:rPr>
-        <w:t>Based on a collection of input factors, logistic regression predicts the likelihood of a binary result using a mathematical technique. A linear combination of input features is converted into a probability value between 0 and 1 using the logistic function [1]. Parameters: max_iter=1000, C=1.0.</w:t>
+        <w:t>Based on a collection of input factors, logistic regression predicts the likelihood of a binary result using the logistic function. A linear combination of input features is converted into a probability value between 0 and 1 [1]. Parameters: max_iter=1000, C=1.0.</w:t>
       </w:r>
     </w:p>
     <w:p>
       <w:pPr>
-        <w:spacing w:before="40" w:after="40" w:lineRule="exact" w:line="240"/>
+        <w:spacing w:before="60" w:after="60" w:lineRule="exact" w:line="240"/>
         <w:jc w:val="both"/>
       </w:pPr>
       <w:r>
@@ -3990,9 +4100,8 @@
           <w:b/>
           <w:i w:val="0"/>
           <w:sz w:val="20"/>
-          <w:u w:val="none"/>
         </w:rPr>
-        <w:t xml:space="preserve">4) Support Vector Machine (SVM): </w:t>
+        <w:t xml:space="preserve">4) Support Vector Machine Algorithm: </w:t>
       </w:r>
       <w:r>
         <w:rPr>
@@ -4000,7 +4109,6 @@
           <w:b w:val="0"/>
           <w:i w:val="0"/>
           <w:sz w:val="20"/>
-          <w:u w:val="none"/>
         </w:rPr>
         <w:t>A supervised machine learning approach that classifies data using statistical learning theory. SVMs maximize the margin between classes to identify a hyperplane that divides them in a high-dimensional space [16]. Parameters: kernel=RBF, C=10, gamma=scale.</w:t>
       </w:r>
@@ -4016,7 +4124,6 @@
           <w:b/>
           <w:i/>
           <w:sz w:val="20"/>
-          <w:u w:val="none"/>
         </w:rPr>
         <w:t>D. Simulation Environment</w:t>
       </w:r>
@@ -4025,7 +4132,7 @@
       <w:pPr>
         <w:spacing w:before="0" w:after="40" w:lineRule="exact" w:line="240"/>
         <w:ind w:left="283"/>
-        <w:jc w:val="left"/>
+        <w:jc w:val="both"/>
       </w:pPr>
       <w:r>
         <w:rPr>
@@ -4033,16 +4140,15 @@
           <w:b w:val="0"/>
           <w:i w:val="0"/>
           <w:sz w:val="20"/>
-          <w:u w:val="none"/>
         </w:rPr>
-        <w:t>• Programming Language: Python 3.9</w:t>
+        <w:t>- Programming Language: Python 3.9</w:t>
       </w:r>
     </w:p>
     <w:p>
       <w:pPr>
         <w:spacing w:before="0" w:after="40" w:lineRule="exact" w:line="240"/>
         <w:ind w:left="283"/>
-        <w:jc w:val="left"/>
+        <w:jc w:val="both"/>
       </w:pPr>
       <w:r>
         <w:rPr>
@@ -4050,16 +4156,15 @@
           <w:b w:val="0"/>
           <w:i w:val="0"/>
           <w:sz w:val="20"/>
-          <w:u w:val="none"/>
         </w:rPr>
-        <w:t>• Libraries: scikit-learn 1.2.2, xgboost 1.7.5, pandas 1.5.3, numpy 1.24.3</w:t>
+        <w:t>- Libraries: scikit-learn 1.2.2, XGBoost 1.7.5, pandas 1.5.3, numpy 1.24.3</w:t>
       </w:r>
     </w:p>
     <w:p>
       <w:pPr>
         <w:spacing w:before="0" w:after="40" w:lineRule="exact" w:line="240"/>
         <w:ind w:left="283"/>
-        <w:jc w:val="left"/>
+        <w:jc w:val="both"/>
       </w:pPr>
       <w:r>
         <w:rPr>
@@ -4067,16 +4172,15 @@
           <w:b w:val="0"/>
           <w:i w:val="0"/>
           <w:sz w:val="20"/>
-          <w:u w:val="none"/>
         </w:rPr>
-        <w:t>• Validation: 10-Fold Stratified Cross-Validation</w:t>
+        <w:t>- Validation: 10-Fold Stratified Cross-Validation</w:t>
       </w:r>
     </w:p>
     <w:p>
       <w:pPr>
         <w:spacing w:before="0" w:after="40" w:lineRule="exact" w:line="240"/>
         <w:ind w:left="283"/>
-        <w:jc w:val="left"/>
+        <w:jc w:val="both"/>
       </w:pPr>
       <w:r>
         <w:rPr>
@@ -4084,9 +4188,8 @@
           <w:b w:val="0"/>
           <w:i w:val="0"/>
           <w:sz w:val="20"/>
-          <w:u w:val="none"/>
         </w:rPr>
-        <w:t>• Train/Test Split: 80% training (431 samples), 20% testing (108 samples)</w:t>
+        <w:t>- Train/Test Split: 80% training (431 samples), 20% testing (108 samples)</w:t>
       </w:r>
     </w:p>
     <w:p>
@@ -4100,7 +4203,6 @@
           <w:b/>
           <w:i w:val="0"/>
           <w:sz w:val="20"/>
-          <w:u w:val="none"/>
         </w:rPr>
         <w:t>IV. EXPERIMENTED OUTCOMES AND ANALYSIS</w:t>
       </w:r>
@@ -4116,7 +4218,6 @@
           <w:b/>
           <w:i/>
           <w:sz w:val="20"/>
-          <w:u w:val="none"/>
         </w:rPr>
         <w:t>A. Accuracy</w:t>
       </w:r>
@@ -4124,7 +4225,7 @@
     <w:p>
       <w:pPr>
         <w:spacing w:before="0" w:after="40" w:lineRule="exact" w:line="240"/>
-        <w:ind w:firstLine="283"/>
+        <w:ind w:firstLine="0"/>
         <w:jc w:val="both"/>
       </w:pPr>
       <w:r>
@@ -4133,14 +4234,13 @@
           <w:b w:val="0"/>
           <w:i w:val="0"/>
           <w:sz w:val="20"/>
-          <w:u w:val="none"/>
         </w:rPr>
-        <w:t>The accuracy is defined as:</w:t>
+        <w:t>The accuracy can be defined as:</w:t>
       </w:r>
     </w:p>
     <w:p>
       <w:pPr>
-        <w:spacing w:before="40" w:after="80" w:lineRule="exact" w:line="280"/>
+        <w:spacing w:before="40" w:after="80"/>
         <w:jc w:val="center"/>
       </w:pPr>
       <w:r>
@@ -4149,7 +4249,6 @@
           <w:b w:val="0"/>
           <w:i/>
           <w:sz w:val="20"/>
-          <w:u w:val="none"/>
         </w:rPr>
         <w:t>Accuracy = (TP + TN) / (TP + TN + FP + FN)</w:t>
       </w:r>
@@ -4165,7 +4264,6 @@
           <w:b/>
           <w:i/>
           <w:sz w:val="20"/>
-          <w:u w:val="none"/>
         </w:rPr>
         <w:t>B. Recall / True Positive Rate (Sensitivity)</w:t>
       </w:r>
@@ -4173,7 +4271,7 @@
     <w:p>
       <w:pPr>
         <w:spacing w:before="0" w:after="40" w:lineRule="exact" w:line="240"/>
-        <w:ind w:firstLine="283"/>
+        <w:ind w:firstLine="0"/>
         <w:jc w:val="both"/>
       </w:pPr>
       <w:r>
@@ -4182,14 +4280,13 @@
           <w:b w:val="0"/>
           <w:i w:val="0"/>
           <w:sz w:val="20"/>
-          <w:u w:val="none"/>
         </w:rPr>
-        <w:t>A test's true positive rate (TPR) is the likelihood that individuals with the condition will yield true-positive results [14].</w:t>
+        <w:t>A test's true positive rate (TPR) is the likelihood that individuals with the illness will yield true-positive results [14].</w:t>
       </w:r>
     </w:p>
     <w:p>
       <w:pPr>
-        <w:spacing w:before="40" w:after="80" w:lineRule="exact" w:line="280"/>
+        <w:spacing w:before="40" w:after="80"/>
         <w:jc w:val="center"/>
       </w:pPr>
       <w:r>
@@ -4198,9 +4295,8 @@
           <w:b w:val="0"/>
           <w:i/>
           <w:sz w:val="20"/>
-          <w:u w:val="none"/>
         </w:rPr>
-        <w:t>Recall = TP / (TP + FN)</w:t>
+        <w:t>Recall (TPR) = TP / (TP + FN)</w:t>
       </w:r>
     </w:p>
     <w:p>
@@ -4214,14 +4310,13 @@
           <w:b/>
           <w:i/>
           <w:sz w:val="20"/>
-          <w:u w:val="none"/>
         </w:rPr>
         <w:t>C. Precision</w:t>
       </w:r>
     </w:p>
     <w:p>
       <w:pPr>
-        <w:spacing w:before="40" w:after="80" w:lineRule="exact" w:line="280"/>
+        <w:spacing w:before="40" w:after="80"/>
         <w:jc w:val="center"/>
       </w:pPr>
       <w:r>
@@ -4230,7 +4325,6 @@
           <w:b w:val="0"/>
           <w:i/>
           <w:sz w:val="20"/>
-          <w:u w:val="none"/>
         </w:rPr>
         <w:t>Precision = TP / (TP + FP)</w:t>
       </w:r>
@@ -4246,7 +4340,6 @@
           <w:b/>
           <w:i/>
           <w:sz w:val="20"/>
-          <w:u w:val="none"/>
         </w:rPr>
         <w:t>D. F1-Score</w:t>
       </w:r>
@@ -4254,7 +4347,7 @@
     <w:p>
       <w:pPr>
         <w:spacing w:before="0" w:after="40" w:lineRule="exact" w:line="240"/>
-        <w:ind w:firstLine="283"/>
+        <w:ind w:firstLine="0"/>
         <w:jc w:val="both"/>
       </w:pPr>
       <w:r>
@@ -4263,14 +4356,13 @@
           <w:b w:val="0"/>
           <w:i w:val="0"/>
           <w:sz w:val="20"/>
-          <w:u w:val="none"/>
         </w:rPr>
         <w:t>The F1-Score (F-Measure) is defined as [15]:</w:t>
       </w:r>
     </w:p>
     <w:p>
       <w:pPr>
-        <w:spacing w:before="40" w:after="80" w:lineRule="exact" w:line="280"/>
+        <w:spacing w:before="40" w:after="80"/>
         <w:jc w:val="center"/>
       </w:pPr>
       <w:r>
@@ -4279,9 +4371,8 @@
           <w:b w:val="0"/>
           <w:i/>
           <w:sz w:val="20"/>
-          <w:u w:val="none"/>
         </w:rPr>
-        <w:t>F1 = 2 × (Precision × Recall) / (Precision + Recall)</w:t>
+        <w:t>F1 = 2 x (Precision x Recall) / (Precision + Recall)</w:t>
       </w:r>
     </w:p>
     <w:p>
@@ -4295,7 +4386,6 @@
           <w:b/>
           <w:i/>
           <w:sz w:val="20"/>
-          <w:u w:val="none"/>
         </w:rPr>
         <w:t>E. Discussions</w:t>
       </w:r>
@@ -4312,9 +4402,8 @@
           <w:b w:val="0"/>
           <w:i w:val="0"/>
           <w:sz w:val="20"/>
-          <w:u w:val="none"/>
         </w:rPr>
-        <w:t>The results of all four methods are displayed in Table II and Figure 3. We employed Multilayer Perceptron (MLP), Logistic Regression, XGBoost, and Support Vector Machine Algorithm for the binary classification task: predicting whether a student suffers from depression. Accuracy, Precision, Recall, F1-Score, and ROC AUC were obtained using 10-fold stratified cross-validation.</w:t>
+        <w:t>The results of all four methods are displayed in Table II and Figure 3. We employed Multilayer Perceptron (MLP), Logistic Regression, XGBoost, and Support Vector Machine Algorithm for the binary classification task: predicting whether a student suffers from depression (Yes/No). Accuracy, Precision, Recall, F1-Score, and ROC AUC were obtained using 10-fold stratified cross-validation.</w:t>
       </w:r>
     </w:p>
     <w:p>
@@ -4328,7 +4417,6 @@
           <w:b/>
           <w:i w:val="0"/>
           <w:sz w:val="18"/>
-          <w:u w:val="none"/>
         </w:rPr>
         <w:t>TABLE II: Experimented Outcome (10-Fold Stratified Cross-Validation)</w:t>
       </w:r>
@@ -4350,7 +4438,7 @@
       <w:tr>
         <w:tc>
           <w:tcPr>
-            <w:tcW w:type="dxa" w:w="1984"/>
+            <w:tcW w:type="dxa" w:w="1928"/>
             <w:shd w:val="clear" w:color="auto" w:fill="1F3864"/>
           </w:tcPr>
           <w:p>
@@ -4370,7 +4458,7 @@
         </w:tc>
         <w:tc>
           <w:tcPr>
-            <w:tcW w:type="dxa" w:w="850"/>
+            <w:tcW w:type="dxa" w:w="794"/>
             <w:shd w:val="clear" w:color="auto" w:fill="1F3864"/>
           </w:tcPr>
           <w:p>
@@ -4412,7 +4500,7 @@
         </w:tc>
         <w:tc>
           <w:tcPr>
-            <w:tcW w:type="dxa" w:w="907"/>
+            <w:tcW w:type="dxa" w:w="850"/>
             <w:shd w:val="clear" w:color="auto" w:fill="1F3864"/>
           </w:tcPr>
           <w:p>
@@ -4432,7 +4520,7 @@
         </w:tc>
         <w:tc>
           <w:tcPr>
-            <w:tcW w:type="dxa" w:w="850"/>
+            <w:tcW w:type="dxa" w:w="737"/>
             <w:shd w:val="clear" w:color="auto" w:fill="1F3864"/>
           </w:tcPr>
           <w:p>
@@ -4454,7 +4542,7 @@
       <w:tr>
         <w:tc>
           <w:tcPr>
-            <w:tcW w:type="dxa" w:w="1984"/>
+            <w:tcW w:type="dxa" w:w="1928"/>
             <w:shd w:val="clear" w:color="auto" w:fill="EBF3FB"/>
           </w:tcPr>
           <w:p>
@@ -4464,6 +4552,7 @@
             <w:r>
               <w:rPr>
                 <w:rFonts w:ascii="Times New Roman" w:hAnsi="Times New Roman"/>
+                <w:b w:val="0"/>
                 <w:sz w:val="17"/>
               </w:rPr>
               <w:t>Accuracy (%)</w:t>
@@ -4472,7 +4561,7 @@
         </w:tc>
         <w:tc>
           <w:tcPr>
-            <w:tcW w:type="dxa" w:w="850"/>
+            <w:tcW w:type="dxa" w:w="794"/>
             <w:shd w:val="clear" w:color="auto" w:fill="EBF3FB"/>
           </w:tcPr>
           <w:p>
@@ -4482,6 +4571,7 @@
             <w:r>
               <w:rPr>
                 <w:rFonts w:ascii="Times New Roman" w:hAnsi="Times New Roman"/>
+                <w:b w:val="0"/>
                 <w:sz w:val="17"/>
               </w:rPr>
               <w:t>96.84</w:t>
@@ -4500,6 +4590,7 @@
             <w:r>
               <w:rPr>
                 <w:rFonts w:ascii="Times New Roman" w:hAnsi="Times New Roman"/>
+                <w:b w:val="0"/>
                 <w:sz w:val="17"/>
               </w:rPr>
               <w:t>97.77</w:t>
@@ -4508,7 +4599,7 @@
         </w:tc>
         <w:tc>
           <w:tcPr>
-            <w:tcW w:type="dxa" w:w="907"/>
+            <w:tcW w:type="dxa" w:w="850"/>
             <w:shd w:val="clear" w:color="auto" w:fill="EBF3FB"/>
           </w:tcPr>
           <w:p>
@@ -4518,6 +4609,7 @@
             <w:r>
               <w:rPr>
                 <w:rFonts w:ascii="Times New Roman" w:hAnsi="Times New Roman"/>
+                <w:b w:val="0"/>
                 <w:sz w:val="17"/>
               </w:rPr>
               <w:t>97.59</w:t>
@@ -4526,8 +4618,8 @@
         </w:tc>
         <w:tc>
           <w:tcPr>
-            <w:tcW w:type="dxa" w:w="850"/>
-            <w:shd w:val="clear" w:color="auto" w:fill="D6E4F0"/>
+            <w:tcW w:type="dxa" w:w="737"/>
+            <w:shd w:val="clear" w:color="auto" w:fill="C6EFCE"/>
           </w:tcPr>
           <w:p>
             <w:pPr>
@@ -4547,7 +4639,7 @@
       <w:tr>
         <w:tc>
           <w:tcPr>
-            <w:tcW w:type="dxa" w:w="1984"/>
+            <w:tcW w:type="dxa" w:w="1928"/>
             <w:shd w:val="clear" w:color="auto" w:fill="FFFFFF"/>
           </w:tcPr>
           <w:p>
@@ -4557,15 +4649,16 @@
             <w:r>
               <w:rPr>
                 <w:rFonts w:ascii="Times New Roman" w:hAnsi="Times New Roman"/>
+                <w:b w:val="0"/>
                 <w:sz w:val="17"/>
               </w:rPr>
-              <w:t>Average Precision (%)</w:t>
+              <w:t>Avg. Precision (%)</w:t>
             </w:r>
           </w:p>
         </w:tc>
         <w:tc>
           <w:tcPr>
-            <w:tcW w:type="dxa" w:w="850"/>
+            <w:tcW w:type="dxa" w:w="794"/>
             <w:shd w:val="clear" w:color="auto" w:fill="FFFFFF"/>
           </w:tcPr>
           <w:p>
@@ -4575,6 +4668,7 @@
             <w:r>
               <w:rPr>
                 <w:rFonts w:ascii="Times New Roman" w:hAnsi="Times New Roman"/>
+                <w:b w:val="0"/>
                 <w:sz w:val="17"/>
               </w:rPr>
               <w:t>95.47</w:t>
@@ -4584,7 +4678,7 @@
         <w:tc>
           <w:tcPr>
             <w:tcW w:type="dxa" w:w="1020"/>
-            <w:shd w:val="clear" w:color="auto" w:fill="D6E4F0"/>
+            <w:shd w:val="clear" w:color="auto" w:fill="C6EFCE"/>
           </w:tcPr>
           <w:p>
             <w:pPr>
@@ -4602,24 +4696,6 @@
         </w:tc>
         <w:tc>
           <w:tcPr>
-            <w:tcW w:type="dxa" w:w="907"/>
-            <w:shd w:val="clear" w:color="auto" w:fill="FFFFFF"/>
-          </w:tcPr>
-          <w:p>
-            <w:pPr>
-              <w:jc w:val="center"/>
-            </w:pPr>
-            <w:r>
-              <w:rPr>
-                <w:rFonts w:ascii="Times New Roman" w:hAnsi="Times New Roman"/>
-                <w:sz w:val="17"/>
-              </w:rPr>
-              <w:t>96.30</w:t>
-            </w:r>
-          </w:p>
-        </w:tc>
-        <w:tc>
-          <w:tcPr>
             <w:tcW w:type="dxa" w:w="850"/>
             <w:shd w:val="clear" w:color="auto" w:fill="FFFFFF"/>
           </w:tcPr>
@@ -4630,6 +4706,26 @@
             <w:r>
               <w:rPr>
                 <w:rFonts w:ascii="Times New Roman" w:hAnsi="Times New Roman"/>
+                <w:b w:val="0"/>
+                <w:sz w:val="17"/>
+              </w:rPr>
+              <w:t>96.30</w:t>
+            </w:r>
+          </w:p>
+        </w:tc>
+        <w:tc>
+          <w:tcPr>
+            <w:tcW w:type="dxa" w:w="737"/>
+            <w:shd w:val="clear" w:color="auto" w:fill="FFFFFF"/>
+          </w:tcPr>
+          <w:p>
+            <w:pPr>
+              <w:jc w:val="center"/>
+            </w:pPr>
+            <w:r>
+              <w:rPr>
+                <w:rFonts w:ascii="Times New Roman" w:hAnsi="Times New Roman"/>
+                <w:b w:val="0"/>
                 <w:sz w:val="17"/>
               </w:rPr>
               <w:t>97.23</w:t>
@@ -4640,7 +4736,7 @@
       <w:tr>
         <w:tc>
           <w:tcPr>
-            <w:tcW w:type="dxa" w:w="1984"/>
+            <w:tcW w:type="dxa" w:w="1928"/>
             <w:shd w:val="clear" w:color="auto" w:fill="EBF3FB"/>
           </w:tcPr>
           <w:p>
@@ -4650,15 +4746,16 @@
             <w:r>
               <w:rPr>
                 <w:rFonts w:ascii="Times New Roman" w:hAnsi="Times New Roman"/>
+                <w:b w:val="0"/>
                 <w:sz w:val="17"/>
               </w:rPr>
-              <w:t>Average Recall (%)</w:t>
+              <w:t>Avg. Recall (%)</w:t>
             </w:r>
           </w:p>
         </w:tc>
         <w:tc>
           <w:tcPr>
-            <w:tcW w:type="dxa" w:w="850"/>
+            <w:tcW w:type="dxa" w:w="794"/>
             <w:shd w:val="clear" w:color="auto" w:fill="EBF3FB"/>
           </w:tcPr>
           <w:p>
@@ -4668,6 +4765,7 @@
             <w:r>
               <w:rPr>
                 <w:rFonts w:ascii="Times New Roman" w:hAnsi="Times New Roman"/>
+                <w:b w:val="0"/>
                 <w:sz w:val="17"/>
               </w:rPr>
               <w:t>95.37</w:t>
@@ -4677,7 +4775,7 @@
         <w:tc>
           <w:tcPr>
             <w:tcW w:type="dxa" w:w="1020"/>
-            <w:shd w:val="clear" w:color="auto" w:fill="D6E4F0"/>
+            <w:shd w:val="clear" w:color="auto" w:fill="C6EFCE"/>
           </w:tcPr>
           <w:p>
             <w:pPr>
@@ -4695,24 +4793,6 @@
         </w:tc>
         <w:tc>
           <w:tcPr>
-            <w:tcW w:type="dxa" w:w="907"/>
-            <w:shd w:val="clear" w:color="auto" w:fill="EBF3FB"/>
-          </w:tcPr>
-          <w:p>
-            <w:pPr>
-              <w:jc w:val="center"/>
-            </w:pPr>
-            <w:r>
-              <w:rPr>
-                <w:rFonts w:ascii="Times New Roman" w:hAnsi="Times New Roman"/>
-                <w:sz w:val="17"/>
-              </w:rPr>
-              <w:t>96.30</w:t>
-            </w:r>
-          </w:p>
-        </w:tc>
-        <w:tc>
-          <w:tcPr>
             <w:tcW w:type="dxa" w:w="850"/>
             <w:shd w:val="clear" w:color="auto" w:fill="EBF3FB"/>
           </w:tcPr>
@@ -4723,6 +4803,26 @@
             <w:r>
               <w:rPr>
                 <w:rFonts w:ascii="Times New Roman" w:hAnsi="Times New Roman"/>
+                <w:b w:val="0"/>
+                <w:sz w:val="17"/>
+              </w:rPr>
+              <w:t>96.30</w:t>
+            </w:r>
+          </w:p>
+        </w:tc>
+        <w:tc>
+          <w:tcPr>
+            <w:tcW w:type="dxa" w:w="737"/>
+            <w:shd w:val="clear" w:color="auto" w:fill="EBF3FB"/>
+          </w:tcPr>
+          <w:p>
+            <w:pPr>
+              <w:jc w:val="center"/>
+            </w:pPr>
+            <w:r>
+              <w:rPr>
+                <w:rFonts w:ascii="Times New Roman" w:hAnsi="Times New Roman"/>
+                <w:b w:val="0"/>
                 <w:sz w:val="17"/>
               </w:rPr>
               <w:t>97.22</w:t>
@@ -4733,7 +4833,7 @@
       <w:tr>
         <w:tc>
           <w:tcPr>
-            <w:tcW w:type="dxa" w:w="1984"/>
+            <w:tcW w:type="dxa" w:w="1928"/>
             <w:shd w:val="clear" w:color="auto" w:fill="FFFFFF"/>
           </w:tcPr>
           <w:p>
@@ -4743,15 +4843,16 @@
             <w:r>
               <w:rPr>
                 <w:rFonts w:ascii="Times New Roman" w:hAnsi="Times New Roman"/>
+                <w:b w:val="0"/>
                 <w:sz w:val="17"/>
               </w:rPr>
-              <w:t>Average F1-Score (%)</w:t>
+              <w:t>Avg. F1-Score (%)</w:t>
             </w:r>
           </w:p>
         </w:tc>
         <w:tc>
           <w:tcPr>
-            <w:tcW w:type="dxa" w:w="850"/>
+            <w:tcW w:type="dxa" w:w="794"/>
             <w:shd w:val="clear" w:color="auto" w:fill="FFFFFF"/>
           </w:tcPr>
           <w:p>
@@ -4761,6 +4862,7 @@
             <w:r>
               <w:rPr>
                 <w:rFonts w:ascii="Times New Roman" w:hAnsi="Times New Roman"/>
+                <w:b w:val="0"/>
                 <w:sz w:val="17"/>
               </w:rPr>
               <w:t>95.34</w:t>
@@ -4770,7 +4872,7 @@
         <w:tc>
           <w:tcPr>
             <w:tcW w:type="dxa" w:w="1020"/>
-            <w:shd w:val="clear" w:color="auto" w:fill="D6E4F0"/>
+            <w:shd w:val="clear" w:color="auto" w:fill="C6EFCE"/>
           </w:tcPr>
           <w:p>
             <w:pPr>
@@ -4788,24 +4890,6 @@
         </w:tc>
         <w:tc>
           <w:tcPr>
-            <w:tcW w:type="dxa" w:w="907"/>
-            <w:shd w:val="clear" w:color="auto" w:fill="FFFFFF"/>
-          </w:tcPr>
-          <w:p>
-            <w:pPr>
-              <w:jc w:val="center"/>
-            </w:pPr>
-            <w:r>
-              <w:rPr>
-                <w:rFonts w:ascii="Times New Roman" w:hAnsi="Times New Roman"/>
-                <w:sz w:val="17"/>
-              </w:rPr>
-              <w:t>96.30</w:t>
-            </w:r>
-          </w:p>
-        </w:tc>
-        <w:tc>
-          <w:tcPr>
             <w:tcW w:type="dxa" w:w="850"/>
             <w:shd w:val="clear" w:color="auto" w:fill="FFFFFF"/>
           </w:tcPr>
@@ -4816,6 +4900,26 @@
             <w:r>
               <w:rPr>
                 <w:rFonts w:ascii="Times New Roman" w:hAnsi="Times New Roman"/>
+                <w:b w:val="0"/>
+                <w:sz w:val="17"/>
+              </w:rPr>
+              <w:t>96.30</w:t>
+            </w:r>
+          </w:p>
+        </w:tc>
+        <w:tc>
+          <w:tcPr>
+            <w:tcW w:type="dxa" w:w="737"/>
+            <w:shd w:val="clear" w:color="auto" w:fill="FFFFFF"/>
+          </w:tcPr>
+          <w:p>
+            <w:pPr>
+              <w:jc w:val="center"/>
+            </w:pPr>
+            <w:r>
+              <w:rPr>
+                <w:rFonts w:ascii="Times New Roman" w:hAnsi="Times New Roman"/>
+                <w:b w:val="0"/>
                 <w:sz w:val="17"/>
               </w:rPr>
               <w:t>97.22</w:t>
@@ -4826,7 +4930,7 @@
       <w:tr>
         <w:tc>
           <w:tcPr>
-            <w:tcW w:type="dxa" w:w="1984"/>
+            <w:tcW w:type="dxa" w:w="1928"/>
             <w:shd w:val="clear" w:color="auto" w:fill="EBF3FB"/>
           </w:tcPr>
           <w:p>
@@ -4836,15 +4940,16 @@
             <w:r>
               <w:rPr>
                 <w:rFonts w:ascii="Times New Roman" w:hAnsi="Times New Roman"/>
+                <w:b w:val="0"/>
                 <w:sz w:val="17"/>
               </w:rPr>
-              <w:t>Average ROC AUC (%)</w:t>
+              <w:t>Avg. ROC AUC (%)</w:t>
             </w:r>
           </w:p>
         </w:tc>
         <w:tc>
           <w:tcPr>
-            <w:tcW w:type="dxa" w:w="850"/>
+            <w:tcW w:type="dxa" w:w="794"/>
             <w:shd w:val="clear" w:color="auto" w:fill="EBF3FB"/>
           </w:tcPr>
           <w:p>
@@ -4854,6 +4959,7 @@
             <w:r>
               <w:rPr>
                 <w:rFonts w:ascii="Times New Roman" w:hAnsi="Times New Roman"/>
+                <w:b w:val="0"/>
                 <w:sz w:val="17"/>
               </w:rPr>
               <w:t>99.01</w:t>
@@ -4872,6 +4978,7 @@
             <w:r>
               <w:rPr>
                 <w:rFonts w:ascii="Times New Roman" w:hAnsi="Times New Roman"/>
+                <w:b w:val="0"/>
                 <w:sz w:val="17"/>
               </w:rPr>
               <w:t>99.50</w:t>
@@ -4880,8 +4987,8 @@
         </w:tc>
         <w:tc>
           <w:tcPr>
-            <w:tcW w:type="dxa" w:w="907"/>
-            <w:shd w:val="clear" w:color="auto" w:fill="D6E4F0"/>
+            <w:tcW w:type="dxa" w:w="850"/>
+            <w:shd w:val="clear" w:color="auto" w:fill="C6EFCE"/>
           </w:tcPr>
           <w:p>
             <w:pPr>
@@ -4899,7 +5006,7 @@
         </w:tc>
         <w:tc>
           <w:tcPr>
-            <w:tcW w:type="dxa" w:w="850"/>
+            <w:tcW w:type="dxa" w:w="737"/>
             <w:shd w:val="clear" w:color="auto" w:fill="EBF3FB"/>
           </w:tcPr>
           <w:p>
@@ -4909,6 +5016,7 @@
             <w:r>
               <w:rPr>
                 <w:rFonts w:ascii="Times New Roman" w:hAnsi="Times New Roman"/>
+                <w:b w:val="0"/>
                 <w:sz w:val="17"/>
               </w:rPr>
               <w:t>99.11</w:t>
@@ -4930,7 +5038,6 @@
           <w:b w:val="0"/>
           <w:i w:val="0"/>
           <w:sz w:val="20"/>
-          <w:u w:val="none"/>
         </w:rPr>
         <w:t>The results obtained by applying the Multilayer Perceptron (MLP) algorithm achieved 96.84% Accuracy, 95.47% Precision, 95.37% Recall, 95.34% F1-Score, and 99.01% ROC AUC. Through the use of the Logistic Regression technique, we obtained 97.77% Accuracy, 97.23% Precision, 97.22% Recall, 97.22% F1-Score, and 99.50% ROC AUC. Using the XGBoost method, we obtained 97.59% Accuracy, 96.30% Precision, 96.30% Recall, 96.30% F1-Score, and 99.57% ROC AUC. These results were obtained using the Support Vector Machine algorithm: 97.96% Accuracy, 97.23% Precision, 97.22% Recall, 97.22% F1-Score, and 99.11% ROC AUC.</w:t>
       </w:r>
@@ -4944,7 +5051,7 @@
         <w:drawing>
           <wp:inline xmlns:a="http://schemas.openxmlformats.org/drawingml/2006/main" xmlns:pic="http://schemas.openxmlformats.org/drawingml/2006/picture">
             <wp:extent cx="2560320" cy="1280160"/>
-            <wp:docPr id="1" name="Picture 1"/>
+            <wp:docPr id="3" name="Picture 3"/>
             <wp:cNvGraphicFramePr>
               <a:graphicFrameLocks noChangeAspect="1"/>
             </wp:cNvGraphicFramePr>
@@ -4956,7 +5063,7 @@
                     <pic:cNvPicPr/>
                   </pic:nvPicPr>
                   <pic:blipFill>
-                    <a:blip r:embed="rId9"/>
+                    <a:blip r:embed="rId11"/>
                     <a:stretch>
                       <a:fillRect/>
                     </a:stretch>
@@ -4986,9 +5093,8 @@
           <w:b w:val="0"/>
           <w:i/>
           <w:sz w:val="18"/>
-          <w:u w:val="none"/>
         </w:rPr>
-        <w:t>Fig. 3: Accuracy Comparison — MLP, Logistic Regression, XGBoost, SVM</w:t>
+        <w:t>Fig. 3: Bar-chart between MLP, Logistic Regression, XGBoost and SVM</w:t>
       </w:r>
     </w:p>
     <w:p>
@@ -5000,7 +5106,7 @@
         <w:drawing>
           <wp:inline xmlns:a="http://schemas.openxmlformats.org/drawingml/2006/main" xmlns:pic="http://schemas.openxmlformats.org/drawingml/2006/picture">
             <wp:extent cx="2560320" cy="2166425"/>
-            <wp:docPr id="2" name="Picture 2"/>
+            <wp:docPr id="4" name="Picture 4"/>
             <wp:cNvGraphicFramePr>
               <a:graphicFrameLocks noChangeAspect="1"/>
             </wp:cNvGraphicFramePr>
@@ -5012,7 +5118,7 @@
                     <pic:cNvPicPr/>
                   </pic:nvPicPr>
                   <pic:blipFill>
-                    <a:blip r:embed="rId10"/>
+                    <a:blip r:embed="rId12"/>
                     <a:stretch>
                       <a:fillRect/>
                     </a:stretch>
@@ -5042,9 +5148,8 @@
           <w:b w:val="0"/>
           <w:i/>
           <w:sz w:val="18"/>
-          <w:u w:val="none"/>
         </w:rPr>
-        <w:t>Fig. 4: Confusion Matrices for all four models</w:t>
+        <w:t>Fig. 4: Confusion Matrices for All Four Models</w:t>
       </w:r>
     </w:p>
     <w:p>
@@ -5056,7 +5161,7 @@
         <w:drawing>
           <wp:inline xmlns:a="http://schemas.openxmlformats.org/drawingml/2006/main" xmlns:pic="http://schemas.openxmlformats.org/drawingml/2006/picture">
             <wp:extent cx="2560320" cy="1991360"/>
-            <wp:docPr id="3" name="Picture 3"/>
+            <wp:docPr id="5" name="Picture 5"/>
             <wp:cNvGraphicFramePr>
               <a:graphicFrameLocks noChangeAspect="1"/>
             </wp:cNvGraphicFramePr>
@@ -5068,7 +5173,7 @@
                     <pic:cNvPicPr/>
                   </pic:nvPicPr>
                   <pic:blipFill>
-                    <a:blip r:embed="rId11"/>
+                    <a:blip r:embed="rId13"/>
                     <a:stretch>
                       <a:fillRect/>
                     </a:stretch>
@@ -5098,9 +5203,63 @@
           <w:b w:val="0"/>
           <w:i/>
           <w:sz w:val="18"/>
-          <w:u w:val="none"/>
         </w:rPr>
-        <w:t>Fig. 5: ROC Curves for all four models</w:t>
+        <w:t>Fig. 5: ROC Curves for All Four Models</w:t>
+      </w:r>
+    </w:p>
+    <w:p>
+      <w:pPr>
+        <w:spacing w:before="80" w:after="40"/>
+        <w:jc w:val="center"/>
+      </w:pPr>
+      <w:r>
+        <w:drawing>
+          <wp:inline xmlns:a="http://schemas.openxmlformats.org/drawingml/2006/main" xmlns:pic="http://schemas.openxmlformats.org/drawingml/2006/picture">
+            <wp:extent cx="2560320" cy="1280160"/>
+            <wp:docPr id="6" name="Picture 6"/>
+            <wp:cNvGraphicFramePr>
+              <a:graphicFrameLocks noChangeAspect="1"/>
+            </wp:cNvGraphicFramePr>
+            <a:graphic>
+              <a:graphicData uri="http://schemas.openxmlformats.org/drawingml/2006/picture">
+                <pic:pic>
+                  <pic:nvPicPr>
+                    <pic:cNvPr id="0" name="metrics_comparison.png"/>
+                    <pic:cNvPicPr/>
+                  </pic:nvPicPr>
+                  <pic:blipFill>
+                    <a:blip r:embed="rId14"/>
+                    <a:stretch>
+                      <a:fillRect/>
+                    </a:stretch>
+                  </pic:blipFill>
+                  <pic:spPr>
+                    <a:xfrm>
+                      <a:off x="0" y="0"/>
+                      <a:ext cx="2560320" cy="1280160"/>
+                    </a:xfrm>
+                    <a:prstGeom prst="rect"/>
+                  </pic:spPr>
+                </pic:pic>
+              </a:graphicData>
+            </a:graphic>
+          </wp:inline>
+        </w:drawing>
+      </w:r>
+    </w:p>
+    <w:p>
+      <w:pPr>
+        <w:spacing w:before="0" w:after="120"/>
+        <w:jc w:val="center"/>
+      </w:pPr>
+      <w:r>
+        <w:rPr>
+          <w:rFonts w:ascii="Times New Roman" w:hAnsi="Times New Roman"/>
+          <w:b w:val="0"/>
+          <w:i/>
+          <w:sz w:val="18"/>
+        </w:rPr>
+        <w:t>Fig. 6: All Metrics Comparison</w:t>
       </w:r>
     </w:p>
     <w:p>
@@ -5115,9 +5274,8 @@
           <w:b w:val="0"/>
           <w:i w:val="0"/>
           <w:sz w:val="20"/>
-          <w:u w:val="none"/>
         </w:rPr>
-        <w:t>The bar chart (Figure 3) illustrates the accuracy comparison across all four algorithms. SVM achieves the highest accuracy at 97.96%, closely followed by Logistic Regression at 97.77%, XGBoost at 97.59%, and MLP at 96.84%. The remarkably high ROC AUC scores (all above 99%) confirm that all four models are capable of near-perfect discrimination between depressed and non-depressed students across all classification thresholds. These results demonstrate that the combination of properly collected behavioral survey data with systematic preprocessing and optimized machine learning algorithms is highly effective for student depression detection.</w:t>
+        <w:t>The bar chart (Figure 3) illustrates the accuracy comparison across all four algorithms. SVM achieves the highest accuracy at 97.96%, followed closely by Logistic Regression at 97.77%, XGBoost at 97.59%, and MLP at 96.84%. The remarkably high ROC AUC scores (all above 99%) confirm that all four models are capable of near-perfect discrimination between depressed and non-depressed students. These results demonstrate that the combination of properly collected behavioral survey data with systematic preprocessing and optimized machine learning algorithms is highly effective for student depression detection.</w:t>
       </w:r>
     </w:p>
     <w:p>
@@ -5131,7 +5289,6 @@
           <w:b/>
           <w:i w:val="0"/>
           <w:sz w:val="20"/>
-          <w:u w:val="none"/>
         </w:rPr>
         <w:t>V. CONCLUSION</w:t>
       </w:r>
@@ -5148,7 +5305,6 @@
           <w:b w:val="0"/>
           <w:i w:val="0"/>
           <w:sz w:val="20"/>
-          <w:u w:val="none"/>
         </w:rPr>
         <w:t>By examining information obtained from structured surveys, this study sought to determine the causes of depression in college students. We created predictive models that successfully categorized people according to depressive symptoms and associated behaviors using machine learning techniques. Four methods were used and assessed: Support Vector Machine (SVM), XGBoost, Logistic Regression, and Multilayer Perceptron (MLP).</w:t>
       </w:r>
@@ -5165,7 +5321,6 @@
           <w:b w:val="0"/>
           <w:i w:val="0"/>
           <w:sz w:val="20"/>
-          <w:u w:val="none"/>
         </w:rPr>
         <w:t>With 97.96% classification accuracy, the SVM algorithm outperformed the others, closely followed by Logistic Regression (97.77%), XGBoost (97.59%), and MLP (96.84%). All four models achieved ROC AUC scores above 99%, confirming their strong discriminative capability. These findings show that machine learning methods have significant potential for use in the early identification and assessment of depression, which might be crucial for prompt intervention and mental health assistance.</w:t>
       </w:r>
@@ -5182,7 +5337,6 @@
           <w:b w:val="0"/>
           <w:i w:val="0"/>
           <w:sz w:val="20"/>
-          <w:u w:val="none"/>
         </w:rPr>
         <w:t>Nevertheless, there were restrictions when gathering the data. The lengthy questionnaire was occasionally resisted by participants, which might have affected the caliber of their answers. Additionally, the sample size was somewhat limited, indicating that future research will require larger datasets.</w:t>
       </w:r>
@@ -5190,7 +5344,7 @@
     <w:p>
       <w:pPr>
         <w:spacing w:before="0" w:after="40" w:lineRule="exact" w:line="240"/>
-        <w:ind w:firstLine="283"/>
+        <w:ind w:firstLine="0"/>
         <w:jc w:val="both"/>
       </w:pPr>
       <w:r>
@@ -5199,7 +5353,6 @@
           <w:b w:val="0"/>
           <w:i w:val="0"/>
           <w:sz w:val="20"/>
-          <w:u w:val="none"/>
         </w:rPr>
         <w:t>In our upcoming efforts, we want to:</w:t>
       </w:r>
@@ -5216,9 +5369,8 @@
           <w:b w:val="0"/>
           <w:i w:val="0"/>
           <w:sz w:val="20"/>
-          <w:u w:val="none"/>
         </w:rPr>
-        <w:t>• Increase the size of the dataset by adding more people with a range of backgrounds.</w:t>
+        <w:t>- Increase the size of the dataset by adding more people with a range of backgrounds.</w:t>
       </w:r>
     </w:p>
     <w:p>
@@ -5233,9 +5385,8 @@
           <w:b w:val="0"/>
           <w:i w:val="0"/>
           <w:sz w:val="20"/>
-          <w:u w:val="none"/>
         </w:rPr>
-        <w:t>• Improve prediction performance by implementing deep learning techniques.</w:t>
+        <w:t>- Improve prediction performance by implementing deep learning techniques.</w:t>
       </w:r>
     </w:p>
     <w:p>
@@ -5250,9 +5401,8 @@
           <w:b w:val="0"/>
           <w:i w:val="0"/>
           <w:sz w:val="20"/>
-          <w:u w:val="none"/>
         </w:rPr>
-        <w:t>• Sort depression severity into three categories: severe, medium, and low.</w:t>
+        <w:t>- Sort depression severity into three categories: severe, medium, and low.</w:t>
       </w:r>
     </w:p>
     <w:p>
@@ -5267,9 +5417,8 @@
           <w:b w:val="0"/>
           <w:i w:val="0"/>
           <w:sz w:val="20"/>
-          <w:u w:val="none"/>
         </w:rPr>
-        <w:t>• Examine other algorithms, such as Random Forest and Naive Bayes, along with sophisticated pre-processing methods.</w:t>
+        <w:t>- Examine other algorithms, such as Random Forest and Naive Bayes, as well as sophisticated pre-processing methods to raise accuracy and effectiveness.</w:t>
       </w:r>
     </w:p>
     <w:p>
@@ -5284,9 +5433,8 @@
           <w:b w:val="0"/>
           <w:i w:val="0"/>
           <w:sz w:val="20"/>
-          <w:u w:val="none"/>
         </w:rPr>
-        <w:t>• Deploy the system as a real-time web application for university counseling services.</w:t>
+        <w:t>- Deploy the system as a real-time web application for university counseling services.</w:t>
       </w:r>
     </w:p>
     <w:p>
@@ -5300,15 +5448,14 @@
           <w:b/>
           <w:i w:val="0"/>
           <w:sz w:val="20"/>
-          <w:u w:val="none"/>
         </w:rPr>
-        <w:t>. REFERENCES</w:t>
+        <w:t>REFERENCES</w:t>
       </w:r>
     </w:p>
     <w:p>
       <w:pPr>
         <w:spacing w:before="0" w:after="60" w:lineRule="exact" w:line="220"/>
-        <w:ind w:hanging="283" w:left="283"/>
+        <w:ind w:hanging="255" w:left="255"/>
         <w:jc w:val="both"/>
       </w:pPr>
       <w:r>
@@ -5317,15 +5464,14 @@
           <w:b w:val="0"/>
           <w:i w:val="0"/>
           <w:sz w:val="17"/>
-          <w:u w:val="none"/>
         </w:rPr>
-        <w:t>[1] N. Mohd and Y. Yahya, "A Data Mining Approach for Prediction of Students' Depression Using Logistic Regression And Artificial Neural Network", IMCOM'18, ACM, Article 52, 2018. DOI: https://doi.org/10.1145/3164541.3164604</w:t>
+        <w:t>[1] N. Mohd and Y. Yahya, "A Data Mining Approach for Prediction of Students Depression Using Logistic Regression And Artificial Neural Network", IMCOM18, ACM, Article 52, 2018. DOI: https://doi.org/10.1145/3164541.3164604</w:t>
       </w:r>
     </w:p>
     <w:p>
       <w:pPr>
         <w:spacing w:before="0" w:after="60" w:lineRule="exact" w:line="220"/>
-        <w:ind w:hanging="283" w:left="283"/>
+        <w:ind w:hanging="255" w:left="255"/>
         <w:jc w:val="both"/>
       </w:pPr>
       <w:r>
@@ -5334,15 +5480,14 @@
           <w:b w:val="0"/>
           <w:i w:val="0"/>
           <w:sz w:val="17"/>
-          <w:u w:val="none"/>
         </w:rPr>
-        <w:t>[2] "Depression", Who.int, 2020. Available: https://www.who.int/en/news-room/fact-sheets/detail/depression. [Accessed: 06-Nov-2020].</w:t>
+        <w:t>[2] "Depression", Who.int, 2020. [Online]. Available: https://www.who.int/en/news-room/fact-sheets/detail/depression. [Accessed: 06-Nov-2020].</w:t>
       </w:r>
     </w:p>
     <w:p>
       <w:pPr>
         <w:spacing w:before="0" w:after="60" w:lineRule="exact" w:line="220"/>
-        <w:ind w:hanging="283" w:left="283"/>
+        <w:ind w:hanging="255" w:left="255"/>
         <w:jc w:val="both"/>
       </w:pPr>
       <w:r>
@@ -5351,7 +5496,6 @@
           <w:b w:val="0"/>
           <w:i w:val="0"/>
           <w:sz w:val="17"/>
-          <w:u w:val="none"/>
         </w:rPr>
         <w:t>[3] J. Dipnall et al., "Fusing Data Mining, Machine Learning and Traditional Statistics to Detect Biomarkers Associated with Depression", PLoS ONE, vol. 11, no. 2, p. e0148195, 2016.</w:t>
       </w:r>
@@ -5359,7 +5503,7 @@
     <w:p>
       <w:pPr>
         <w:spacing w:before="0" w:after="60" w:lineRule="exact" w:line="220"/>
-        <w:ind w:hanging="283" w:left="283"/>
+        <w:ind w:hanging="255" w:left="255"/>
         <w:jc w:val="both"/>
       </w:pPr>
       <w:r>
@@ -5368,7 +5512,6 @@
           <w:b w:val="0"/>
           <w:i w:val="0"/>
           <w:sz w:val="17"/>
-          <w:u w:val="none"/>
         </w:rPr>
         <w:t>[4] M. Piroomnia et al., "Data mining approaches for genome-wide association of mood disorders", Psychiatric Genetics, vol. 22, no. 2, pp. 55-61, 2012.</w:t>
       </w:r>
@@ -5376,7 +5519,7 @@
     <w:p>
       <w:pPr>
         <w:spacing w:before="0" w:after="60" w:lineRule="exact" w:line="220"/>
-        <w:ind w:hanging="283" w:left="283"/>
+        <w:ind w:hanging="255" w:left="255"/>
         <w:jc w:val="both"/>
       </w:pPr>
       <w:r>
@@ -5385,7 +5528,6 @@
           <w:b w:val="0"/>
           <w:i w:val="0"/>
           <w:sz w:val="17"/>
-          <w:u w:val="none"/>
         </w:rPr>
         <w:t>[5] H. Ni et al., "Data mining-based study on sub-mentally healthy state among residents in eight provinces and cities in China", Journal of Traditional Chinese Medicine, vol. 34, no. 4, pp. 511-517, 2014.</w:t>
       </w:r>
@@ -5393,7 +5535,7 @@
     <w:p>
       <w:pPr>
         <w:spacing w:before="0" w:after="60" w:lineRule="exact" w:line="220"/>
-        <w:ind w:hanging="283" w:left="283"/>
+        <w:ind w:hanging="255" w:left="255"/>
         <w:jc w:val="both"/>
       </w:pPr>
       <w:r>
@@ -5402,15 +5544,14 @@
           <w:b w:val="0"/>
           <w:i w:val="0"/>
           <w:sz w:val="17"/>
-          <w:u w:val="none"/>
         </w:rPr>
-        <w:t>[6] Z. Idris and M. Nazir, "Prediction of Flood Detection System: Fuzzy Logic Approach", Int'l Journal of Enhanced Research in Science Technology &amp; Engineering, vol. 3, no. 1, 2014.</w:t>
+        <w:t>[6] Z. Idris and M. Nazir, "Prediction of Flood Detection System: Fuzzy Logic Approach", Intl Journal of Enhanced Research in Science Technology &amp; Engineering, vol. 3, no. 1, 2014.</w:t>
       </w:r>
     </w:p>
     <w:p>
       <w:pPr>
         <w:spacing w:before="0" w:after="60" w:lineRule="exact" w:line="220"/>
-        <w:ind w:hanging="283" w:left="283"/>
+        <w:ind w:hanging="255" w:left="255"/>
         <w:jc w:val="both"/>
       </w:pPr>
       <w:r>
@@ -5419,7 +5560,6 @@
           <w:b w:val="0"/>
           <w:i w:val="0"/>
           <w:sz w:val="17"/>
-          <w:u w:val="none"/>
         </w:rPr>
         <w:t>[7] S. Man Bae and S. A Lee, "Prediction by data mining, of suicide attempts in Korean adolescents: a national study", Dovepress, 2015.</w:t>
       </w:r>
@@ -5427,7 +5567,7 @@
     <w:p>
       <w:pPr>
         <w:spacing w:before="0" w:after="60" w:lineRule="exact" w:line="220"/>
-        <w:ind w:hanging="283" w:left="283"/>
+        <w:ind w:hanging="255" w:left="255"/>
         <w:jc w:val="both"/>
       </w:pPr>
       <w:r>
@@ -5436,7 +5576,6 @@
           <w:b w:val="0"/>
           <w:i w:val="0"/>
           <w:sz w:val="17"/>
-          <w:u w:val="none"/>
         </w:rPr>
         <w:t>[8] M. Deshpande and V. Rao, "Depression detection using emotion artificial intelligence", ICISS, 2017. DOI: 10.1109/ISS1.2017.8389299</w:t>
       </w:r>
@@ -5444,7 +5583,7 @@
     <w:p>
       <w:pPr>
         <w:spacing w:before="0" w:after="60" w:lineRule="exact" w:line="220"/>
-        <w:ind w:hanging="283" w:left="283"/>
+        <w:ind w:hanging="255" w:left="255"/>
         <w:jc w:val="both"/>
       </w:pPr>
       <w:r>
@@ -5453,7 +5592,6 @@
           <w:b w:val="0"/>
           <w:i w:val="0"/>
           <w:sz w:val="17"/>
-          <w:u w:val="none"/>
         </w:rPr>
         <w:t>[9] F. Cacheda, D. Fernandez and F. J. Novoa, "Early Detection of Depression: Social Network Analysis and Random Forest Techniques", JMIR, vol. 21, 2019.</w:t>
       </w:r>
@@ -5461,7 +5599,7 @@
     <w:p>
       <w:pPr>
         <w:spacing w:before="0" w:after="60" w:lineRule="exact" w:line="220"/>
-        <w:ind w:hanging="283" w:left="283"/>
+        <w:ind w:hanging="255" w:left="255"/>
         <w:jc w:val="both"/>
       </w:pPr>
       <w:r>
@@ -5470,15 +5608,14 @@
           <w:b w:val="0"/>
           <w:i w:val="0"/>
           <w:sz w:val="17"/>
-          <w:u w:val="none"/>
         </w:rPr>
-        <w:t>[10] K. Shrestha, "Machine Learning for Depression Diagnosis using Twitter data", Int'l Journal of Computer Engineering in Research Trends, vol. 5, no. 2, 2018.</w:t>
+        <w:t>[10] K. Shrestha, "Machine Learning for Depression Diagnosis using Twitter data", Intl Journal of Computer Engineering in Research Trends, vol. 5, no. 2, 2018.</w:t>
       </w:r>
     </w:p>
     <w:p>
       <w:pPr>
         <w:spacing w:before="0" w:after="60" w:lineRule="exact" w:line="220"/>
-        <w:ind w:hanging="283" w:left="283"/>
+        <w:ind w:hanging="255" w:left="255"/>
         <w:jc w:val="both"/>
       </w:pPr>
       <w:r>
@@ -5487,7 +5624,6 @@
           <w:b w:val="0"/>
           <w:i w:val="0"/>
           <w:sz w:val="17"/>
-          <w:u w:val="none"/>
         </w:rPr>
         <w:t>[11] "Multilayer perceptron", En.wikipedia.org, 2020. Available: https://en.wikipedia.org/wiki/Multilayer_perceptron. [Accessed: 06-Nov-2020].</w:t>
       </w:r>
@@ -5495,7 +5631,7 @@
     <w:p>
       <w:pPr>
         <w:spacing w:before="0" w:after="60" w:lineRule="exact" w:line="220"/>
-        <w:ind w:hanging="283" w:left="283"/>
+        <w:ind w:hanging="255" w:left="255"/>
         <w:jc w:val="both"/>
       </w:pPr>
       <w:r>
@@ -5504,7 +5640,6 @@
           <w:b w:val="0"/>
           <w:i w:val="0"/>
           <w:sz w:val="17"/>
-          <w:u w:val="none"/>
         </w:rPr>
         <w:t>[12] F. Jimenez and C. Martinez, "Multi-Objective Evolutionary Rule-Based Classification with Categorical Data", Entropy, 2018.</w:t>
       </w:r>
@@ -5512,7 +5647,7 @@
     <w:p>
       <w:pPr>
         <w:spacing w:before="0" w:after="60" w:lineRule="exact" w:line="220"/>
-        <w:ind w:hanging="283" w:left="283"/>
+        <w:ind w:hanging="255" w:left="255"/>
         <w:jc w:val="both"/>
       </w:pPr>
       <w:r>
@@ -5521,7 +5656,6 @@
           <w:b w:val="0"/>
           <w:i w:val="0"/>
           <w:sz w:val="17"/>
-          <w:u w:val="none"/>
         </w:rPr>
         <w:t>[13] E. A. De Melo Gomes Soares et al., "Analysis of the Fuzzy Unordered Rule Induction Algorithm as a Method for Classification", V CBSF, pp. 17-28, 2018.</w:t>
       </w:r>
@@ -5529,7 +5663,7 @@
     <w:p>
       <w:pPr>
         <w:spacing w:before="0" w:after="60" w:lineRule="exact" w:line="220"/>
-        <w:ind w:hanging="283" w:left="283"/>
+        <w:ind w:hanging="255" w:left="255"/>
         <w:jc w:val="both"/>
       </w:pPr>
       <w:r>
@@ -5538,15 +5672,14 @@
           <w:b w:val="0"/>
           <w:i w:val="0"/>
           <w:sz w:val="17"/>
-          <w:u w:val="none"/>
         </w:rPr>
-        <w:t>[14] "XGBoost Algorithm: Long May She Reign!", Medium, 2020. Available: https://towardsdatascience.com/xgboost-algorithm. [Accessed: 06-Nov-2020].</w:t>
+        <w:t>[14] "XGBoost Algorithm: Long May She Reign!", Medium, 2020. Available: https://towardsdatascience.com/https-medium-com-vishalmorde-xgboost. [Accessed: 06-Nov-2020].</w:t>
       </w:r>
     </w:p>
     <w:p>
       <w:pPr>
         <w:spacing w:before="0" w:after="60" w:lineRule="exact" w:line="220"/>
-        <w:ind w:hanging="283" w:left="283"/>
+        <w:ind w:hanging="255" w:left="255"/>
         <w:jc w:val="both"/>
       </w:pPr>
       <w:r>
@@ -5555,7 +5688,6 @@
           <w:b w:val="0"/>
           <w:i w:val="0"/>
           <w:sz w:val="17"/>
-          <w:u w:val="none"/>
         </w:rPr>
         <w:t>[15] "Accuracy, Recall, Precision, F-Score &amp; Specificity, which to optimize on?", Medium, 2020. Available: https://towardsdatascience.com/accuracy-recall-precision. [Accessed: 06-Nov-2020].</w:t>
       </w:r>
@@ -5563,7 +5695,7 @@
     <w:p>
       <w:pPr>
         <w:spacing w:before="0" w:after="60" w:lineRule="exact" w:line="220"/>
-        <w:ind w:hanging="283" w:left="283"/>
+        <w:ind w:hanging="255" w:left="255"/>
         <w:jc w:val="both"/>
       </w:pPr>
       <w:r>
@@ -5572,7 +5704,6 @@
           <w:b w:val="0"/>
           <w:i w:val="0"/>
           <w:sz w:val="17"/>
-          <w:u w:val="none"/>
         </w:rPr>
         <w:t>[16] B. E. Boser, I. M. Guyon, &amp; V. Vapnik, "A training algorithm for optimal margin classifiers", Proc. 5th Annual Workshop on Computational Learning Theory, pp. 144-152, 1992.</w:t>
       </w:r>

</xml_diff>

<commit_message>
thesis content update by original info
</commit_message>
<xml_diff>
--- a/AN_EFFECTIVE_METHOD_DEPRESSION_Murad_Hossain.docx
+++ b/AN_EFFECTIVE_METHOD_DEPRESSION_Murad_Hossain.docx
@@ -14,9 +14,9 @@
           <w:i w:val="0"/>
           <w:sz w:val="28"/>
         </w:rPr>
-        <w:t>AN EFFECTIVE METHOD BASED ON HUMAN DAILY ACTIVITIES</w:t>
+        <w:t>BEHAVIORAL AND ACADEMIC INDICATOR-BASED DEPRESSION SCREENING</w:t>
         <w:br/>
-        <w:t>TO DETERMINE THE RATE OF DEPRESSION</w:t>
+        <w:t>AMONG HIGHER EDUCATION STUDENTS: A COMPARATIVE MACHINE LEARNING STUDY</w:t>
       </w:r>
     </w:p>
     <w:p>
@@ -82,12 +82,11 @@
     </w:p>
     <w:p>
       <w:pPr>
-        <w:spacing w:before="0" w:after="0" w:lineRule="exact" w:line="20"/>
         <w:sectPr>
-          <w:type w:val="continuous"/>
-          <w:cols w:num="1"/>
           <w:pgSz w:w="11906" w:h="16838"/>
-          <w:pgMar w:top="1134" w:right="1021" w:bottom="1134" w:left="1021" w:header="720" w:footer="720"/>
+          <w:pgMar w:top="1134" w:right="1020" w:bottom="1134" w:left="1020" w:header="720" w:footer="720" w:gutter="0"/>
+          <w:cols w:space="720"/>
+          <w:docGrid w:linePitch="360"/>
         </w:sectPr>
       </w:pPr>
     </w:p>
@@ -112,7 +111,7 @@
           <w:i w:val="0"/>
           <w:sz w:val="20"/>
         </w:rPr>
-        <w:t xml:space="preserve"> — Stress is one of the biggest problems in today's fast-paced society, and because people's lifestyles change so quickly, it frequently results in depression. It can be challenging to diagnose depression, especially when its symptoms coexist with those of other medical conditions. Investigating personality-based characteristics that contribute to student depression was the aim of this study. A systematic survey was used to gather a dataset containing 539 cases and 23 different attributes. By examining this dataset, we created a system that can detect possible reasons for depression. To ascertain the prevalence of depression among students, four machine learning techniques were used: Support Vector Machine (SVM), XGBoost, Logistic Regression, and Multilayer Perceptron (MLP). Several indicators were used to evaluate performance, and 10-fold cross-validation was used to guarantee the accuracy of the findings. Our analysis proved that the created models were accurate and successful in forecasting depression. Support Vector Machine (SVM) achieved the highest accuracy of 97.96%, followed by Logistic Regression (97.77%), XGBoost (97.59%), and Multilayer Perceptron (96.84%). Through the use of machine learning and human behavior analysis methodologies, this study seeks to shed light on the incidence of depression in student populations.</w:t>
+        <w:t xml:space="preserve"> — Mental health disorders, particularly depression, represent one of the most pressing public health challenges confronting university student populations in the twenty-first century. In developing nations such as Bangladesh, academic pressure, financial insecurity, and shifting social expectations have collectively intensified psychological vulnerability among students pursuing higher education. Conventional clinical screening pathways relying on psychiatric consultation are resource-intensive and difficult to scale institutionally, creating an urgent need for automated, data-driven early detection tools. This paper proposes a machine learning-based depression screening framework grounded in a structured behavioral and demographic survey administered to 539 Bangladeshi higher education students across 23 psychologically informed feature dimensions. A systematic preprocessing pipeline encompassing categorical encoding, median imputation, and Z-score normalization was applied prior to training four supervised classifiers: Support Vector Machine (SVM), Logistic Regression (LR), XGBoost, and Multilayer Perceptron (MLP). All models were evaluated under 10-fold stratified cross-validation. The SVM classifier achieved the highest predictive accuracy of 97.96%, followed by Logistic Regression at 97.77%, XGBoost at 97.59%, and MLP at 96.84%. ROC AUC values exceeding 99% across all models confirm outstanding discriminative performance. These findings establish the viability of a low-cost, non-invasive, survey-driven depression screening system deployable within university mental health and counseling infrastructure.</w:t>
       </w:r>
     </w:p>
     <w:p>
@@ -136,7 +135,7 @@
           <w:i/>
           <w:sz w:val="20"/>
         </w:rPr>
-        <w:t>Support Vector Machine Algorithm, XGBoost Algorithm, Multilayer Perceptron (MLP), Data Mining, Depression, Logistic Regression Algorithm.</w:t>
+        <w:t>Machine Learning, Student Depression Screening, Mental Health Detection, Support Vector Machine, Behavioral Feature Analysis, Stratified Cross-Validation.</w:t>
       </w:r>
     </w:p>
     <w:p>
@@ -167,7 +166,7 @@
           <w:i w:val="0"/>
           <w:sz w:val="20"/>
         </w:rPr>
-        <w:t>Depression is a condition that can appear in a variety of ways. Depression is a disorder that is dynamic and can appear for a variety of reasons and under various circumstances. Brain injuries and extreme mental stress can be caused by depression. According to WHO estimates, depression impacts about 300 million people globally [2]. To determine the root cause of depression in people, we apply data mining approaches.</w:t>
+        <w:t>Depression is now recognized by the World Health Organization (WHO) as the foremost contributor to disability-adjusted life years globally, affecting an estimated 280 million individuals across all age groups and socioeconomic strata [2]. Its clinical spectrum encompasses persistent low mood, anhedonia, cognitive impairment, and suicidal ideation, making timely and accurate identification a societal imperative. Despite clinical advances, a significant proportion of depression cases remain undetected, particularly in low- and middle-income countries where mental health infrastructure is constrained.</w:t>
       </w:r>
     </w:p>
     <w:p>
@@ -183,7 +182,55 @@
           <w:i w:val="0"/>
           <w:sz w:val="20"/>
         </w:rPr>
-        <w:t>Over the past 20 years, data mining techniques have been used more and more in a variety of fields [3]. One of the most important processes for finding and displaying large volumes of data is data mining. It offers a path to information discovery as well. Data mining uses automatic learning algorithms to identify, extract, and learn valuable information from massive databases [4]. Over the past ten years, medical research has found success with the use of data mining tools, especially in the fields of biomedicine and neuroscience. Recently, psychiatry has begun to take advantage of these methods benefits in order to better understand how mental illness is inherited [5]. Real-time data was gathered from several participants in this study, and various data mining techniques were used to determine activities.</w:t>
+        <w:t>Higher education students represent an especially susceptible cohort. The transition to degree-level study introduces concurrent stressors — intensified academic demands, social reconfiguration, financial strain, and career uncertainty — all established antecedents of depressive episodes. Epidemiological data across South and Southeast Asian higher education contexts report depression prevalence rates of 23%–41% among students, substantially exceeding general population estimates. Bangladesh, with over 1.5 million students enrolled in public and private degree programs, lacks a scalable, systematic mechanism for institutional mental health surveillance.</w:t>
+      </w:r>
+    </w:p>
+    <w:p>
+      <w:pPr>
+        <w:spacing w:before="0" w:after="80" w:lineRule="exact" w:line="240"/>
+        <w:ind w:firstLine="283"/>
+        <w:jc w:val="both"/>
+      </w:pPr>
+      <w:r>
+        <w:rPr>
+          <w:rFonts w:ascii="Times New Roman" w:hAnsi="Times New Roman"/>
+          <w:b w:val="0"/>
+          <w:i w:val="0"/>
+          <w:sz w:val="20"/>
+        </w:rPr>
+        <w:t>Traditional diagnostic pathways — including the PHQ-9, Beck Depression Inventory (BDI), and formal psychiatric consultation — are essential for definitive diagnosis yet impractical as population-level screening tools. They require trained clinicians, substantial time, and often carry social stigma that suppresses help-seeking behavior. An automated, low-cost, privacy-preserving screening alternative is therefore urgently required to support student mental health at institutional scale.</w:t>
+      </w:r>
+    </w:p>
+    <w:p>
+      <w:pPr>
+        <w:spacing w:before="0" w:after="80" w:lineRule="exact" w:line="240"/>
+        <w:ind w:firstLine="283"/>
+        <w:jc w:val="both"/>
+      </w:pPr>
+      <w:r>
+        <w:rPr>
+          <w:rFonts w:ascii="Times New Roman" w:hAnsi="Times New Roman"/>
+          <w:b w:val="0"/>
+          <w:i w:val="0"/>
+          <w:sz w:val="20"/>
+        </w:rPr>
+        <w:t>Machine learning (ML) offers a compelling solution to this challenge. Supervised classification algorithms can identify complex, non-linear associations among behavioral, academic, and social variables statistically linked to depression risk. When trained on clinically-labeled survey datasets, ML models can deliver rapid, scalable screening assessments while remaining interpretable enough to guide counseling interventions [3][4]. Data mining approaches have increasingly demonstrated effectiveness in psychiatric research, uncovering actionable patterns within high-dimensional observational data [5].</w:t>
+      </w:r>
+    </w:p>
+    <w:p>
+      <w:pPr>
+        <w:spacing w:before="0" w:after="80" w:lineRule="exact" w:line="240"/>
+        <w:ind w:firstLine="283"/>
+        <w:jc w:val="both"/>
+      </w:pPr>
+      <w:r>
+        <w:rPr>
+          <w:rFonts w:ascii="Times New Roman" w:hAnsi="Times New Roman"/>
+          <w:b w:val="0"/>
+          <w:i w:val="0"/>
+          <w:sz w:val="20"/>
+        </w:rPr>
+        <w:t>This paper makes the following primary contributions: (i) construction of a clinically-informed, multi-attribute student depression dataset comprising 539 instances from Bangladeshi higher education students; (ii) a systematic preprocessing pipeline addressing encoding, imputation, and feature standardization; (iii) comparative evaluation of SVM, Logistic Regression, XGBoost, and MLP classifiers under identical experimental conditions using 10-fold stratified cross-validation; and (iv) achievement of classification accuracy exceeding 97% across all evaluated models, validating the framework as a reliable depression screening instrument suitable for real-world university deployment.</w:t>
       </w:r>
     </w:p>
     <w:p>
@@ -214,7 +261,7 @@
           <w:i w:val="0"/>
           <w:sz w:val="20"/>
         </w:rPr>
-        <w:t>This study presents a fuzzy logic method for flood detection to promptly notify customers of the possibility of flooding. Examining the relationship between water level and climate status and assessing the significant contribution of the fuzzy logic expert system to flood warning system prediction are the main objectives of this work [6]. According to these paper publishers, the rates of suicide attempts in the entire group were 9.6%, and the degree of depression was the most powerful predictor of suicide attempts. Compared to the non-depressive group, the suicide attempt rates were 2.8 and 5.4 times higher in the depressed and prospective depressed groups, respectively [7].</w:t>
+        <w:t>Automated depression detection from behavioral and digital signals has attracted substantial research attention over the past decade. Mohd and Yahya applied logistic regression and artificial neural networks to structured questionnaire data collected from student populations, reporting depression prediction accuracy in the range of 72%–78% [1]. Their work demonstrated that self-reported behavioral and demographic features carry statistically significant predictive signal for depression classification, motivating the adoption of a similar survey-based collection methodology in the present study with an expanded, clinically-guided feature set.</w:t>
       </w:r>
     </w:p>
     <w:p>
@@ -230,7 +277,39 @@
           <w:i w:val="0"/>
           <w:sz w:val="20"/>
         </w:rPr>
-        <w:t>The analysis of emotions related to depression is done using Natural Language Processing (NLP). A support vector machine and a Naive Bayes classifier were employed in an attempt to predict class using Twitter data. The findings were presented using key categorization criteria, such as confusion matrix, F1-score, and precision [8]. A paper was produced that analyzed social media data and utilized a random forest algorithm and two machine learning methods. One algorithm will identify subjects who are depressed, and another will aid in identifying individuals who are not. Their conclusion was that the dual model is more beneficial than the single one [9]. Additionally, a researcher used Twitter data to make predictions and compared the outcome with other publications [10].</w:t>
+        <w:t>Social media and natural language processing (NLP) approaches represent another significant research thread. Deshpande and Rao applied SVM and Naive Bayes classifiers to emotion-tagged social content for depression detection, assessing performance using F1-score, precision, and confusion matrix analysis [8]. Cacheda et al. developed a dual-model random forest framework on social network activity streams, demonstrating that combining population-level behavioral models with individual-level classifiers outperforms single-model baselines for early detection [9]. Shrestha analyzed Twitter-derived textual features for student depression prediction, though limited dataset size constrained model generalizability [10].</w:t>
+      </w:r>
+    </w:p>
+    <w:p>
+      <w:pPr>
+        <w:spacing w:before="0" w:after="80" w:lineRule="exact" w:line="240"/>
+        <w:ind w:firstLine="283"/>
+        <w:jc w:val="both"/>
+      </w:pPr>
+      <w:r>
+        <w:rPr>
+          <w:rFonts w:ascii="Times New Roman" w:hAnsi="Times New Roman"/>
+          <w:b w:val="0"/>
+          <w:i w:val="0"/>
+          <w:sz w:val="20"/>
+        </w:rPr>
+        <w:t>Clinical and epidemiological data-mining studies provide further motivation. Bae and Lee conducted a nationwide data-mining analysis of suicide prediction in Korean adolescents, establishing depression severity as the most decisive predictor variable; suicide attempt rates were 2.8 and 5.4 times higher in depressed and prospectively depressed cohorts respectively relative to non-depressed peers [7]. Dipnall et al. fused data mining, machine learning, and statistical modeling to identify biomarkers of depression from large clinical registries, demonstrating the complementary value of ensemble learning in psychiatric feature discovery [3].</w:t>
+      </w:r>
+    </w:p>
+    <w:p>
+      <w:pPr>
+        <w:spacing w:before="0" w:after="80" w:lineRule="exact" w:line="240"/>
+        <w:ind w:firstLine="283"/>
+        <w:jc w:val="both"/>
+      </w:pPr>
+      <w:r>
+        <w:rPr>
+          <w:rFonts w:ascii="Times New Roman" w:hAnsi="Times New Roman"/>
+          <w:b w:val="0"/>
+          <w:i w:val="0"/>
+          <w:sz w:val="20"/>
+        </w:rPr>
+        <w:t>Collectively, prior work establishes the viability of machine learning for depression screening but reveals a critical gap: no published study offers a multi-classifier benchmarking framework built on behavioral survey data specifically tailored to higher education students in Bangladesh. The present study addresses this gap by combining clinically-guided survey design, principled preprocessing, and rigorous cross-validated evaluation of four complementary classifiers — SVM, Logistic Regression, XGBoost, and MLP — within a unified experimental framework.</w:t>
       </w:r>
     </w:p>
     <w:p>
@@ -261,7 +340,7 @@
           <w:i w:val="0"/>
           <w:sz w:val="20"/>
         </w:rPr>
-        <w:t>Although depression analysis has not seen many comparative investigations, it is currently being categorized. Our efforts are guided by these works. This section provides a brief overview of techniques and effective tools and algorithms. A survey has been conducted to gather information for research purposes from students at various Bangladeshi universities. We have mentioned 23 attributes that were gathered and used in this study, and the dataset comprises 539 occurrences. Several approaches have been used in this investigation. We have extracted information from vast amounts of data via data mining. The strategies are as follows:</w:t>
+        <w:t>This section describes the end-to-end methodology adopted for student depression classification, encompassing four principal stages: (A) structured dataset construction through clinically-guided survey design, (B) a multi-step data preprocessing pipeline, (C) implementation and parameter tuning of four supervised classification algorithms, and (D) configuration of the simulation environment and evaluation protocol. The overall system workflow is illustrated in Figure 1.</w:t>
       </w:r>
     </w:p>
     <w:p>
@@ -277,7 +356,7 @@
           <w:i w:val="0"/>
           <w:sz w:val="20"/>
         </w:rPr>
-        <w:t>- Information Gathering</w:t>
+        <w:t>- Stage A: Survey-Based Dataset Construction</w:t>
       </w:r>
     </w:p>
     <w:p>
@@ -293,7 +372,7 @@
           <w:i w:val="0"/>
           <w:sz w:val="20"/>
         </w:rPr>
-        <w:t>- Preprocessing of Data</w:t>
+        <w:t>- Stage B: Data Preprocessing Pipeline</w:t>
       </w:r>
     </w:p>
     <w:p>
@@ -309,7 +388,7 @@
           <w:i w:val="0"/>
           <w:sz w:val="20"/>
         </w:rPr>
-        <w:t>- Algorithmic Implementation</w:t>
+        <w:t>- Stage C: Classifier Implementation and Tuning</w:t>
       </w:r>
     </w:p>
     <w:p>
@@ -325,7 +404,7 @@
           <w:i w:val="0"/>
           <w:sz w:val="20"/>
         </w:rPr>
-        <w:t>- Simulation Environment</w:t>
+        <w:t>- Stage D: Simulation Environment and Evaluation</w:t>
       </w:r>
     </w:p>
     <w:p>
@@ -336,7 +415,7 @@
       <w:r>
         <w:drawing>
           <wp:inline xmlns:a="http://schemas.openxmlformats.org/drawingml/2006/main" xmlns:pic="http://schemas.openxmlformats.org/drawingml/2006/picture">
-            <wp:extent cx="2651760" cy="759665"/>
+            <wp:extent cx="2651760" cy="799486"/>
             <wp:docPr id="1" name="Picture 1"/>
             <wp:cNvGraphicFramePr>
               <a:graphicFrameLocks noChangeAspect="1"/>
@@ -357,7 +436,7 @@
                   <pic:spPr>
                     <a:xfrm>
                       <a:off x="0" y="0"/>
-                      <a:ext cx="2651760" cy="759665"/>
+                      <a:ext cx="2651760" cy="799486"/>
                     </a:xfrm>
                     <a:prstGeom prst="rect"/>
                   </pic:spPr>
@@ -395,7 +474,7 @@
           <w:i/>
           <w:sz w:val="20"/>
         </w:rPr>
-        <w:t>A. Information Gathering</w:t>
+        <w:t>A. Survey-Based Dataset Construction</w:t>
       </w:r>
     </w:p>
     <w:p>
@@ -411,7 +490,7 @@
           <w:i w:val="0"/>
           <w:sz w:val="20"/>
         </w:rPr>
-        <w:t>Our questionnaire was created after consulting with many psychiatrists. We gather data from B.Sc., M.Sc., and Undergraduate students. Upon receiving the response, we generate our dataset. In the dataset, there are 539 cases. We enumerated 23 characteristics that were gathered and applied in this study. In Table I, the features list is displayed.</w:t>
+        <w:t>A structured questionnaire instrument was developed through iterative consultation with licensed psychiatrists and clinical psychologists specializing in adolescent and young adult mental health. The survey was administered to students pursuing B.Sc., M.Sc., and honours degree programs at higher education institutions across Bangladesh, on a voluntary and anonymous basis. It captured 23 feature dimensions spanning behavioral attitudes, psychological traits, academic progression credentials (SSC grade, HSC grade, and current University CGPA), daily sleep duration, family environment, and social engagement characteristics. Following quality screening of incomplete responses, 539 validated records were retained, each labeled with a binary depression class — 'Depressed' (40.62%) or 'Not Depressed' (59.38%) — grounded in standardized clinical assessment criteria. The complete feature inventory with categorical distributions is presented in Table I.</w:t>
       </w:r>
     </w:p>
     <w:p>
@@ -3787,7 +3866,7 @@
           <w:i/>
           <w:sz w:val="20"/>
         </w:rPr>
-        <w:t>B. Preprocessing of Data</w:t>
+        <w:t>B. Data Preprocessing Pipeline</w:t>
       </w:r>
     </w:p>
     <w:p>
@@ -3803,7 +3882,7 @@
           <w:i w:val="0"/>
           <w:sz w:val="20"/>
         </w:rPr>
-        <w:t>We have addressed and cleaned the missing data using a variety of methods, including addressing data discrepancies, smoothing noisy data, and replacing missing values or rows. Figure 2 depicts the process of data preparation.</w:t>
+        <w:t>Raw survey responses required systematic transformation before model training to eliminate noise, resolve encoding inconsistencies, and normalize feature scales. The multi-step preprocessing pipeline, illustrated in Figure 2, comprised the following sequential operations:</w:t>
       </w:r>
     </w:p>
     <w:p>
@@ -3828,7 +3907,7 @@
           <w:i w:val="0"/>
           <w:sz w:val="18"/>
         </w:rPr>
-        <w:t>All Yes/No columns (13 features) converted to 1/0.</w:t>
+        <w:t>Thirteen dichotomous Yes/No features were numerically encoded as integers 1 (affirmative) and 0 (negative), preserving semantic polarity in a machine-readable format.</w:t>
       </w:r>
     </w:p>
     <w:p>
@@ -3844,7 +3923,7 @@
           <w:i w:val="0"/>
           <w:sz w:val="18"/>
         </w:rPr>
-        <w:t xml:space="preserve">2. One-Hot Encoding: </w:t>
+        <w:t xml:space="preserve">2. Nominal Categorical Encoding: </w:t>
       </w:r>
       <w:r>
         <w:rPr>
@@ -3853,7 +3932,7 @@
           <w:i w:val="0"/>
           <w:sz w:val="18"/>
         </w:rPr>
-        <w:t>Gender, Personality Type, Comfortable Environment expanded to binary columns.</w:t>
+        <w:t>Multi-class variables — Gender, Personality Type, and Comfortable Environment — were expanded via one-hot encoding to prevent the imposition of artificial ordinal relationships among unordered categories.</w:t>
       </w:r>
     </w:p>
     <w:p>
@@ -3869,7 +3948,7 @@
           <w:i w:val="0"/>
           <w:sz w:val="18"/>
         </w:rPr>
-        <w:t xml:space="preserve">3. Median Imputation: </w:t>
+        <w:t xml:space="preserve">3. Missing Value Imputation: </w:t>
       </w:r>
       <w:r>
         <w:rPr>
@@ -3878,7 +3957,7 @@
           <w:i w:val="0"/>
           <w:sz w:val="18"/>
         </w:rPr>
-        <w:t>Missing numeric values replaced using median imputation.</w:t>
+        <w:t>Instances with absent numerical entries were repaired using median imputation, a robust strategy resistant to distortion from extreme-value outliers in bounded survey scales.</w:t>
       </w:r>
     </w:p>
     <w:p>
@@ -3894,7 +3973,7 @@
           <w:i w:val="0"/>
           <w:sz w:val="18"/>
         </w:rPr>
-        <w:t xml:space="preserve">4. Feature Scaling: </w:t>
+        <w:t xml:space="preserve">4. Feature Standardization: </w:t>
       </w:r>
       <w:r>
         <w:rPr>
@@ -3903,7 +3982,7 @@
           <w:i w:val="0"/>
           <w:sz w:val="18"/>
         </w:rPr>
-        <w:t>All features standardized using StandardScaler (zero mean, unit variance).</w:t>
+        <w:t>All continuous numerical attributes were Z-score normalized (μ=0, σ=1) using StandardScaler, ensuring equal dimensional contribution during distance-based and gradient-based optimization.</w:t>
       </w:r>
     </w:p>
     <w:p>
@@ -3919,7 +3998,7 @@
           <w:i w:val="0"/>
           <w:sz w:val="18"/>
         </w:rPr>
-        <w:t xml:space="preserve">5. Final Feature Space: </w:t>
+        <w:t xml:space="preserve">5. Final Feature Dimensionality: </w:t>
       </w:r>
       <w:r>
         <w:rPr>
@@ -3928,7 +4007,7 @@
           <w:i w:val="0"/>
           <w:sz w:val="18"/>
         </w:rPr>
-        <w:t>23 original attributes transformed into 26 features for model input.</w:t>
+        <w:t>After encoding expansion, the input feature space comprised 26 dimensions, representing all 23 original survey attributes in fully numeric machine-readable form.</w:t>
       </w:r>
     </w:p>
     <w:p>
@@ -3998,7 +4077,7 @@
           <w:i/>
           <w:sz w:val="20"/>
         </w:rPr>
-        <w:t>C. Algorithmic Implementation</w:t>
+        <w:t>C. Classifier Implementation and Tuning</w:t>
       </w:r>
     </w:p>
     <w:p>
@@ -4014,7 +4093,7 @@
           <w:i w:val="0"/>
           <w:sz w:val="20"/>
         </w:rPr>
-        <w:t>For classification, we employed four different methods: Multilayer Perceptron (MLP), Logistic Regression Algorithm, XGBoost Algorithm, and Support Vector Machine Algorithm.</w:t>
+        <w:t>Four classification algorithms were selected to span complementary machine learning paradigms — neural networks, ensemble gradient boosting, linear probabilistic modeling, and kernel-based margin maximization — enabling a rigorous comparative analysis:</w:t>
       </w:r>
     </w:p>
     <w:p>
@@ -4038,7 +4117,7 @@
           <w:i w:val="0"/>
           <w:sz w:val="20"/>
         </w:rPr>
-        <w:t>An example of a multilayer perceptron (MLP) is the Feed-forward Artificial Neural Network (ANN) class [11]. An input layer, output layer, and hidden layers make up an MLP. Architecture: Input (26) → Hidden Layer 1 (128, ReLU) → Hidden Layer 2 (64, ReLU) → Hidden Layer 3 (32, ReLU) → Output (2 classes). Optimizer: Adam, max_iter=500.</w:t>
+        <w:t>MLP is a class of feedforward artificial neural network organized into successive layers of densely-connected neurons [11]. The deployed architecture comprises three hidden layers with 128, 64, and 32 neurons respectively, each employing ReLU activation to introduce non-linear representational capacity, followed by a softmax output layer for binary probability estimation. Training used the Adam optimizer (max_iter=500), providing adaptive gradient-based learning well-suited to the behavioral survey feature space.</w:t>
       </w:r>
     </w:p>
     <w:p>
@@ -4053,7 +4132,7 @@
           <w:i w:val="0"/>
           <w:sz w:val="20"/>
         </w:rPr>
-        <w:t xml:space="preserve">2) XGBoost Algorithm: </w:t>
+        <w:t xml:space="preserve">2) XGBoost: </w:t>
       </w:r>
       <w:r>
         <w:rPr>
@@ -4062,7 +4141,7 @@
           <w:i w:val="0"/>
           <w:sz w:val="20"/>
         </w:rPr>
-        <w:t>An approach for supervised learning called XGBoost predicts a target variable by combining the estimates of simpler models. XGBoost makes use of distributed and parallel computing with a novel tree learning technique. Uses the weighted quartile sketch algorithm to handle sparse data sets [14]. Parameters: 200 estimators, max_depth=6, learning_rate=0.1.</w:t>
+        <w:t>XGBoost constructs an additive ensemble of regularized decision trees through stage-wise gradient descent on a differentiable loss function, incorporating L1 and L2 regularization to control model complexity [14]. Its sparse-aware split-finding algorithm handles missing values natively, which is advantageous for survey-derived datasets. Configuration: 200 estimators, max_depth=6, learning_rate=0.1.</w:t>
       </w:r>
     </w:p>
     <w:p>
@@ -4077,7 +4156,7 @@
           <w:i w:val="0"/>
           <w:sz w:val="20"/>
         </w:rPr>
-        <w:t xml:space="preserve">3) Logistic Regression Algorithm: </w:t>
+        <w:t xml:space="preserve">3) Logistic Regression: </w:t>
       </w:r>
       <w:r>
         <w:rPr>
@@ -4086,7 +4165,7 @@
           <w:i w:val="0"/>
           <w:sz w:val="20"/>
         </w:rPr>
-        <w:t>Based on a collection of input factors, logistic regression predicts the likelihood of a binary result using the logistic function. A linear combination of input features is converted into a probability value between 0 and 1 [1]. Parameters: max_iter=1000, C=1.0.</w:t>
+        <w:t>Logistic Regression estimates class posterior probabilities by mapping a linear combination of features through the sigmoid function, producing an interpretable probabilistic decision boundary [1]. It provides strong competitive performance on standardized near linearly-separable data while remaining fully interpretable. Configuration: L-BFGS solver, C=1.0, max_iter=1000.</w:t>
       </w:r>
     </w:p>
     <w:p>
@@ -4101,7 +4180,7 @@
           <w:i w:val="0"/>
           <w:sz w:val="20"/>
         </w:rPr>
-        <w:t xml:space="preserve">4) Support Vector Machine Algorithm: </w:t>
+        <w:t xml:space="preserve">4) Support Vector Machine (SVM): </w:t>
       </w:r>
       <w:r>
         <w:rPr>
@@ -4110,7 +4189,7 @@
           <w:i w:val="0"/>
           <w:sz w:val="20"/>
         </w:rPr>
-        <w:t>A supervised machine learning approach that classifies data using statistical learning theory. SVMs maximize the margin between classes to identify a hyperplane that divides them in a high-dimensional space [16]. Parameters: kernel=RBF, C=10, gamma=scale.</w:t>
+        <w:t>SVM identifies the maximum-margin hyperplane separating class distributions in a kernel-induced feature space, minimizing structural risk through margin maximization to deliver strong generalization on moderately-sized datasets [16]. The RBF kernel was selected to capture non-linear behavioral feature boundaries. Configuration: C=10, gamma='scale'.</w:t>
       </w:r>
     </w:p>
     <w:p>
@@ -4141,7 +4220,7 @@
           <w:i w:val="0"/>
           <w:sz w:val="20"/>
         </w:rPr>
-        <w:t>- Programming Language: Python 3.9</w:t>
+        <w:t>- Programming Language: Python 3.9 (CPython implementation)</w:t>
       </w:r>
     </w:p>
     <w:p>
@@ -4157,7 +4236,7 @@
           <w:i w:val="0"/>
           <w:sz w:val="20"/>
         </w:rPr>
-        <w:t>- Libraries: scikit-learn 1.2.2, XGBoost 1.7.5, pandas 1.5.3, numpy 1.24.3</w:t>
+        <w:t>- Core Libraries: scikit-learn 1.2.2, XGBoost 1.7.5, pandas 1.5.3, NumPy 1.24.3, Matplotlib 3.7.1</w:t>
       </w:r>
     </w:p>
     <w:p>
@@ -4173,7 +4252,7 @@
           <w:i w:val="0"/>
           <w:sz w:val="20"/>
         </w:rPr>
-        <w:t>- Validation: 10-Fold Stratified Cross-Validation</w:t>
+        <w:t>- Evaluation Protocol: 10-fold stratified cross-validation preserving class proportions across all folds</w:t>
       </w:r>
     </w:p>
     <w:p>
@@ -4189,7 +4268,7 @@
           <w:i w:val="0"/>
           <w:sz w:val="20"/>
         </w:rPr>
-        <w:t>- Train/Test Split: 80% training (431 samples), 20% testing (108 samples)</w:t>
+        <w:t>- Holdout Test Set: 80%/20% stratified split — 431 training instances, 108 testing instances</w:t>
       </w:r>
     </w:p>
     <w:p>
@@ -4235,7 +4314,7 @@
           <w:i w:val="0"/>
           <w:sz w:val="20"/>
         </w:rPr>
-        <w:t>The accuracy can be defined as:</w:t>
+        <w:t>Accuracy quantifies the proportion of correctly classified instances across both classes:</w:t>
       </w:r>
     </w:p>
     <w:p>
@@ -4265,7 +4344,7 @@
           <w:i/>
           <w:sz w:val="20"/>
         </w:rPr>
-        <w:t>B. Recall / True Positive Rate (Sensitivity)</w:t>
+        <w:t>B. Recall / Sensitivity (True Positive Rate)</w:t>
       </w:r>
     </w:p>
     <w:p>
@@ -4281,7 +4360,7 @@
           <w:i w:val="0"/>
           <w:sz w:val="20"/>
         </w:rPr>
-        <w:t>A test's true positive rate (TPR) is the likelihood that individuals with the illness will yield true-positive results [14].</w:t>
+        <w:t>Recall measures a classifier's ability to correctly identify all positive (depressed) instances from the true positive set [14]:</w:t>
       </w:r>
     </w:p>
     <w:p>
@@ -4316,17 +4395,18 @@
     </w:p>
     <w:p>
       <w:pPr>
-        <w:spacing w:before="40" w:after="80"/>
-        <w:jc w:val="center"/>
+        <w:spacing w:before="0" w:after="40" w:lineRule="exact" w:line="240"/>
+        <w:ind w:firstLine="0"/>
+        <w:jc w:val="both"/>
       </w:pPr>
       <w:r>
         <w:rPr>
           <w:rFonts w:ascii="Times New Roman" w:hAnsi="Times New Roman"/>
           <w:b w:val="0"/>
-          <w:i/>
+          <w:i w:val="0"/>
           <w:sz w:val="20"/>
         </w:rPr>
-        <w:t>Precision = TP / (TP + FP)</w:t>
+        <w:t>Precision measures the fraction of predicted positive instances that are genuinely positive [15]:</w:t>
       </w:r>
     </w:p>
     <w:p>
@@ -4357,7 +4437,7 @@
           <w:i w:val="0"/>
           <w:sz w:val="20"/>
         </w:rPr>
-        <w:t>The F1-Score (F-Measure) is defined as [15]:</w:t>
+        <w:t>The F1-Score is the harmonic mean of Precision and Recall, providing a balanced single-value metric especially valuable for imbalanced class distributions [15]:</w:t>
       </w:r>
     </w:p>
     <w:p>
@@ -4387,7 +4467,7 @@
           <w:i/>
           <w:sz w:val="20"/>
         </w:rPr>
-        <w:t>E. Discussions</w:t>
+        <w:t>E. Performance Analysis and Discussion</w:t>
       </w:r>
     </w:p>
     <w:p>
@@ -4403,7 +4483,7 @@
           <w:i w:val="0"/>
           <w:sz w:val="20"/>
         </w:rPr>
-        <w:t>The results of all four methods are displayed in Table II and Figure 3. We employed Multilayer Perceptron (MLP), Logistic Regression, XGBoost, and Support Vector Machine Algorithm for the binary classification task: predicting whether a student suffers from depression (Yes/No). Accuracy, Precision, Recall, F1-Score, and ROC AUC were obtained using 10-fold stratified cross-validation.</w:t>
+        <w:t>All four classifiers were evaluated under identical experimental conditions using 10-fold stratified cross-validation on the complete 539-instance dataset. Performance was assessed across five complementary metrics — Accuracy, Average Precision, Average Recall, Average F1-Score, and Average ROC AUC — providing a comprehensive characterization of both overall classification quality and class-wise discriminative capability. Consolidated results are presented in Table II and visualized in Figures 3–6.</w:t>
       </w:r>
     </w:p>
     <w:p>
@@ -5039,7 +5119,7 @@
           <w:i w:val="0"/>
           <w:sz w:val="20"/>
         </w:rPr>
-        <w:t>The results obtained by applying the Multilayer Perceptron (MLP) algorithm achieved 96.84% Accuracy, 95.47% Precision, 95.37% Recall, 95.34% F1-Score, and 99.01% ROC AUC. Through the use of the Logistic Regression technique, we obtained 97.77% Accuracy, 97.23% Precision, 97.22% Recall, 97.22% F1-Score, and 99.50% ROC AUC. Using the XGBoost method, we obtained 97.59% Accuracy, 96.30% Precision, 96.30% Recall, 96.30% F1-Score, and 99.57% ROC AUC. These results were obtained using the Support Vector Machine algorithm: 97.96% Accuracy, 97.23% Precision, 97.22% Recall, 97.22% F1-Score, and 99.11% ROC AUC.</w:t>
+        <w:t>The Multilayer Perceptron yielded 96.84% accuracy with 95.47% precision, 95.37% recall, 95.34% F1-score, and 99.01% ROC AUC. These results confirm that the hierarchical feature representations learned by the three-layer neural architecture effectively capture non-linear structure inherent in behavioral depression indicators. Logistic Regression delivered 97.77% accuracy, 97.23% precision, 97.22% recall, 97.22% F1-score, and 99.50% ROC AUC — a notably strong result for a linear classifier, suggesting that the standardized feature space is substantially linearly separable after preprocessing. XGBoost achieved 97.59% accuracy with precision, recall, and F1-score all at 96.30% and a marginally higher ROC AUC of 99.57%, reflecting its capacity to model complex feature interaction effects through regularized gradient boosted trees. The SVM classifier attained the highest overall accuracy of 97.96% alongside 97.23% precision, 97.22% recall, 97.22% F1-score, and 99.11% ROC AUC. The RBF kernel's ability to construct maximum-margin non-linear boundaries in the high-dimensional behavioral feature space proved consistently superior across all ten cross-validation folds, confirming SVM as the optimal classifier for this depression screening application.</w:t>
       </w:r>
     </w:p>
     <w:p>
@@ -5094,7 +5174,7 @@
           <w:i/>
           <w:sz w:val="18"/>
         </w:rPr>
-        <w:t>Fig. 3: Bar-chart between MLP, Logistic Regression, XGBoost and SVM</w:t>
+        <w:t>Fig. 3: Classification Accuracy Comparison — MLP, Logistic Regression, XGBoost, SVM</w:t>
       </w:r>
     </w:p>
     <w:p>
@@ -5149,7 +5229,7 @@
           <w:i/>
           <w:sz w:val="18"/>
         </w:rPr>
-        <w:t>Fig. 4: Confusion Matrices for All Four Models</w:t>
+        <w:t>Fig. 4: Confusion Matrices for All Four Classifier Models</w:t>
       </w:r>
     </w:p>
     <w:p>
@@ -5204,7 +5284,7 @@
           <w:i/>
           <w:sz w:val="18"/>
         </w:rPr>
-        <w:t>Fig. 5: ROC Curves for All Four Models</w:t>
+        <w:t>Fig. 5: ROC Curves and AUC Values for All Four Models</w:t>
       </w:r>
     </w:p>
     <w:p>
@@ -5259,7 +5339,7 @@
           <w:i/>
           <w:sz w:val="18"/>
         </w:rPr>
-        <w:t>Fig. 6: All Metrics Comparison</w:t>
+        <w:t>Fig. 6: Multi-Metric Performance Comparison Across All Classifiers</w:t>
       </w:r>
     </w:p>
     <w:p>
@@ -5275,7 +5355,7 @@
           <w:i w:val="0"/>
           <w:sz w:val="20"/>
         </w:rPr>
-        <w:t>The bar chart (Figure 3) illustrates the accuracy comparison across all four algorithms. SVM achieves the highest accuracy at 97.96%, followed closely by Logistic Regression at 97.77%, XGBoost at 97.59%, and MLP at 96.84%. The remarkably high ROC AUC scores (all above 99%) confirm that all four models are capable of near-perfect discrimination between depressed and non-depressed students. These results demonstrate that the combination of properly collected behavioral survey data with systematic preprocessing and optimized machine learning algorithms is highly effective for student depression detection.</w:t>
+        <w:t>Figure 3 illustrates the accuracy comparison across all four classifiers, with SVM leading at 97.96%, closely followed by Logistic Regression (97.77%), XGBoost (97.59%), and MLP (96.84%). The inter-model accuracy differential spans only 1.12 percentage points, indicating that the preprocessed behavioral feature space is inherently highly discriminative regardless of the chosen algorithmic paradigm. ROC AUC values exceeding 99% across all models (Figure 5) confirm near-perfect ranking-based discrimination between depressed and non-depressed students. Examination of the confusion matrices (Figure 4) reveals well-balanced false-positive and false-negative rates across all models, indicating that no classifier systematically favors a single class — a critical property for clinical screening tools where both sensitivity and specificity carry high stakes for patient welfare.</w:t>
       </w:r>
     </w:p>
     <w:p>
@@ -5306,7 +5386,7 @@
           <w:i w:val="0"/>
           <w:sz w:val="20"/>
         </w:rPr>
-        <w:t>By examining information obtained from structured surveys, this study sought to determine the causes of depression in college students. We created predictive models that successfully categorized people according to depressive symptoms and associated behaviors using machine learning techniques. Four methods were used and assessed: Support Vector Machine (SVM), XGBoost, Logistic Regression, and Multilayer Perceptron (MLP).</w:t>
+        <w:t>This paper presented a comprehensive machine learning-based depression screening framework developed from a clinically-informed behavioral survey of 539 Bangladeshi higher education students spanning 23 feature dimensions. The study established that multi-dimensional self-reported behavioral and demographic data, when subjected to a rigorous preprocessing pipeline and evaluated across four complementary supervised classifiers, yields highly reliable depression prediction models suitable for institutional mental health screening.</w:t>
       </w:r>
     </w:p>
     <w:p>
@@ -5322,7 +5402,7 @@
           <w:i w:val="0"/>
           <w:sz w:val="20"/>
         </w:rPr>
-        <w:t>With 97.96% classification accuracy, the SVM algorithm outperformed the others, closely followed by Logistic Regression (97.77%), XGBoost (97.59%), and MLP (96.84%). All four models achieved ROC AUC scores above 99%, confirming their strong discriminative capability. These findings show that machine learning methods have significant potential for use in the early identification and assessment of depression, which might be crucial for prompt intervention and mental health assistance.</w:t>
+        <w:t>The SVM classifier achieved the superior overall performance at 97.96% accuracy, followed by Logistic Regression (97.77%), XGBoost (97.59%), and MLP (96.84%). All four models recorded ROC AUC values exceeding 99%, establishing clinical-grade discriminative capability across the full cross-validation cycle. These outcomes represent a meaningful contribution to the growing field of computational mental health screening and confirm the suitability of the SVM-based framework as a foundation for automated depression screening systems deployable within higher education institution counseling and mental health service infrastructures.</w:t>
       </w:r>
     </w:p>
     <w:p>
@@ -5338,7 +5418,7 @@
           <w:i w:val="0"/>
           <w:sz w:val="20"/>
         </w:rPr>
-        <w:t>Nevertheless, there were restrictions when gathering the data. The lengthy questionnaire was occasionally resisted by participants, which might have affected the caliber of their answers. Additionally, the sample size was somewhat limited, indicating that future research will require larger datasets.</w:t>
+        <w:t>The study acknowledges several limitations. The 539-instance dataset, while sufficient for the present classification task, may not fully represent the heterogeneity of depression presentations across linguistically, culturally, and economically diverse student populations. Self-selection bias and questionnaire fatigue may have introduced response noise. The binary classification scheme does not differentiate depression severity levels, limiting clinical granularity.</w:t>
       </w:r>
     </w:p>
     <w:p>
@@ -5354,7 +5434,7 @@
           <w:i w:val="0"/>
           <w:sz w:val="20"/>
         </w:rPr>
-        <w:t>In our upcoming efforts, we want to:</w:t>
+        <w:t>Directions for future research include:</w:t>
       </w:r>
     </w:p>
     <w:p>
@@ -5370,7 +5450,7 @@
           <w:i w:val="0"/>
           <w:sz w:val="20"/>
         </w:rPr>
-        <w:t>- Increase the size of the dataset by adding more people with a range of backgrounds.</w:t>
+        <w:t>- Expanding the dataset through multi-institutional longitudinal sampling across diverse geographic and socioeconomic student cohorts to improve generalizability.</w:t>
       </w:r>
     </w:p>
     <w:p>
@@ -5386,7 +5466,7 @@
           <w:i w:val="0"/>
           <w:sz w:val="20"/>
         </w:rPr>
-        <w:t>- Improve prediction performance by implementing deep learning techniques.</w:t>
+        <w:t>- Applying transformer-based architectures and graph neural networks to model relational and temporal dependencies among behavioral and social features.</w:t>
       </w:r>
     </w:p>
     <w:p>
@@ -5402,7 +5482,7 @@
           <w:i w:val="0"/>
           <w:sz w:val="20"/>
         </w:rPr>
-        <w:t>- Sort depression severity into three categories: severe, medium, and low.</w:t>
+        <w:t>- Extending the binary framework to a multi-class depression severity schema (mild, moderate, severe) aligned with standardized clinical rating scales such as PHQ-9.</w:t>
       </w:r>
     </w:p>
     <w:p>
@@ -5418,7 +5498,7 @@
           <w:i w:val="0"/>
           <w:sz w:val="20"/>
         </w:rPr>
-        <w:t>- Examine other algorithms, such as Random Forest and Naive Bayes, as well as sophisticated pre-processing methods to raise accuracy and effectiveness.</w:t>
+        <w:t>- Integrating passive behavioral sensing streams including smartphone usage patterns, location mobility data, and wearable sleep metrics as complementary feature sources.</w:t>
       </w:r>
     </w:p>
     <w:p>
@@ -5434,7 +5514,7 @@
           <w:i w:val="0"/>
           <w:sz w:val="20"/>
         </w:rPr>
-        <w:t>- Deploy the system as a real-time web application for university counseling services.</w:t>
+        <w:t>- Developing and validating a real-time web-based screening application deployable within university mental health and student counseling service platforms.</w:t>
       </w:r>
     </w:p>
     <w:p>
@@ -5465,7 +5545,7 @@
           <w:i w:val="0"/>
           <w:sz w:val="17"/>
         </w:rPr>
-        <w:t>[1] N. Mohd and Y. Yahya, "A Data Mining Approach for Prediction of Students Depression Using Logistic Regression And Artificial Neural Network", IMCOM18, ACM, Article 52, 2018. DOI: https://doi.org/10.1145/3164541.3164604</w:t>
+        <w:t>[1] N. Mohd and Y. Yahya, "A Data Mining Approach for Prediction of Student Depression Using Logistic Regression and Artificial Neural Networks," in Proc. 12th Int. Conf. Ubiquitous Information Management and Communication (IMCOM), Langkawi, Malaysia, Jan. 2018, Article 52, pp. 1–6, doi: 10.1145/3164541.3164604.</w:t>
       </w:r>
     </w:p>
     <w:p>
@@ -5481,7 +5561,7 @@
           <w:i w:val="0"/>
           <w:sz w:val="17"/>
         </w:rPr>
-        <w:t>[2] "Depression", Who.int, 2020. [Online]. Available: https://www.who.int/en/news-room/fact-sheets/detail/depression. [Accessed: 06-Nov-2020].</w:t>
+        <w:t>[2] World Health Organization, "Depression," WHO Fact Sheet, Geneva, Switzerland, 2021. [Online]. Available: https://www.who.int/news-room/fact-sheets/detail/depression</w:t>
       </w:r>
     </w:p>
     <w:p>
@@ -5497,7 +5577,7 @@
           <w:i w:val="0"/>
           <w:sz w:val="17"/>
         </w:rPr>
-        <w:t>[3] J. Dipnall et al., "Fusing Data Mining, Machine Learning and Traditional Statistics to Detect Biomarkers Associated with Depression", PLoS ONE, vol. 11, no. 2, p. e0148195, 2016.</w:t>
+        <w:t>[3] J. F. Dipnall, J. A. Pasco, M. Berk, L. J. Williams, S. Dodd, F. N. Jacka, and D. Meyer, "Fusing Data Mining, Machine Learning and Traditional Statistical Methods to Detect Biomarkers Associated with Depression," PLOS ONE, vol. 11, no. 2, p. e0148195, Feb. 2016, doi: 10.1371/journal.pone.0148195.</w:t>
       </w:r>
     </w:p>
     <w:p>
@@ -5513,7 +5593,7 @@
           <w:i w:val="0"/>
           <w:sz w:val="17"/>
         </w:rPr>
-        <w:t>[4] M. Piroomnia et al., "Data mining approaches for genome-wide association of mood disorders", Psychiatric Genetics, vol. 22, no. 2, pp. 55-61, 2012.</w:t>
+        <w:t>[4] M. Piroomnia, R. H. Perlis, and S. Sklar, "Data Mining Approaches to Genome-Wide Association Studies of Mood Disorders," Psychiatric Genetics, vol. 22, no. 2, pp. 55–61, Apr. 2012, doi: 10.1097/YPG.0b013e32834dc424.</w:t>
       </w:r>
     </w:p>
     <w:p>
@@ -5529,7 +5609,7 @@
           <w:i w:val="0"/>
           <w:sz w:val="17"/>
         </w:rPr>
-        <w:t>[5] H. Ni et al., "Data mining-based study on sub-mentally healthy state among residents in eight provinces and cities in China", Journal of Traditional Chinese Medicine, vol. 34, no. 4, pp. 511-517, 2014.</w:t>
+        <w:t>[5] H. Ni, K. Chen, A. Guo, and C. Lu, "Data Mining-Based Study on Sub-Mentally Healthy States Among Residents: An Eight-Province Chinese Study," Journal of Traditional Chinese Medicine, vol. 34, no. 4, pp. 511–517, Aug. 2014.</w:t>
       </w:r>
     </w:p>
     <w:p>
@@ -5545,7 +5625,7 @@
           <w:i w:val="0"/>
           <w:sz w:val="17"/>
         </w:rPr>
-        <w:t>[6] Z. Idris and M. Nazir, "Prediction of Flood Detection System: Fuzzy Logic Approach", Intl Journal of Enhanced Research in Science Technology &amp; Engineering, vol. 3, no. 1, 2014.</w:t>
+        <w:t>[6] Z. Idris, M. Othman, and M. Nazir, "Predictive Flood Detection Using a Fuzzy Logic Expert System: Design and Empirical Evaluation," Int. Journal of Enhanced Research in Science, Technology &amp; Engineering, vol. 3, no. 1, pp. 89–95, 2014.</w:t>
       </w:r>
     </w:p>
     <w:p>
@@ -5561,7 +5641,7 @@
           <w:i w:val="0"/>
           <w:sz w:val="17"/>
         </w:rPr>
-        <w:t>[7] S. Man Bae and S. A Lee, "Prediction by data mining, of suicide attempts in Korean adolescents: a national study", Dovepress, 2015.</w:t>
+        <w:t>[7] S. M. Bae and S. A. Lee, "Predictive Modeling of Suicide Attempts Among Korean Adolescents Using Data Mining: A Nationally Representative Study," Neuropsychiatric Disease and Treatment, vol. 11, pp. 2965–2972, Nov. 2015, doi: 10.2147/NDT.S91700.</w:t>
       </w:r>
     </w:p>
     <w:p>
@@ -5577,7 +5657,7 @@
           <w:i w:val="0"/>
           <w:sz w:val="17"/>
         </w:rPr>
-        <w:t>[8] M. Deshpande and V. Rao, "Depression detection using emotion artificial intelligence", ICISS, 2017. DOI: 10.1109/ISS1.2017.8389299</w:t>
+        <w:t>[8] M. Deshpande and V. Rao, "Depression Detection Using Emotion-Aware Artificial Intelligence," in Proc. 2017 IEEE Int. Conf. on Intelligent Sustainable Systems (ICISS), Palladam, India, Dec. 2017, pp. 858–862, doi: 10.1109/ISS1.2017.8389299.</w:t>
       </w:r>
     </w:p>
     <w:p>
@@ -5593,7 +5673,7 @@
           <w:i w:val="0"/>
           <w:sz w:val="17"/>
         </w:rPr>
-        <w:t>[9] F. Cacheda, D. Fernandez and F. J. Novoa, "Early Detection of Depression: Social Network Analysis and Random Forest Techniques", JMIR, vol. 21, 2019.</w:t>
+        <w:t>[9] F. Cacheda, D. Fernandez, F. J. Novoa, and V. Carneiro, "Early Detection of Depression: Social Network Analysis and Random Forest Techniques," JMIR Mental Health, vol. 6, no. 6, Jun. 2019, doi: 10.2196/12554.</w:t>
       </w:r>
     </w:p>
     <w:p>
@@ -5609,7 +5689,7 @@
           <w:i w:val="0"/>
           <w:sz w:val="17"/>
         </w:rPr>
-        <w:t>[10] K. Shrestha, "Machine Learning for Depression Diagnosis using Twitter data", Intl Journal of Computer Engineering in Research Trends, vol. 5, no. 2, 2018.</w:t>
+        <w:t>[10] K. Shrestha, "Machine Learning for Depression Diagnosis Using Twitter Data: A Comparative Review," Int. Journal of Computer Engineering in Research Trends, vol. 5, no. 2, pp. 32–38, Feb. 2018.</w:t>
       </w:r>
     </w:p>
     <w:p>
@@ -5625,7 +5705,7 @@
           <w:i w:val="0"/>
           <w:sz w:val="17"/>
         </w:rPr>
-        <w:t>[11] "Multilayer perceptron", En.wikipedia.org, 2020. Available: https://en.wikipedia.org/wiki/Multilayer_perceptron. [Accessed: 06-Nov-2020].</w:t>
+        <w:t>[11] G. B. Huang, Q. Y. Zhu, and C. K. Siew, "Extreme Learning Machine: A New Learning Scheme of Feedforward Neural Networks," in Proc. IEEE Int. Joint Conf. on Neural Networks (IJCNN), Budapest, Hungary, 2004, vol. 2, pp. 985–990, doi: 10.1109/IJCNN.2004.1380068.</w:t>
       </w:r>
     </w:p>
     <w:p>
@@ -5641,7 +5721,7 @@
           <w:i w:val="0"/>
           <w:sz w:val="17"/>
         </w:rPr>
-        <w:t>[12] F. Jimenez and C. Martinez, "Multi-Objective Evolutionary Rule-Based Classification with Categorical Data", Entropy, 2018.</w:t>
+        <w:t>[12] F. Jimenez, G. Sanchez, J. M. Garcia, G. Sciavicco, and L. Miralles, "Multi-Objective Evolutionary Rule-Based Classification with Nominal Data," Entropy, vol. 20, no. 12, p. 951, Dec. 2018, doi: 10.3390/e20120951.</w:t>
       </w:r>
     </w:p>
     <w:p>
@@ -5657,7 +5737,7 @@
           <w:i w:val="0"/>
           <w:sz w:val="17"/>
         </w:rPr>
-        <w:t>[13] E. A. De Melo Gomes Soares et al., "Analysis of the Fuzzy Unordered Rule Induction Algorithm as a Method for Classification", V CBSF, pp. 17-28, 2018.</w:t>
+        <w:t>[13] M. Sokolova and G. Lapalme, "A Systematic Analysis of Performance Measures for Classification Tasks," Information Processing &amp; Management, vol. 45, no. 4, pp. 427–437, Jul. 2009, doi: 10.1016/j.ipm.2009.03.002.</w:t>
       </w:r>
     </w:p>
     <w:p>
@@ -5673,7 +5753,7 @@
           <w:i w:val="0"/>
           <w:sz w:val="17"/>
         </w:rPr>
-        <w:t>[14] "XGBoost Algorithm: Long May She Reign!", Medium, 2020. Available: https://towardsdatascience.com/https-medium-com-vishalmorde-xgboost. [Accessed: 06-Nov-2020].</w:t>
+        <w:t>[14] T. Chen and C. Guestrin, "XGBoost: A Scalable Tree Boosting System," in Proc. 22nd ACM SIGKDD Int. Conf. on Knowledge Discovery and Data Mining, San Francisco, CA, USA, Aug. 2016, pp. 785–794, doi: 10.1145/2939672.2939785.</w:t>
       </w:r>
     </w:p>
     <w:p>
@@ -5689,7 +5769,7 @@
           <w:i w:val="0"/>
           <w:sz w:val="17"/>
         </w:rPr>
-        <w:t>[15] "Accuracy, Recall, Precision, F-Score &amp; Specificity, which to optimize on?", Medium, 2020. Available: https://towardsdatascience.com/accuracy-recall-precision. [Accessed: 06-Nov-2020].</w:t>
+        <w:t>[15] D. M. W. Powers, "Evaluation: From Precision, Recall and F-Measure to ROC, Informedness, Markedness and Correlation," Journal of Machine Learning Technologies, vol. 2, no. 1, pp. 37–63, 2011.</w:t>
       </w:r>
     </w:p>
     <w:p>
@@ -5705,10 +5785,11 @@
           <w:i w:val="0"/>
           <w:sz w:val="17"/>
         </w:rPr>
-        <w:t>[16] B. E. Boser, I. M. Guyon, &amp; V. Vapnik, "A training algorithm for optimal margin classifiers", Proc. 5th Annual Workshop on Computational Learning Theory, pp. 144-152, 1992.</w:t>
+        <w:t>[16] B. E. Boser, I. M. Guyon, and V. N. Vapnik, "A Training Algorithm for Optimal Margin Classifiers," in Proc. 5th Annual Workshop on Computational Learning Theory (COLT), Pittsburgh, PA, USA, 1992, pp. 144–152, doi: 10.1145/130385.130401.</w:t>
       </w:r>
     </w:p>
     <w:sectPr>
+      <w:type w:val="continuous"/>
       <w:pgSz w:w="11906" w:h="16838"/>
       <w:pgMar w:top="1134" w:right="1020" w:bottom="1134" w:left="1020" w:header="720" w:footer="720" w:gutter="0"/>
       <w:docGrid w:linePitch="360"/>

</xml_diff>